<commit_message>
docs: report - text after every figure/table, all Latin in italics
Co-Authored-By: Claude Sonnet 5.5 <noreply@anthropic.com>
</commit_message>
<xml_diff>
--- a/docs/Отчет_ПЗ1.docx
+++ b/docs/Отчет_ПЗ1.docx
@@ -459,16 +459,13 @@
         <w:t>middleware</w:t>
       </w:r>
       <w:r>
-        <w:t xml:space="preserve"> имитации авторизации по параметру ?</w:t>
-      </w:r>
-      <w:r>
-        <w:rPr>
-          <w:i/>
-        </w:rPr>
-        <w:t>auth</w:t>
-      </w:r>
-      <w:r>
-        <w:t>=1</w:t>
+        <w:t xml:space="preserve"> имитации авторизации по параметру </w:t>
+      </w:r>
+      <w:r>
+        <w:rPr>
+          <w:i/>
+        </w:rPr>
+        <w:t>?auth=1</w:t>
       </w:r>
     </w:p>
     <w:p>
@@ -650,6 +647,7 @@
       <w:r>
         <w:rPr>
           <w:rFonts w:ascii="Courier New" w:hAnsi="Courier New" w:cs="Courier New"/>
+          <w:i/>
           <w:sz w:val="22"/>
         </w:rPr>
         <w:t>const path = require('path');</w:t>
@@ -665,6 +663,7 @@
       <w:r>
         <w:rPr>
           <w:rFonts w:ascii="Courier New" w:hAnsi="Courier New" w:cs="Courier New"/>
+          <w:i/>
           <w:sz w:val="22"/>
         </w:rPr>
         <w:t>const express = require('express');</w:t>
@@ -680,6 +679,7 @@
       <w:r>
         <w:rPr>
           <w:rFonts w:ascii="Courier New" w:hAnsi="Courier New" w:cs="Courier New"/>
+          <w:i/>
           <w:sz w:val="22"/>
         </w:rPr>
         <w:t>const logger = require('./middlewares/logger');</w:t>
@@ -695,6 +695,7 @@
       <w:r>
         <w:rPr>
           <w:rFonts w:ascii="Courier New" w:hAnsi="Courier New" w:cs="Courier New"/>
+          <w:i/>
           <w:sz w:val="22"/>
         </w:rPr>
         <w:t>const { attachUser } = require('./middlewares/auth');</w:t>
@@ -710,6 +711,7 @@
       <w:r>
         <w:rPr>
           <w:rFonts w:ascii="Courier New" w:hAnsi="Courier New" w:cs="Courier New"/>
+          <w:i/>
           <w:sz w:val="22"/>
         </w:rPr>
         <w:t>const { notFoundHandler, serverErrorHandler } = require('./middlewares/errorHandlers');</w:t>
@@ -725,6 +727,7 @@
       <w:r>
         <w:rPr>
           <w:rFonts w:ascii="Courier New" w:hAnsi="Courier New" w:cs="Courier New"/>
+          <w:i/>
           <w:sz w:val="22"/>
         </w:rPr>
         <w:t>const pageRoutes = require('./routes/pageRoutes');</w:t>
@@ -740,6 +743,7 @@
       <w:r>
         <w:rPr>
           <w:rFonts w:ascii="Courier New" w:hAnsi="Courier New" w:cs="Courier New"/>
+          <w:i/>
           <w:sz w:val="22"/>
         </w:rPr>
         <w:t>const diagramRoutes = require('./routes/diagramRoutes');</w:t>
@@ -755,6 +759,7 @@
       <w:r>
         <w:rPr>
           <w:rFonts w:ascii="Courier New" w:hAnsi="Courier New" w:cs="Courier New"/>
+          <w:i/>
           <w:sz w:val="22"/>
         </w:rPr>
         <w:t xml:space="preserve"> </w:t>
@@ -770,6 +775,7 @@
       <w:r>
         <w:rPr>
           <w:rFonts w:ascii="Courier New" w:hAnsi="Courier New" w:cs="Courier New"/>
+          <w:i/>
           <w:sz w:val="22"/>
         </w:rPr>
         <w:t>const app = express();</w:t>
@@ -785,6 +791,7 @@
       <w:r>
         <w:rPr>
           <w:rFonts w:ascii="Courier New" w:hAnsi="Courier New" w:cs="Courier New"/>
+          <w:i/>
           <w:sz w:val="22"/>
         </w:rPr>
         <w:t xml:space="preserve"> </w:t>
@@ -800,9 +807,26 @@
       <w:r>
         <w:rPr>
           <w:rFonts w:ascii="Courier New" w:hAnsi="Courier New" w:cs="Courier New"/>
+          <w:i/>
           <w:sz w:val="22"/>
         </w:rPr>
-        <w:t>// Шаблонизатор EJS.</w:t>
+        <w:t xml:space="preserve">// </w:t>
+      </w:r>
+      <w:r>
+        <w:rPr>
+          <w:rFonts w:ascii="Courier New" w:hAnsi="Courier New" w:cs="Courier New"/>
+          <w:i w:val="0"/>
+          <w:sz w:val="22"/>
+        </w:rPr>
+        <w:t>Шаблонизатор</w:t>
+      </w:r>
+      <w:r>
+        <w:rPr>
+          <w:rFonts w:ascii="Courier New" w:hAnsi="Courier New" w:cs="Courier New"/>
+          <w:i/>
+          <w:sz w:val="22"/>
+        </w:rPr>
+        <w:t xml:space="preserve"> EJS.</w:t>
       </w:r>
     </w:p>
     <w:p>
@@ -815,6 +839,7 @@
       <w:r>
         <w:rPr>
           <w:rFonts w:ascii="Courier New" w:hAnsi="Courier New" w:cs="Courier New"/>
+          <w:i/>
           <w:sz w:val="22"/>
         </w:rPr>
         <w:t>app.set('view engine', 'ejs');</w:t>
@@ -830,6 +855,7 @@
       <w:r>
         <w:rPr>
           <w:rFonts w:ascii="Courier New" w:hAnsi="Courier New" w:cs="Courier New"/>
+          <w:i/>
           <w:sz w:val="22"/>
         </w:rPr>
         <w:t>app.set('views', path.join(__dirname, 'views'));</w:t>
@@ -845,6 +871,7 @@
       <w:r>
         <w:rPr>
           <w:rFonts w:ascii="Courier New" w:hAnsi="Courier New" w:cs="Courier New"/>
+          <w:i/>
           <w:sz w:val="22"/>
         </w:rPr>
         <w:t xml:space="preserve"> </w:t>
@@ -860,9 +887,42 @@
       <w:r>
         <w:rPr>
           <w:rFonts w:ascii="Courier New" w:hAnsi="Courier New" w:cs="Courier New"/>
+          <w:i/>
           <w:sz w:val="22"/>
         </w:rPr>
-        <w:t>// Helper для шаблонов: форматирование даты.</w:t>
+        <w:t xml:space="preserve">// Helper </w:t>
+      </w:r>
+      <w:r>
+        <w:rPr>
+          <w:rFonts w:ascii="Courier New" w:hAnsi="Courier New" w:cs="Courier New"/>
+          <w:i w:val="0"/>
+          <w:sz w:val="22"/>
+        </w:rPr>
+        <w:t>для шаблонов</w:t>
+      </w:r>
+      <w:r>
+        <w:rPr>
+          <w:rFonts w:ascii="Courier New" w:hAnsi="Courier New" w:cs="Courier New"/>
+          <w:i/>
+          <w:sz w:val="22"/>
+        </w:rPr>
+        <w:t xml:space="preserve">: </w:t>
+      </w:r>
+      <w:r>
+        <w:rPr>
+          <w:rFonts w:ascii="Courier New" w:hAnsi="Courier New" w:cs="Courier New"/>
+          <w:i w:val="0"/>
+          <w:sz w:val="22"/>
+        </w:rPr>
+        <w:t>форматирование даты</w:t>
+      </w:r>
+      <w:r>
+        <w:rPr>
+          <w:rFonts w:ascii="Courier New" w:hAnsi="Courier New" w:cs="Courier New"/>
+          <w:i/>
+          <w:sz w:val="22"/>
+        </w:rPr>
+        <w:t>.</w:t>
       </w:r>
     </w:p>
     <w:p>
@@ -875,6 +935,7 @@
       <w:r>
         <w:rPr>
           <w:rFonts w:ascii="Courier New" w:hAnsi="Courier New" w:cs="Courier New"/>
+          <w:i/>
           <w:sz w:val="22"/>
         </w:rPr>
         <w:t>app.locals.formatDate = (iso) =&gt; new Date(iso).toLocaleString('ru-RU');</w:t>
@@ -890,6 +951,7 @@
       <w:r>
         <w:rPr>
           <w:rFonts w:ascii="Courier New" w:hAnsi="Courier New" w:cs="Courier New"/>
+          <w:i/>
           <w:sz w:val="22"/>
         </w:rPr>
         <w:t xml:space="preserve"> </w:t>
@@ -905,9 +967,42 @@
       <w:r>
         <w:rPr>
           <w:rFonts w:ascii="Courier New" w:hAnsi="Courier New" w:cs="Courier New"/>
+          <w:i/>
           <w:sz w:val="22"/>
         </w:rPr>
-        <w:t>// Статика подключается до маршрутов, чтобы файлы отдавались без лишних проверок.</w:t>
+        <w:t xml:space="preserve">// </w:t>
+      </w:r>
+      <w:r>
+        <w:rPr>
+          <w:rFonts w:ascii="Courier New" w:hAnsi="Courier New" w:cs="Courier New"/>
+          <w:i w:val="0"/>
+          <w:sz w:val="22"/>
+        </w:rPr>
+        <w:t>Статика подключается до маршрутов</w:t>
+      </w:r>
+      <w:r>
+        <w:rPr>
+          <w:rFonts w:ascii="Courier New" w:hAnsi="Courier New" w:cs="Courier New"/>
+          <w:i/>
+          <w:sz w:val="22"/>
+        </w:rPr>
+        <w:t xml:space="preserve">, </w:t>
+      </w:r>
+      <w:r>
+        <w:rPr>
+          <w:rFonts w:ascii="Courier New" w:hAnsi="Courier New" w:cs="Courier New"/>
+          <w:i w:val="0"/>
+          <w:sz w:val="22"/>
+        </w:rPr>
+        <w:t>чтобы файлы отдавались без лишних проверок</w:t>
+      </w:r>
+      <w:r>
+        <w:rPr>
+          <w:rFonts w:ascii="Courier New" w:hAnsi="Courier New" w:cs="Courier New"/>
+          <w:i/>
+          <w:sz w:val="22"/>
+        </w:rPr>
+        <w:t>.</w:t>
       </w:r>
     </w:p>
     <w:p>
@@ -920,6 +1015,7 @@
       <w:r>
         <w:rPr>
           <w:rFonts w:ascii="Courier New" w:hAnsi="Courier New" w:cs="Courier New"/>
+          <w:i/>
           <w:sz w:val="22"/>
         </w:rPr>
         <w:t>app.use('/static', express.static(path.join(__dirname, 'public')));</w:t>
@@ -935,6 +1031,7 @@
       <w:r>
         <w:rPr>
           <w:rFonts w:ascii="Courier New" w:hAnsi="Courier New" w:cs="Courier New"/>
+          <w:i/>
           <w:sz w:val="22"/>
         </w:rPr>
         <w:t xml:space="preserve"> </w:t>
@@ -950,6 +1047,7 @@
       <w:r>
         <w:rPr>
           <w:rFonts w:ascii="Courier New" w:hAnsi="Courier New" w:cs="Courier New"/>
+          <w:i/>
           <w:sz w:val="22"/>
         </w:rPr>
         <w:t>app.use(logger);</w:t>
@@ -965,6 +1063,7 @@
       <w:r>
         <w:rPr>
           <w:rFonts w:ascii="Courier New" w:hAnsi="Courier New" w:cs="Courier New"/>
+          <w:i/>
           <w:sz w:val="22"/>
         </w:rPr>
         <w:t xml:space="preserve"> </w:t>
@@ -980,6 +1079,7 @@
       <w:r>
         <w:rPr>
           <w:rFonts w:ascii="Courier New" w:hAnsi="Courier New" w:cs="Courier New"/>
+          <w:i/>
           <w:sz w:val="22"/>
         </w:rPr>
         <w:t>app.use(express.urlencoded({ extended: true }));</w:t>
@@ -995,6 +1095,7 @@
       <w:r>
         <w:rPr>
           <w:rFonts w:ascii="Courier New" w:hAnsi="Courier New" w:cs="Courier New"/>
+          <w:i/>
           <w:sz w:val="22"/>
         </w:rPr>
         <w:t>app.use(express.json());</w:t>
@@ -1010,6 +1111,7 @@
       <w:r>
         <w:rPr>
           <w:rFonts w:ascii="Courier New" w:hAnsi="Courier New" w:cs="Courier New"/>
+          <w:i/>
           <w:sz w:val="22"/>
         </w:rPr>
         <w:t>app.use(attachUser);</w:t>
@@ -1025,6 +1127,7 @@
       <w:r>
         <w:rPr>
           <w:rFonts w:ascii="Courier New" w:hAnsi="Courier New" w:cs="Courier New"/>
+          <w:i/>
           <w:sz w:val="22"/>
         </w:rPr>
         <w:t xml:space="preserve"> </w:t>
@@ -1040,6 +1143,7 @@
       <w:r>
         <w:rPr>
           <w:rFonts w:ascii="Courier New" w:hAnsi="Courier New" w:cs="Courier New"/>
+          <w:i/>
           <w:sz w:val="22"/>
         </w:rPr>
         <w:t>app.use('/', pageRoutes);</w:t>
@@ -1055,6 +1159,7 @@
       <w:r>
         <w:rPr>
           <w:rFonts w:ascii="Courier New" w:hAnsi="Courier New" w:cs="Courier New"/>
+          <w:i/>
           <w:sz w:val="22"/>
         </w:rPr>
         <w:t>app.use('/api/diagrams', diagramRoutes);</w:t>
@@ -1070,6 +1175,7 @@
       <w:r>
         <w:rPr>
           <w:rFonts w:ascii="Courier New" w:hAnsi="Courier New" w:cs="Courier New"/>
+          <w:i/>
           <w:sz w:val="22"/>
         </w:rPr>
         <w:t xml:space="preserve"> </w:t>
@@ -1085,9 +1191,26 @@
       <w:r>
         <w:rPr>
           <w:rFonts w:ascii="Courier New" w:hAnsi="Courier New" w:cs="Courier New"/>
+          <w:i/>
           <w:sz w:val="22"/>
         </w:rPr>
-        <w:t>// Обработчики ошибок идут последними.</w:t>
+        <w:t xml:space="preserve">// </w:t>
+      </w:r>
+      <w:r>
+        <w:rPr>
+          <w:rFonts w:ascii="Courier New" w:hAnsi="Courier New" w:cs="Courier New"/>
+          <w:i w:val="0"/>
+          <w:sz w:val="22"/>
+        </w:rPr>
+        <w:t>Обработчики ошибок идут последними</w:t>
+      </w:r>
+      <w:r>
+        <w:rPr>
+          <w:rFonts w:ascii="Courier New" w:hAnsi="Courier New" w:cs="Courier New"/>
+          <w:i/>
+          <w:sz w:val="22"/>
+        </w:rPr>
+        <w:t>.</w:t>
       </w:r>
     </w:p>
     <w:p>
@@ -1100,6 +1223,7 @@
       <w:r>
         <w:rPr>
           <w:rFonts w:ascii="Courier New" w:hAnsi="Courier New" w:cs="Courier New"/>
+          <w:i/>
           <w:sz w:val="22"/>
         </w:rPr>
         <w:t>app.use(notFoundHandler);</w:t>
@@ -1115,6 +1239,7 @@
       <w:r>
         <w:rPr>
           <w:rFonts w:ascii="Courier New" w:hAnsi="Courier New" w:cs="Courier New"/>
+          <w:i/>
           <w:sz w:val="22"/>
         </w:rPr>
         <w:t>app.use(serverErrorHandler);</w:t>
@@ -1130,6 +1255,7 @@
       <w:r>
         <w:rPr>
           <w:rFonts w:ascii="Courier New" w:hAnsi="Courier New" w:cs="Courier New"/>
+          <w:i/>
           <w:sz w:val="22"/>
         </w:rPr>
         <w:t xml:space="preserve"> </w:t>
@@ -1145,6 +1271,7 @@
       <w:r>
         <w:rPr>
           <w:rFonts w:ascii="Courier New" w:hAnsi="Courier New" w:cs="Courier New"/>
+          <w:i/>
           <w:sz w:val="22"/>
         </w:rPr>
         <w:t>module.exports = app;</w:t>
@@ -1317,6 +1444,7 @@
       <w:r>
         <w:rPr>
           <w:rFonts w:ascii="Courier New" w:hAnsi="Courier New" w:cs="Courier New"/>
+          <w:i/>
           <w:sz w:val="22"/>
         </w:rPr>
         <w:t>&lt;%- include('partials/header') %&gt;</w:t>
@@ -1332,9 +1460,26 @@
       <w:r>
         <w:rPr>
           <w:rFonts w:ascii="Courier New" w:hAnsi="Courier New" w:cs="Courier New"/>
+          <w:i/>
           <w:sz w:val="22"/>
         </w:rPr>
-        <w:t>&lt;h1&gt;Список диаграмм&lt;/h1&gt;</w:t>
+        <w:t>&lt;h1&gt;</w:t>
+      </w:r>
+      <w:r>
+        <w:rPr>
+          <w:rFonts w:ascii="Courier New" w:hAnsi="Courier New" w:cs="Courier New"/>
+          <w:i w:val="0"/>
+          <w:sz w:val="22"/>
+        </w:rPr>
+        <w:t>Список диаграмм</w:t>
+      </w:r>
+      <w:r>
+        <w:rPr>
+          <w:rFonts w:ascii="Courier New" w:hAnsi="Courier New" w:cs="Courier New"/>
+          <w:i/>
+          <w:sz w:val="22"/>
+        </w:rPr>
+        <w:t>&lt;/h1&gt;</w:t>
       </w:r>
     </w:p>
     <w:p>
@@ -1347,9 +1492,26 @@
       <w:r>
         <w:rPr>
           <w:rFonts w:ascii="Courier New" w:hAnsi="Courier New" w:cs="Courier New"/>
+          <w:i/>
           <w:sz w:val="22"/>
         </w:rPr>
-        <w:t>&lt;p&gt;&lt;a class="btn" href="/add&lt;%= authQuery %&gt;"&gt;Добавить диаграмму&lt;/a&gt;&lt;/p&gt;</w:t>
+        <w:t>&lt;p&gt;&lt;a class="btn" href="/add&lt;%= authQuery %&gt;"&gt;</w:t>
+      </w:r>
+      <w:r>
+        <w:rPr>
+          <w:rFonts w:ascii="Courier New" w:hAnsi="Courier New" w:cs="Courier New"/>
+          <w:i w:val="0"/>
+          <w:sz w:val="22"/>
+        </w:rPr>
+        <w:t>Добавить диаграмму</w:t>
+      </w:r>
+      <w:r>
+        <w:rPr>
+          <w:rFonts w:ascii="Courier New" w:hAnsi="Courier New" w:cs="Courier New"/>
+          <w:i/>
+          <w:sz w:val="22"/>
+        </w:rPr>
+        <w:t>&lt;/a&gt;&lt;/p&gt;</w:t>
       </w:r>
     </w:p>
     <w:p>
@@ -1362,6 +1524,7 @@
       <w:r>
         <w:rPr>
           <w:rFonts w:ascii="Courier New" w:hAnsi="Courier New" w:cs="Courier New"/>
+          <w:i/>
           <w:sz w:val="22"/>
         </w:rPr>
         <w:t xml:space="preserve"> </w:t>
@@ -1377,6 +1540,7 @@
       <w:r>
         <w:rPr>
           <w:rFonts w:ascii="Courier New" w:hAnsi="Courier New" w:cs="Courier New"/>
+          <w:i/>
           <w:sz w:val="22"/>
         </w:rPr>
         <w:t>&lt;% if (items.length === 0) { %&gt;</w:t>
@@ -1392,9 +1556,26 @@
       <w:r>
         <w:rPr>
           <w:rFonts w:ascii="Courier New" w:hAnsi="Courier New" w:cs="Courier New"/>
+          <w:i/>
           <w:sz w:val="22"/>
         </w:rPr>
-        <w:t xml:space="preserve">    &lt;p class="muted"&gt;Диаграмм пока нет.&lt;/p&gt;</w:t>
+        <w:t xml:space="preserve">    &lt;p class="muted"&gt;</w:t>
+      </w:r>
+      <w:r>
+        <w:rPr>
+          <w:rFonts w:ascii="Courier New" w:hAnsi="Courier New" w:cs="Courier New"/>
+          <w:i w:val="0"/>
+          <w:sz w:val="22"/>
+        </w:rPr>
+        <w:t>Диаграмм пока нет</w:t>
+      </w:r>
+      <w:r>
+        <w:rPr>
+          <w:rFonts w:ascii="Courier New" w:hAnsi="Courier New" w:cs="Courier New"/>
+          <w:i/>
+          <w:sz w:val="22"/>
+        </w:rPr>
+        <w:t>.&lt;/p&gt;</w:t>
       </w:r>
     </w:p>
     <w:p>
@@ -1407,6 +1588,7 @@
       <w:r>
         <w:rPr>
           <w:rFonts w:ascii="Courier New" w:hAnsi="Courier New" w:cs="Courier New"/>
+          <w:i/>
           <w:sz w:val="22"/>
         </w:rPr>
         <w:t>&lt;% } else { %&gt;</w:t>
@@ -1422,6 +1604,7 @@
       <w:r>
         <w:rPr>
           <w:rFonts w:ascii="Courier New" w:hAnsi="Courier New" w:cs="Courier New"/>
+          <w:i/>
           <w:sz w:val="22"/>
         </w:rPr>
         <w:t xml:space="preserve">    &lt;table&gt;</w:t>
@@ -1437,6 +1620,7 @@
       <w:r>
         <w:rPr>
           <w:rFonts w:ascii="Courier New" w:hAnsi="Courier New" w:cs="Courier New"/>
+          <w:i/>
           <w:sz w:val="22"/>
         </w:rPr>
         <w:t xml:space="preserve">        &lt;thead&gt;</w:t>
@@ -1452,9 +1636,58 @@
       <w:r>
         <w:rPr>
           <w:rFonts w:ascii="Courier New" w:hAnsi="Courier New" w:cs="Courier New"/>
+          <w:i/>
           <w:sz w:val="22"/>
         </w:rPr>
-        <w:t xml:space="preserve">            &lt;tr&gt;&lt;th&gt;ID&lt;/th&gt;&lt;th&gt;Название&lt;/th&gt;&lt;th&gt;Тип&lt;/th&gt;&lt;th&gt;Создана&lt;/th&gt;&lt;/tr&gt;</w:t>
+        <w:t xml:space="preserve">            &lt;tr&gt;&lt;th&gt;ID&lt;/th&gt;&lt;th&gt;</w:t>
+      </w:r>
+      <w:r>
+        <w:rPr>
+          <w:rFonts w:ascii="Courier New" w:hAnsi="Courier New" w:cs="Courier New"/>
+          <w:i w:val="0"/>
+          <w:sz w:val="22"/>
+        </w:rPr>
+        <w:t>Название</w:t>
+      </w:r>
+      <w:r>
+        <w:rPr>
+          <w:rFonts w:ascii="Courier New" w:hAnsi="Courier New" w:cs="Courier New"/>
+          <w:i/>
+          <w:sz w:val="22"/>
+        </w:rPr>
+        <w:t>&lt;/th&gt;&lt;th&gt;</w:t>
+      </w:r>
+      <w:r>
+        <w:rPr>
+          <w:rFonts w:ascii="Courier New" w:hAnsi="Courier New" w:cs="Courier New"/>
+          <w:i w:val="0"/>
+          <w:sz w:val="22"/>
+        </w:rPr>
+        <w:t>Тип</w:t>
+      </w:r>
+      <w:r>
+        <w:rPr>
+          <w:rFonts w:ascii="Courier New" w:hAnsi="Courier New" w:cs="Courier New"/>
+          <w:i/>
+          <w:sz w:val="22"/>
+        </w:rPr>
+        <w:t>&lt;/th&gt;&lt;th&gt;</w:t>
+      </w:r>
+      <w:r>
+        <w:rPr>
+          <w:rFonts w:ascii="Courier New" w:hAnsi="Courier New" w:cs="Courier New"/>
+          <w:i w:val="0"/>
+          <w:sz w:val="22"/>
+        </w:rPr>
+        <w:t>Создана</w:t>
+      </w:r>
+      <w:r>
+        <w:rPr>
+          <w:rFonts w:ascii="Courier New" w:hAnsi="Courier New" w:cs="Courier New"/>
+          <w:i/>
+          <w:sz w:val="22"/>
+        </w:rPr>
+        <w:t>&lt;/th&gt;&lt;/tr&gt;</w:t>
       </w:r>
     </w:p>
     <w:p>
@@ -1467,6 +1700,7 @@
       <w:r>
         <w:rPr>
           <w:rFonts w:ascii="Courier New" w:hAnsi="Courier New" w:cs="Courier New"/>
+          <w:i/>
           <w:sz w:val="22"/>
         </w:rPr>
         <w:t xml:space="preserve">        &lt;/thead&gt;</w:t>
@@ -1482,6 +1716,7 @@
       <w:r>
         <w:rPr>
           <w:rFonts w:ascii="Courier New" w:hAnsi="Courier New" w:cs="Courier New"/>
+          <w:i/>
           <w:sz w:val="22"/>
         </w:rPr>
         <w:t xml:space="preserve">        &lt;tbody&gt;</w:t>
@@ -1497,6 +1732,7 @@
       <w:r>
         <w:rPr>
           <w:rFonts w:ascii="Courier New" w:hAnsi="Courier New" w:cs="Courier New"/>
+          <w:i/>
           <w:sz w:val="22"/>
         </w:rPr>
         <w:t xml:space="preserve">            &lt;% items.forEach(function (item) { %&gt;</w:t>
@@ -1512,6 +1748,7 @@
       <w:r>
         <w:rPr>
           <w:rFonts w:ascii="Courier New" w:hAnsi="Courier New" w:cs="Courier New"/>
+          <w:i/>
           <w:sz w:val="22"/>
         </w:rPr>
         <w:t xml:space="preserve">                &lt;tr&gt;</w:t>
@@ -1527,6 +1764,7 @@
       <w:r>
         <w:rPr>
           <w:rFonts w:ascii="Courier New" w:hAnsi="Courier New" w:cs="Courier New"/>
+          <w:i/>
           <w:sz w:val="22"/>
         </w:rPr>
         <w:t xml:space="preserve">                    &lt;td&gt;&lt;%= item.id %&gt;&lt;/td&gt;</w:t>
@@ -1542,6 +1780,7 @@
       <w:r>
         <w:rPr>
           <w:rFonts w:ascii="Courier New" w:hAnsi="Courier New" w:cs="Courier New"/>
+          <w:i/>
           <w:sz w:val="22"/>
         </w:rPr>
         <w:t xml:space="preserve">                    &lt;td&gt;&lt;a href="/item/&lt;%= item.id %&gt;&lt;%= authQuery %&gt;"&gt;&lt;%= item.title %&gt;&lt;/a&gt;&lt;/td&gt;</w:t>
@@ -1557,6 +1796,7 @@
       <w:r>
         <w:rPr>
           <w:rFonts w:ascii="Courier New" w:hAnsi="Courier New" w:cs="Courier New"/>
+          <w:i/>
           <w:sz w:val="22"/>
         </w:rPr>
         <w:t xml:space="preserve">                    &lt;td&gt;&lt;span class="badge"&gt;&lt;%= item.type %&gt;&lt;/span&gt;&lt;/td&gt;</w:t>
@@ -1572,6 +1812,7 @@
       <w:r>
         <w:rPr>
           <w:rFonts w:ascii="Courier New" w:hAnsi="Courier New" w:cs="Courier New"/>
+          <w:i/>
           <w:sz w:val="22"/>
         </w:rPr>
         <w:t xml:space="preserve">                    &lt;td&gt;&lt;%= formatDate(item.createdAt) %&gt;&lt;/td&gt;</w:t>
@@ -1587,6 +1828,7 @@
       <w:r>
         <w:rPr>
           <w:rFonts w:ascii="Courier New" w:hAnsi="Courier New" w:cs="Courier New"/>
+          <w:i/>
           <w:sz w:val="22"/>
         </w:rPr>
         <w:t xml:space="preserve">                &lt;/tr&gt;</w:t>
@@ -1602,6 +1844,7 @@
       <w:r>
         <w:rPr>
           <w:rFonts w:ascii="Courier New" w:hAnsi="Courier New" w:cs="Courier New"/>
+          <w:i/>
           <w:sz w:val="22"/>
         </w:rPr>
         <w:t xml:space="preserve">            &lt;% }); %&gt;</w:t>
@@ -1617,6 +1860,7 @@
       <w:r>
         <w:rPr>
           <w:rFonts w:ascii="Courier New" w:hAnsi="Courier New" w:cs="Courier New"/>
+          <w:i/>
           <w:sz w:val="22"/>
         </w:rPr>
         <w:t xml:space="preserve">        &lt;/tbody&gt;</w:t>
@@ -1632,6 +1876,7 @@
       <w:r>
         <w:rPr>
           <w:rFonts w:ascii="Courier New" w:hAnsi="Courier New" w:cs="Courier New"/>
+          <w:i/>
           <w:sz w:val="22"/>
         </w:rPr>
         <w:t xml:space="preserve">    &lt;/table&gt;</w:t>
@@ -1647,6 +1892,7 @@
       <w:r>
         <w:rPr>
           <w:rFonts w:ascii="Courier New" w:hAnsi="Courier New" w:cs="Courier New"/>
+          <w:i/>
           <w:sz w:val="22"/>
         </w:rPr>
         <w:t>&lt;% } %&gt;</w:t>
@@ -1662,6 +1908,7 @@
       <w:r>
         <w:rPr>
           <w:rFonts w:ascii="Courier New" w:hAnsi="Courier New" w:cs="Courier New"/>
+          <w:i/>
           <w:sz w:val="22"/>
         </w:rPr>
         <w:t>&lt;%- include('partials/footer') %&gt;</w:t>
@@ -1697,6 +1944,7 @@
       <w:r>
         <w:rPr>
           <w:rFonts w:ascii="Courier New" w:hAnsi="Courier New" w:cs="Courier New"/>
+          <w:i/>
           <w:sz w:val="22"/>
         </w:rPr>
         <w:t>&lt;!DOCTYPE html&gt;</w:t>
@@ -1712,6 +1960,7 @@
       <w:r>
         <w:rPr>
           <w:rFonts w:ascii="Courier New" w:hAnsi="Courier New" w:cs="Courier New"/>
+          <w:i/>
           <w:sz w:val="22"/>
         </w:rPr>
         <w:t>&lt;html lang="ru"&gt;</w:t>
@@ -1727,6 +1976,7 @@
       <w:r>
         <w:rPr>
           <w:rFonts w:ascii="Courier New" w:hAnsi="Courier New" w:cs="Courier New"/>
+          <w:i/>
           <w:sz w:val="22"/>
         </w:rPr>
         <w:t>&lt;head&gt;</w:t>
@@ -1742,6 +1992,7 @@
       <w:r>
         <w:rPr>
           <w:rFonts w:ascii="Courier New" w:hAnsi="Courier New" w:cs="Courier New"/>
+          <w:i/>
           <w:sz w:val="22"/>
         </w:rPr>
         <w:t xml:space="preserve">    &lt;meta charset="UTF-8"&gt;</w:t>
@@ -1757,6 +2008,7 @@
       <w:r>
         <w:rPr>
           <w:rFonts w:ascii="Courier New" w:hAnsi="Courier New" w:cs="Courier New"/>
+          <w:i/>
           <w:sz w:val="22"/>
         </w:rPr>
         <w:t xml:space="preserve">    &lt;meta name="viewport" content="width=device-width, initial-scale=1.0"&gt;</w:t>
@@ -1772,6 +2024,7 @@
       <w:r>
         <w:rPr>
           <w:rFonts w:ascii="Courier New" w:hAnsi="Courier New" w:cs="Courier New"/>
+          <w:i/>
           <w:sz w:val="22"/>
         </w:rPr>
         <w:t xml:space="preserve">    &lt;title&gt;&lt;%= title %&gt; | VisualDSL&lt;/title&gt;</w:t>
@@ -1787,6 +2040,7 @@
       <w:r>
         <w:rPr>
           <w:rFonts w:ascii="Courier New" w:hAnsi="Courier New" w:cs="Courier New"/>
+          <w:i/>
           <w:sz w:val="22"/>
         </w:rPr>
         <w:t xml:space="preserve">    &lt;link rel="stylesheet" href="/static/css/style.css"&gt;</w:t>
@@ -1802,6 +2056,7 @@
       <w:r>
         <w:rPr>
           <w:rFonts w:ascii="Courier New" w:hAnsi="Courier New" w:cs="Courier New"/>
+          <w:i/>
           <w:sz w:val="22"/>
         </w:rPr>
         <w:t>&lt;/head&gt;</w:t>
@@ -1817,6 +2072,7 @@
       <w:r>
         <w:rPr>
           <w:rFonts w:ascii="Courier New" w:hAnsi="Courier New" w:cs="Courier New"/>
+          <w:i/>
           <w:sz w:val="22"/>
         </w:rPr>
         <w:t>&lt;body&gt;</w:t>
@@ -1832,6 +2088,7 @@
       <w:r>
         <w:rPr>
           <w:rFonts w:ascii="Courier New" w:hAnsi="Courier New" w:cs="Courier New"/>
+          <w:i/>
           <w:sz w:val="22"/>
         </w:rPr>
         <w:t>&lt;header class="site-header"&gt;</w:t>
@@ -1847,6 +2104,7 @@
       <w:r>
         <w:rPr>
           <w:rFonts w:ascii="Courier New" w:hAnsi="Courier New" w:cs="Courier New"/>
+          <w:i/>
           <w:sz w:val="22"/>
         </w:rPr>
         <w:t xml:space="preserve">    &lt;a class="brand" href="/&lt;%= authQuery %&gt;"&gt;VisualDSL&lt;/a&gt;</w:t>
@@ -1862,6 +2120,7 @@
       <w:r>
         <w:rPr>
           <w:rFonts w:ascii="Courier New" w:hAnsi="Courier New" w:cs="Courier New"/>
+          <w:i/>
           <w:sz w:val="22"/>
         </w:rPr>
         <w:t xml:space="preserve">    &lt;nav&gt;</w:t>
@@ -1877,9 +2136,26 @@
       <w:r>
         <w:rPr>
           <w:rFonts w:ascii="Courier New" w:hAnsi="Courier New" w:cs="Courier New"/>
+          <w:i/>
           <w:sz w:val="22"/>
         </w:rPr>
-        <w:t xml:space="preserve">        &lt;a href="/&lt;%= authQuery %&gt;"&gt;Диаграммы&lt;/a&gt;</w:t>
+        <w:t xml:space="preserve">        &lt;a href="/&lt;%= authQuery %&gt;"&gt;</w:t>
+      </w:r>
+      <w:r>
+        <w:rPr>
+          <w:rFonts w:ascii="Courier New" w:hAnsi="Courier New" w:cs="Courier New"/>
+          <w:i w:val="0"/>
+          <w:sz w:val="22"/>
+        </w:rPr>
+        <w:t>Диаграммы</w:t>
+      </w:r>
+      <w:r>
+        <w:rPr>
+          <w:rFonts w:ascii="Courier New" w:hAnsi="Courier New" w:cs="Courier New"/>
+          <w:i/>
+          <w:sz w:val="22"/>
+        </w:rPr>
+        <w:t>&lt;/a&gt;</w:t>
       </w:r>
     </w:p>
     <w:p>
@@ -1892,9 +2168,26 @@
       <w:r>
         <w:rPr>
           <w:rFonts w:ascii="Courier New" w:hAnsi="Courier New" w:cs="Courier New"/>
+          <w:i/>
           <w:sz w:val="22"/>
         </w:rPr>
-        <w:t xml:space="preserve">        &lt;a href="/add&lt;%= authQuery %&gt;"&gt;Добавить&lt;/a&gt;</w:t>
+        <w:t xml:space="preserve">        &lt;a href="/add&lt;%= authQuery %&gt;"&gt;</w:t>
+      </w:r>
+      <w:r>
+        <w:rPr>
+          <w:rFonts w:ascii="Courier New" w:hAnsi="Courier New" w:cs="Courier New"/>
+          <w:i w:val="0"/>
+          <w:sz w:val="22"/>
+        </w:rPr>
+        <w:t>Добавить</w:t>
+      </w:r>
+      <w:r>
+        <w:rPr>
+          <w:rFonts w:ascii="Courier New" w:hAnsi="Courier New" w:cs="Courier New"/>
+          <w:i/>
+          <w:sz w:val="22"/>
+        </w:rPr>
+        <w:t>&lt;/a&gt;</w:t>
       </w:r>
     </w:p>
     <w:p>
@@ -1907,9 +2200,26 @@
       <w:r>
         <w:rPr>
           <w:rFonts w:ascii="Courier New" w:hAnsi="Courier New" w:cs="Courier New"/>
+          <w:i/>
           <w:sz w:val="22"/>
         </w:rPr>
-        <w:t xml:space="preserve">        &lt;a href="/logs&lt;%= authQuery %&gt;"&gt;Журнал&lt;/a&gt;</w:t>
+        <w:t xml:space="preserve">        &lt;a href="/logs&lt;%= authQuery %&gt;"&gt;</w:t>
+      </w:r>
+      <w:r>
+        <w:rPr>
+          <w:rFonts w:ascii="Courier New" w:hAnsi="Courier New" w:cs="Courier New"/>
+          <w:i w:val="0"/>
+          <w:sz w:val="22"/>
+        </w:rPr>
+        <w:t>Журнал</w:t>
+      </w:r>
+      <w:r>
+        <w:rPr>
+          <w:rFonts w:ascii="Courier New" w:hAnsi="Courier New" w:cs="Courier New"/>
+          <w:i/>
+          <w:sz w:val="22"/>
+        </w:rPr>
+        <w:t>&lt;/a&gt;</w:t>
       </w:r>
     </w:p>
     <w:p>
@@ -1922,6 +2232,7 @@
       <w:r>
         <w:rPr>
           <w:rFonts w:ascii="Courier New" w:hAnsi="Courier New" w:cs="Courier New"/>
+          <w:i/>
           <w:sz w:val="22"/>
         </w:rPr>
         <w:t xml:space="preserve">    &lt;/nav&gt;</w:t>
@@ -1937,9 +2248,26 @@
       <w:r>
         <w:rPr>
           <w:rFonts w:ascii="Courier New" w:hAnsi="Courier New" w:cs="Courier New"/>
+          <w:i/>
           <w:sz w:val="22"/>
         </w:rPr>
-        <w:t xml:space="preserve">    &lt;span class="user"&gt;Пользователь: &lt;strong&gt;&lt;%= user.name %&gt;&lt;/strong&gt;</w:t>
+        <w:t xml:space="preserve">    &lt;span class="user"&gt;</w:t>
+      </w:r>
+      <w:r>
+        <w:rPr>
+          <w:rFonts w:ascii="Courier New" w:hAnsi="Courier New" w:cs="Courier New"/>
+          <w:i w:val="0"/>
+          <w:sz w:val="22"/>
+        </w:rPr>
+        <w:t>Пользователь</w:t>
+      </w:r>
+      <w:r>
+        <w:rPr>
+          <w:rFonts w:ascii="Courier New" w:hAnsi="Courier New" w:cs="Courier New"/>
+          <w:i/>
+          <w:sz w:val="22"/>
+        </w:rPr>
+        <w:t>: &lt;strong&gt;&lt;%= user.name %&gt;&lt;/strong&gt;</w:t>
       </w:r>
     </w:p>
     <w:p>
@@ -1952,9 +2280,26 @@
       <w:r>
         <w:rPr>
           <w:rFonts w:ascii="Courier New" w:hAnsi="Courier New" w:cs="Courier New"/>
+          <w:i/>
           <w:sz w:val="22"/>
         </w:rPr>
-        <w:t xml:space="preserve">        &lt;% if (!user.isAuth) { %&gt;&lt;a href="/login"&gt;Войти&lt;/a&gt;&lt;% } %&gt;</w:t>
+        <w:t xml:space="preserve">        &lt;% if (!user.isAuth) { %&gt;&lt;a href="/login"&gt;</w:t>
+      </w:r>
+      <w:r>
+        <w:rPr>
+          <w:rFonts w:ascii="Courier New" w:hAnsi="Courier New" w:cs="Courier New"/>
+          <w:i w:val="0"/>
+          <w:sz w:val="22"/>
+        </w:rPr>
+        <w:t>Войти</w:t>
+      </w:r>
+      <w:r>
+        <w:rPr>
+          <w:rFonts w:ascii="Courier New" w:hAnsi="Courier New" w:cs="Courier New"/>
+          <w:i/>
+          <w:sz w:val="22"/>
+        </w:rPr>
+        <w:t>&lt;/a&gt;&lt;% } %&gt;</w:t>
       </w:r>
     </w:p>
     <w:p>
@@ -1967,6 +2312,7 @@
       <w:r>
         <w:rPr>
           <w:rFonts w:ascii="Courier New" w:hAnsi="Courier New" w:cs="Courier New"/>
+          <w:i/>
           <w:sz w:val="22"/>
         </w:rPr>
         <w:t xml:space="preserve">    &lt;/span&gt;</w:t>
@@ -1982,6 +2328,7 @@
       <w:r>
         <w:rPr>
           <w:rFonts w:ascii="Courier New" w:hAnsi="Courier New" w:cs="Courier New"/>
+          <w:i/>
           <w:sz w:val="22"/>
         </w:rPr>
         <w:t>&lt;/header&gt;</w:t>
@@ -1997,6 +2344,7 @@
       <w:r>
         <w:rPr>
           <w:rFonts w:ascii="Courier New" w:hAnsi="Courier New" w:cs="Courier New"/>
+          <w:i/>
           <w:sz w:val="22"/>
         </w:rPr>
         <w:t>&lt;main class="container"&gt;</w:t>
@@ -2187,9 +2535,90 @@
       <w:r>
         <w:rPr>
           <w:rFonts w:ascii="Courier New" w:hAnsi="Courier New" w:cs="Courier New"/>
+          <w:i/>
           <w:sz w:val="22"/>
         </w:rPr>
-        <w:t>// Логирование: метод, URL, статус и время обработки (мс) после отправки ответа.</w:t>
+        <w:t xml:space="preserve">// </w:t>
+      </w:r>
+      <w:r>
+        <w:rPr>
+          <w:rFonts w:ascii="Courier New" w:hAnsi="Courier New" w:cs="Courier New"/>
+          <w:i w:val="0"/>
+          <w:sz w:val="22"/>
+        </w:rPr>
+        <w:t>Логирование</w:t>
+      </w:r>
+      <w:r>
+        <w:rPr>
+          <w:rFonts w:ascii="Courier New" w:hAnsi="Courier New" w:cs="Courier New"/>
+          <w:i/>
+          <w:sz w:val="22"/>
+        </w:rPr>
+        <w:t xml:space="preserve">: </w:t>
+      </w:r>
+      <w:r>
+        <w:rPr>
+          <w:rFonts w:ascii="Courier New" w:hAnsi="Courier New" w:cs="Courier New"/>
+          <w:i w:val="0"/>
+          <w:sz w:val="22"/>
+        </w:rPr>
+        <w:t>метод</w:t>
+      </w:r>
+      <w:r>
+        <w:rPr>
+          <w:rFonts w:ascii="Courier New" w:hAnsi="Courier New" w:cs="Courier New"/>
+          <w:i/>
+          <w:sz w:val="22"/>
+        </w:rPr>
+        <w:t xml:space="preserve">, URL, </w:t>
+      </w:r>
+      <w:r>
+        <w:rPr>
+          <w:rFonts w:ascii="Courier New" w:hAnsi="Courier New" w:cs="Courier New"/>
+          <w:i w:val="0"/>
+          <w:sz w:val="22"/>
+        </w:rPr>
+        <w:t>статус и время обработки</w:t>
+      </w:r>
+      <w:r>
+        <w:rPr>
+          <w:rFonts w:ascii="Courier New" w:hAnsi="Courier New" w:cs="Courier New"/>
+          <w:i/>
+          <w:sz w:val="22"/>
+        </w:rPr>
+        <w:t xml:space="preserve"> (</w:t>
+      </w:r>
+      <w:r>
+        <w:rPr>
+          <w:rFonts w:ascii="Courier New" w:hAnsi="Courier New" w:cs="Courier New"/>
+          <w:i w:val="0"/>
+          <w:sz w:val="22"/>
+        </w:rPr>
+        <w:t>мс</w:t>
+      </w:r>
+      <w:r>
+        <w:rPr>
+          <w:rFonts w:ascii="Courier New" w:hAnsi="Courier New" w:cs="Courier New"/>
+          <w:i/>
+          <w:sz w:val="22"/>
+        </w:rPr>
+        <w:t xml:space="preserve">) </w:t>
+      </w:r>
+      <w:r>
+        <w:rPr>
+          <w:rFonts w:ascii="Courier New" w:hAnsi="Courier New" w:cs="Courier New"/>
+          <w:i w:val="0"/>
+          <w:sz w:val="22"/>
+        </w:rPr>
+        <w:t>после отправки ответа</w:t>
+      </w:r>
+      <w:r>
+        <w:rPr>
+          <w:rFonts w:ascii="Courier New" w:hAnsi="Courier New" w:cs="Courier New"/>
+          <w:i/>
+          <w:sz w:val="22"/>
+        </w:rPr>
+        <w:t>.</w:t>
       </w:r>
     </w:p>
     <w:p>
@@ -2202,9 +2631,74 @@
       <w:r>
         <w:rPr>
           <w:rFonts w:ascii="Courier New" w:hAnsi="Courier New" w:cs="Courier New"/>
+          <w:i/>
           <w:sz w:val="22"/>
         </w:rPr>
-        <w:t>// Запись попадает в журнал (таблица на странице /logs) и в консоль (кроме тестов).</w:t>
+        <w:t xml:space="preserve">// </w:t>
+      </w:r>
+      <w:r>
+        <w:rPr>
+          <w:rFonts w:ascii="Courier New" w:hAnsi="Courier New" w:cs="Courier New"/>
+          <w:i w:val="0"/>
+          <w:sz w:val="22"/>
+        </w:rPr>
+        <w:t>Запись попадает в журнал</w:t>
+      </w:r>
+      <w:r>
+        <w:rPr>
+          <w:rFonts w:ascii="Courier New" w:hAnsi="Courier New" w:cs="Courier New"/>
+          <w:i/>
+          <w:sz w:val="22"/>
+        </w:rPr>
+        <w:t xml:space="preserve"> (</w:t>
+      </w:r>
+      <w:r>
+        <w:rPr>
+          <w:rFonts w:ascii="Courier New" w:hAnsi="Courier New" w:cs="Courier New"/>
+          <w:i w:val="0"/>
+          <w:sz w:val="22"/>
+        </w:rPr>
+        <w:t>таблица на странице</w:t>
+      </w:r>
+      <w:r>
+        <w:rPr>
+          <w:rFonts w:ascii="Courier New" w:hAnsi="Courier New" w:cs="Courier New"/>
+          <w:i/>
+          <w:sz w:val="22"/>
+        </w:rPr>
+        <w:t xml:space="preserve"> /logs) </w:t>
+      </w:r>
+      <w:r>
+        <w:rPr>
+          <w:rFonts w:ascii="Courier New" w:hAnsi="Courier New" w:cs="Courier New"/>
+          <w:i w:val="0"/>
+          <w:sz w:val="22"/>
+        </w:rPr>
+        <w:t>и в консоль</w:t>
+      </w:r>
+      <w:r>
+        <w:rPr>
+          <w:rFonts w:ascii="Courier New" w:hAnsi="Courier New" w:cs="Courier New"/>
+          <w:i/>
+          <w:sz w:val="22"/>
+        </w:rPr>
+        <w:t xml:space="preserve"> (</w:t>
+      </w:r>
+      <w:r>
+        <w:rPr>
+          <w:rFonts w:ascii="Courier New" w:hAnsi="Courier New" w:cs="Courier New"/>
+          <w:i w:val="0"/>
+          <w:sz w:val="22"/>
+        </w:rPr>
+        <w:t>кроме тестов</w:t>
+      </w:r>
+      <w:r>
+        <w:rPr>
+          <w:rFonts w:ascii="Courier New" w:hAnsi="Courier New" w:cs="Courier New"/>
+          <w:i/>
+          <w:sz w:val="22"/>
+        </w:rPr>
+        <w:t>).</w:t>
       </w:r>
     </w:p>
     <w:p>
@@ -2217,6 +2711,7 @@
       <w:r>
         <w:rPr>
           <w:rFonts w:ascii="Courier New" w:hAnsi="Courier New" w:cs="Courier New"/>
+          <w:i/>
           <w:sz w:val="22"/>
         </w:rPr>
         <w:t>const logStore = require('../models/logStore');</w:t>
@@ -2232,6 +2727,7 @@
       <w:r>
         <w:rPr>
           <w:rFonts w:ascii="Courier New" w:hAnsi="Courier New" w:cs="Courier New"/>
+          <w:i/>
           <w:sz w:val="22"/>
         </w:rPr>
         <w:t xml:space="preserve"> </w:t>
@@ -2247,6 +2743,7 @@
       <w:r>
         <w:rPr>
           <w:rFonts w:ascii="Courier New" w:hAnsi="Courier New" w:cs="Courier New"/>
+          <w:i/>
           <w:sz w:val="22"/>
         </w:rPr>
         <w:t>module.exports = (req, res, next) =&gt; {</w:t>
@@ -2262,6 +2759,7 @@
       <w:r>
         <w:rPr>
           <w:rFonts w:ascii="Courier New" w:hAnsi="Courier New" w:cs="Courier New"/>
+          <w:i/>
           <w:sz w:val="22"/>
         </w:rPr>
         <w:t xml:space="preserve">  const start = process.hrtime.bigint();</w:t>
@@ -2277,6 +2775,7 @@
       <w:r>
         <w:rPr>
           <w:rFonts w:ascii="Courier New" w:hAnsi="Courier New" w:cs="Courier New"/>
+          <w:i/>
           <w:sz w:val="22"/>
         </w:rPr>
         <w:t xml:space="preserve"> </w:t>
@@ -2292,6 +2791,7 @@
       <w:r>
         <w:rPr>
           <w:rFonts w:ascii="Courier New" w:hAnsi="Courier New" w:cs="Courier New"/>
+          <w:i/>
           <w:sz w:val="22"/>
         </w:rPr>
         <w:t xml:space="preserve">  res.on('finish', () =&gt; {</w:t>
@@ -2307,6 +2807,7 @@
       <w:r>
         <w:rPr>
           <w:rFonts w:ascii="Courier New" w:hAnsi="Courier New" w:cs="Courier New"/>
+          <w:i/>
           <w:sz w:val="22"/>
         </w:rPr>
         <w:t xml:space="preserve">    const ms = Number(process.hrtime.bigint() - start) / 1e6;</w:t>
@@ -2322,6 +2823,7 @@
       <w:r>
         <w:rPr>
           <w:rFonts w:ascii="Courier New" w:hAnsi="Courier New" w:cs="Courier New"/>
+          <w:i/>
           <w:sz w:val="22"/>
         </w:rPr>
         <w:t xml:space="preserve">    const entry = logStore.add({</w:t>
@@ -2337,6 +2839,7 @@
       <w:r>
         <w:rPr>
           <w:rFonts w:ascii="Courier New" w:hAnsi="Courier New" w:cs="Courier New"/>
+          <w:i/>
           <w:sz w:val="22"/>
         </w:rPr>
         <w:t xml:space="preserve">      method: req.method,</w:t>
@@ -2352,6 +2855,7 @@
       <w:r>
         <w:rPr>
           <w:rFonts w:ascii="Courier New" w:hAnsi="Courier New" w:cs="Courier New"/>
+          <w:i/>
           <w:sz w:val="22"/>
         </w:rPr>
         <w:t xml:space="preserve">      url: req.originalUrl,</w:t>
@@ -2367,6 +2871,7 @@
       <w:r>
         <w:rPr>
           <w:rFonts w:ascii="Courier New" w:hAnsi="Courier New" w:cs="Courier New"/>
+          <w:i/>
           <w:sz w:val="22"/>
         </w:rPr>
         <w:t xml:space="preserve">      status: res.statusCode,</w:t>
@@ -2382,6 +2887,7 @@
       <w:r>
         <w:rPr>
           <w:rFonts w:ascii="Courier New" w:hAnsi="Courier New" w:cs="Courier New"/>
+          <w:i/>
           <w:sz w:val="22"/>
         </w:rPr>
         <w:t xml:space="preserve">      durationMs: ms,</w:t>
@@ -2397,9 +2903,26 @@
       <w:r>
         <w:rPr>
           <w:rFonts w:ascii="Courier New" w:hAnsi="Courier New" w:cs="Courier New"/>
+          <w:i/>
           <w:sz w:val="22"/>
         </w:rPr>
-        <w:t xml:space="preserve">      user: req.user ? req.user.name : 'Гость',</w:t>
+        <w:t xml:space="preserve">      user: req.user ? req.user.name : '</w:t>
+      </w:r>
+      <w:r>
+        <w:rPr>
+          <w:rFonts w:ascii="Courier New" w:hAnsi="Courier New" w:cs="Courier New"/>
+          <w:i w:val="0"/>
+          <w:sz w:val="22"/>
+        </w:rPr>
+        <w:t>Гость</w:t>
+      </w:r>
+      <w:r>
+        <w:rPr>
+          <w:rFonts w:ascii="Courier New" w:hAnsi="Courier New" w:cs="Courier New"/>
+          <w:i/>
+          <w:sz w:val="22"/>
+        </w:rPr>
+        <w:t>',</w:t>
       </w:r>
     </w:p>
     <w:p>
@@ -2412,6 +2935,7 @@
       <w:r>
         <w:rPr>
           <w:rFonts w:ascii="Courier New" w:hAnsi="Courier New" w:cs="Courier New"/>
+          <w:i/>
           <w:sz w:val="22"/>
         </w:rPr>
         <w:t xml:space="preserve">      ip: req.ip || '-'</w:t>
@@ -2427,6 +2951,7 @@
       <w:r>
         <w:rPr>
           <w:rFonts w:ascii="Courier New" w:hAnsi="Courier New" w:cs="Courier New"/>
+          <w:i/>
           <w:sz w:val="22"/>
         </w:rPr>
         <w:t xml:space="preserve">    });</w:t>
@@ -2442,6 +2967,7 @@
       <w:r>
         <w:rPr>
           <w:rFonts w:ascii="Courier New" w:hAnsi="Courier New" w:cs="Courier New"/>
+          <w:i/>
           <w:sz w:val="22"/>
         </w:rPr>
         <w:t xml:space="preserve"> </w:t>
@@ -2457,6 +2983,7 @@
       <w:r>
         <w:rPr>
           <w:rFonts w:ascii="Courier New" w:hAnsi="Courier New" w:cs="Courier New"/>
+          <w:i/>
           <w:sz w:val="22"/>
         </w:rPr>
         <w:t xml:space="preserve">    if (process.env.NODE_ENV !== 'test') {</w:t>
@@ -2472,6 +2999,7 @@
       <w:r>
         <w:rPr>
           <w:rFonts w:ascii="Courier New" w:hAnsi="Courier New" w:cs="Courier New"/>
+          <w:i/>
           <w:sz w:val="22"/>
         </w:rPr>
         <w:t xml:space="preserve">      console.log(</w:t>
@@ -2487,9 +3015,26 @@
       <w:r>
         <w:rPr>
           <w:rFonts w:ascii="Courier New" w:hAnsi="Courier New" w:cs="Courier New"/>
+          <w:i/>
           <w:sz w:val="22"/>
         </w:rPr>
-        <w:t xml:space="preserve">        `[${entry.time}] ${entry.method} ${entry.url} -&gt; ${entry.status} (${entry.durationMs.toFixed(2)} мс)`</w:t>
+        <w:t xml:space="preserve">        `[${entry.time}] ${entry.method} ${entry.url} -&gt; ${entry.status} (${entry.durationMs.toFixed(2)} </w:t>
+      </w:r>
+      <w:r>
+        <w:rPr>
+          <w:rFonts w:ascii="Courier New" w:hAnsi="Courier New" w:cs="Courier New"/>
+          <w:i w:val="0"/>
+          <w:sz w:val="22"/>
+        </w:rPr>
+        <w:t>мс</w:t>
+      </w:r>
+      <w:r>
+        <w:rPr>
+          <w:rFonts w:ascii="Courier New" w:hAnsi="Courier New" w:cs="Courier New"/>
+          <w:i/>
+          <w:sz w:val="22"/>
+        </w:rPr>
+        <w:t>)`</w:t>
       </w:r>
     </w:p>
     <w:p>
@@ -2502,6 +3047,7 @@
       <w:r>
         <w:rPr>
           <w:rFonts w:ascii="Courier New" w:hAnsi="Courier New" w:cs="Courier New"/>
+          <w:i/>
           <w:sz w:val="22"/>
         </w:rPr>
         <w:t xml:space="preserve">      );</w:t>
@@ -2517,6 +3063,7 @@
       <w:r>
         <w:rPr>
           <w:rFonts w:ascii="Courier New" w:hAnsi="Courier New" w:cs="Courier New"/>
+          <w:i/>
           <w:sz w:val="22"/>
         </w:rPr>
         <w:t xml:space="preserve">    }</w:t>
@@ -2532,6 +3079,7 @@
       <w:r>
         <w:rPr>
           <w:rFonts w:ascii="Courier New" w:hAnsi="Courier New" w:cs="Courier New"/>
+          <w:i/>
           <w:sz w:val="22"/>
         </w:rPr>
         <w:t xml:space="preserve">  });</w:t>
@@ -2547,6 +3095,7 @@
       <w:r>
         <w:rPr>
           <w:rFonts w:ascii="Courier New" w:hAnsi="Courier New" w:cs="Courier New"/>
+          <w:i/>
           <w:sz w:val="22"/>
         </w:rPr>
         <w:t xml:space="preserve"> </w:t>
@@ -2562,6 +3111,7 @@
       <w:r>
         <w:rPr>
           <w:rFonts w:ascii="Courier New" w:hAnsi="Courier New" w:cs="Courier New"/>
+          <w:i/>
           <w:sz w:val="22"/>
         </w:rPr>
         <w:t xml:space="preserve">  next();</w:t>
@@ -2577,6 +3127,7 @@
       <w:r>
         <w:rPr>
           <w:rFonts w:ascii="Courier New" w:hAnsi="Courier New" w:cs="Courier New"/>
+          <w:i/>
           <w:sz w:val="22"/>
         </w:rPr>
         <w:t>};</w:t>
@@ -2612,9 +3163,58 @@
       <w:r>
         <w:rPr>
           <w:rFonts w:ascii="Courier New" w:hAnsi="Courier New" w:cs="Courier New"/>
+          <w:i/>
           <w:sz w:val="22"/>
         </w:rPr>
-        <w:t>// Журнал запросов в памяти: записи отображаются на странице /logs в виде таблицы.</w:t>
+        <w:t xml:space="preserve">// </w:t>
+      </w:r>
+      <w:r>
+        <w:rPr>
+          <w:rFonts w:ascii="Courier New" w:hAnsi="Courier New" w:cs="Courier New"/>
+          <w:i w:val="0"/>
+          <w:sz w:val="22"/>
+        </w:rPr>
+        <w:t>Журнал запросов в памяти</w:t>
+      </w:r>
+      <w:r>
+        <w:rPr>
+          <w:rFonts w:ascii="Courier New" w:hAnsi="Courier New" w:cs="Courier New"/>
+          <w:i/>
+          <w:sz w:val="22"/>
+        </w:rPr>
+        <w:t xml:space="preserve">: </w:t>
+      </w:r>
+      <w:r>
+        <w:rPr>
+          <w:rFonts w:ascii="Courier New" w:hAnsi="Courier New" w:cs="Courier New"/>
+          <w:i w:val="0"/>
+          <w:sz w:val="22"/>
+        </w:rPr>
+        <w:t>записи отображаются на странице</w:t>
+      </w:r>
+      <w:r>
+        <w:rPr>
+          <w:rFonts w:ascii="Courier New" w:hAnsi="Courier New" w:cs="Courier New"/>
+          <w:i/>
+          <w:sz w:val="22"/>
+        </w:rPr>
+        <w:t xml:space="preserve"> /logs </w:t>
+      </w:r>
+      <w:r>
+        <w:rPr>
+          <w:rFonts w:ascii="Courier New" w:hAnsi="Courier New" w:cs="Courier New"/>
+          <w:i w:val="0"/>
+          <w:sz w:val="22"/>
+        </w:rPr>
+        <w:t>в виде таблицы</w:t>
+      </w:r>
+      <w:r>
+        <w:rPr>
+          <w:rFonts w:ascii="Courier New" w:hAnsi="Courier New" w:cs="Courier New"/>
+          <w:i/>
+          <w:sz w:val="22"/>
+        </w:rPr>
+        <w:t>.</w:t>
       </w:r>
     </w:p>
     <w:p>
@@ -2627,6 +3227,7 @@
       <w:r>
         <w:rPr>
           <w:rFonts w:ascii="Courier New" w:hAnsi="Courier New" w:cs="Courier New"/>
+          <w:i/>
           <w:sz w:val="22"/>
         </w:rPr>
         <w:t>const MAX_ENTRIES = 500;</w:t>
@@ -2642,6 +3243,7 @@
       <w:r>
         <w:rPr>
           <w:rFonts w:ascii="Courier New" w:hAnsi="Courier New" w:cs="Courier New"/>
+          <w:i/>
           <w:sz w:val="22"/>
         </w:rPr>
         <w:t xml:space="preserve"> </w:t>
@@ -2657,6 +3259,7 @@
       <w:r>
         <w:rPr>
           <w:rFonts w:ascii="Courier New" w:hAnsi="Courier New" w:cs="Courier New"/>
+          <w:i/>
           <w:sz w:val="22"/>
         </w:rPr>
         <w:t>let entries = [];</w:t>
@@ -2672,6 +3275,7 @@
       <w:r>
         <w:rPr>
           <w:rFonts w:ascii="Courier New" w:hAnsi="Courier New" w:cs="Courier New"/>
+          <w:i/>
           <w:sz w:val="22"/>
         </w:rPr>
         <w:t>let nextId = 1;</w:t>
@@ -2687,6 +3291,7 @@
       <w:r>
         <w:rPr>
           <w:rFonts w:ascii="Courier New" w:hAnsi="Courier New" w:cs="Courier New"/>
+          <w:i/>
           <w:sz w:val="22"/>
         </w:rPr>
         <w:t xml:space="preserve"> </w:t>
@@ -2702,9 +3307,26 @@
       <w:r>
         <w:rPr>
           <w:rFonts w:ascii="Courier New" w:hAnsi="Courier New" w:cs="Courier New"/>
+          <w:i/>
           <w:sz w:val="22"/>
         </w:rPr>
-        <w:t>// Тип события определяется по коду ответа.</w:t>
+        <w:t xml:space="preserve">// </w:t>
+      </w:r>
+      <w:r>
+        <w:rPr>
+          <w:rFonts w:ascii="Courier New" w:hAnsi="Courier New" w:cs="Courier New"/>
+          <w:i w:val="0"/>
+          <w:sz w:val="22"/>
+        </w:rPr>
+        <w:t>Тип события определяется по коду ответа</w:t>
+      </w:r>
+      <w:r>
+        <w:rPr>
+          <w:rFonts w:ascii="Courier New" w:hAnsi="Courier New" w:cs="Courier New"/>
+          <w:i/>
+          <w:sz w:val="22"/>
+        </w:rPr>
+        <w:t>.</w:t>
       </w:r>
     </w:p>
     <w:p>
@@ -2717,6 +3339,7 @@
       <w:r>
         <w:rPr>
           <w:rFonts w:ascii="Courier New" w:hAnsi="Courier New" w:cs="Courier New"/>
+          <w:i/>
           <w:sz w:val="22"/>
         </w:rPr>
         <w:t>const eventByStatus = (status) =&gt; {</w:t>
@@ -2732,9 +3355,26 @@
       <w:r>
         <w:rPr>
           <w:rFonts w:ascii="Courier New" w:hAnsi="Courier New" w:cs="Courier New"/>
+          <w:i/>
           <w:sz w:val="22"/>
         </w:rPr>
-        <w:t xml:space="preserve">  if (status &gt;= 500) return 'Ошибка сервера';</w:t>
+        <w:t xml:space="preserve">  if (status &gt;= 500) return '</w:t>
+      </w:r>
+      <w:r>
+        <w:rPr>
+          <w:rFonts w:ascii="Courier New" w:hAnsi="Courier New" w:cs="Courier New"/>
+          <w:i w:val="0"/>
+          <w:sz w:val="22"/>
+        </w:rPr>
+        <w:t>Ошибка сервера</w:t>
+      </w:r>
+      <w:r>
+        <w:rPr>
+          <w:rFonts w:ascii="Courier New" w:hAnsi="Courier New" w:cs="Courier New"/>
+          <w:i/>
+          <w:sz w:val="22"/>
+        </w:rPr>
+        <w:t>';</w:t>
       </w:r>
     </w:p>
     <w:p>
@@ -2747,9 +3387,26 @@
       <w:r>
         <w:rPr>
           <w:rFonts w:ascii="Courier New" w:hAnsi="Courier New" w:cs="Courier New"/>
+          <w:i/>
           <w:sz w:val="22"/>
         </w:rPr>
-        <w:t xml:space="preserve">  if (status &gt;= 400) return 'Ошибка клиента';</w:t>
+        <w:t xml:space="preserve">  if (status &gt;= 400) return '</w:t>
+      </w:r>
+      <w:r>
+        <w:rPr>
+          <w:rFonts w:ascii="Courier New" w:hAnsi="Courier New" w:cs="Courier New"/>
+          <w:i w:val="0"/>
+          <w:sz w:val="22"/>
+        </w:rPr>
+        <w:t>Ошибка клиента</w:t>
+      </w:r>
+      <w:r>
+        <w:rPr>
+          <w:rFonts w:ascii="Courier New" w:hAnsi="Courier New" w:cs="Courier New"/>
+          <w:i/>
+          <w:sz w:val="22"/>
+        </w:rPr>
+        <w:t>';</w:t>
       </w:r>
     </w:p>
     <w:p>
@@ -2762,9 +3419,26 @@
       <w:r>
         <w:rPr>
           <w:rFonts w:ascii="Courier New" w:hAnsi="Courier New" w:cs="Courier New"/>
+          <w:i/>
           <w:sz w:val="22"/>
         </w:rPr>
-        <w:t xml:space="preserve">  if (status &gt;= 300) return 'Перенаправление';</w:t>
+        <w:t xml:space="preserve">  if (status &gt;= 300) return '</w:t>
+      </w:r>
+      <w:r>
+        <w:rPr>
+          <w:rFonts w:ascii="Courier New" w:hAnsi="Courier New" w:cs="Courier New"/>
+          <w:i w:val="0"/>
+          <w:sz w:val="22"/>
+        </w:rPr>
+        <w:t>Перенаправление</w:t>
+      </w:r>
+      <w:r>
+        <w:rPr>
+          <w:rFonts w:ascii="Courier New" w:hAnsi="Courier New" w:cs="Courier New"/>
+          <w:i/>
+          <w:sz w:val="22"/>
+        </w:rPr>
+        <w:t>';</w:t>
       </w:r>
     </w:p>
     <w:p>
@@ -2777,9 +3451,26 @@
       <w:r>
         <w:rPr>
           <w:rFonts w:ascii="Courier New" w:hAnsi="Courier New" w:cs="Courier New"/>
+          <w:i/>
           <w:sz w:val="22"/>
         </w:rPr>
-        <w:t xml:space="preserve">  return 'Успешный запрос';</w:t>
+        <w:t xml:space="preserve">  return '</w:t>
+      </w:r>
+      <w:r>
+        <w:rPr>
+          <w:rFonts w:ascii="Courier New" w:hAnsi="Courier New" w:cs="Courier New"/>
+          <w:i w:val="0"/>
+          <w:sz w:val="22"/>
+        </w:rPr>
+        <w:t>Успешный запрос</w:t>
+      </w:r>
+      <w:r>
+        <w:rPr>
+          <w:rFonts w:ascii="Courier New" w:hAnsi="Courier New" w:cs="Courier New"/>
+          <w:i/>
+          <w:sz w:val="22"/>
+        </w:rPr>
+        <w:t>';</w:t>
       </w:r>
     </w:p>
     <w:p>
@@ -2792,6 +3483,7 @@
       <w:r>
         <w:rPr>
           <w:rFonts w:ascii="Courier New" w:hAnsi="Courier New" w:cs="Courier New"/>
+          <w:i/>
           <w:sz w:val="22"/>
         </w:rPr>
         <w:t>};</w:t>
@@ -2807,6 +3499,7 @@
       <w:r>
         <w:rPr>
           <w:rFonts w:ascii="Courier New" w:hAnsi="Courier New" w:cs="Courier New"/>
+          <w:i/>
           <w:sz w:val="22"/>
         </w:rPr>
         <w:t xml:space="preserve"> </w:t>
@@ -2822,6 +3515,7 @@
       <w:r>
         <w:rPr>
           <w:rFonts w:ascii="Courier New" w:hAnsi="Courier New" w:cs="Courier New"/>
+          <w:i/>
           <w:sz w:val="22"/>
         </w:rPr>
         <w:t>const add = ({ method, url, status, durationMs, user, ip }) =&gt; {</w:t>
@@ -2837,6 +3531,7 @@
       <w:r>
         <w:rPr>
           <w:rFonts w:ascii="Courier New" w:hAnsi="Courier New" w:cs="Courier New"/>
+          <w:i/>
           <w:sz w:val="22"/>
         </w:rPr>
         <w:t xml:space="preserve">  const entry = {</w:t>
@@ -2852,6 +3547,7 @@
       <w:r>
         <w:rPr>
           <w:rFonts w:ascii="Courier New" w:hAnsi="Courier New" w:cs="Courier New"/>
+          <w:i/>
           <w:sz w:val="22"/>
         </w:rPr>
         <w:t xml:space="preserve">    id: nextId++,</w:t>
@@ -2867,6 +3563,7 @@
       <w:r>
         <w:rPr>
           <w:rFonts w:ascii="Courier New" w:hAnsi="Courier New" w:cs="Courier New"/>
+          <w:i/>
           <w:sz w:val="22"/>
         </w:rPr>
         <w:t xml:space="preserve">    time: new Date().toISOString(),</w:t>
@@ -2882,6 +3579,7 @@
       <w:r>
         <w:rPr>
           <w:rFonts w:ascii="Courier New" w:hAnsi="Courier New" w:cs="Courier New"/>
+          <w:i/>
           <w:sz w:val="22"/>
         </w:rPr>
         <w:t xml:space="preserve">    event: eventByStatus(status),</w:t>
@@ -2897,6 +3595,7 @@
       <w:r>
         <w:rPr>
           <w:rFonts w:ascii="Courier New" w:hAnsi="Courier New" w:cs="Courier New"/>
+          <w:i/>
           <w:sz w:val="22"/>
         </w:rPr>
         <w:t xml:space="preserve">    method,</w:t>
@@ -2912,6 +3611,7 @@
       <w:r>
         <w:rPr>
           <w:rFonts w:ascii="Courier New" w:hAnsi="Courier New" w:cs="Courier New"/>
+          <w:i/>
           <w:sz w:val="22"/>
         </w:rPr>
         <w:t xml:space="preserve">    url,</w:t>
@@ -2927,6 +3627,7 @@
       <w:r>
         <w:rPr>
           <w:rFonts w:ascii="Courier New" w:hAnsi="Courier New" w:cs="Courier New"/>
+          <w:i/>
           <w:sz w:val="22"/>
         </w:rPr>
         <w:t xml:space="preserve">    status,</w:t>
@@ -2942,6 +3643,7 @@
       <w:r>
         <w:rPr>
           <w:rFonts w:ascii="Courier New" w:hAnsi="Courier New" w:cs="Courier New"/>
+          <w:i/>
           <w:sz w:val="22"/>
         </w:rPr>
         <w:t xml:space="preserve">    durationMs: Number(durationMs.toFixed(2)),</w:t>
@@ -2957,6 +3659,7 @@
       <w:r>
         <w:rPr>
           <w:rFonts w:ascii="Courier New" w:hAnsi="Courier New" w:cs="Courier New"/>
+          <w:i/>
           <w:sz w:val="22"/>
         </w:rPr>
         <w:t xml:space="preserve">    user,</w:t>
@@ -2972,6 +3675,7 @@
       <w:r>
         <w:rPr>
           <w:rFonts w:ascii="Courier New" w:hAnsi="Courier New" w:cs="Courier New"/>
+          <w:i/>
           <w:sz w:val="22"/>
         </w:rPr>
         <w:t xml:space="preserve">    ip</w:t>
@@ -2987,6 +3691,7 @@
       <w:r>
         <w:rPr>
           <w:rFonts w:ascii="Courier New" w:hAnsi="Courier New" w:cs="Courier New"/>
+          <w:i/>
           <w:sz w:val="22"/>
         </w:rPr>
         <w:t xml:space="preserve">  };</w:t>
@@ -3002,6 +3707,7 @@
       <w:r>
         <w:rPr>
           <w:rFonts w:ascii="Courier New" w:hAnsi="Courier New" w:cs="Courier New"/>
+          <w:i/>
           <w:sz w:val="22"/>
         </w:rPr>
         <w:t xml:space="preserve">  entries.push(entry);</w:t>
@@ -3017,6 +3723,7 @@
       <w:r>
         <w:rPr>
           <w:rFonts w:ascii="Courier New" w:hAnsi="Courier New" w:cs="Courier New"/>
+          <w:i/>
           <w:sz w:val="22"/>
         </w:rPr>
         <w:t xml:space="preserve">  if (entries.length &gt; MAX_ENTRIES) entries.shift();</w:t>
@@ -3032,6 +3739,7 @@
       <w:r>
         <w:rPr>
           <w:rFonts w:ascii="Courier New" w:hAnsi="Courier New" w:cs="Courier New"/>
+          <w:i/>
           <w:sz w:val="22"/>
         </w:rPr>
         <w:t xml:space="preserve">  return entry;</w:t>
@@ -3047,6 +3755,7 @@
       <w:r>
         <w:rPr>
           <w:rFonts w:ascii="Courier New" w:hAnsi="Courier New" w:cs="Courier New"/>
+          <w:i/>
           <w:sz w:val="22"/>
         </w:rPr>
         <w:t>};</w:t>
@@ -3062,6 +3771,7 @@
       <w:r>
         <w:rPr>
           <w:rFonts w:ascii="Courier New" w:hAnsi="Courier New" w:cs="Courier New"/>
+          <w:i/>
           <w:sz w:val="22"/>
         </w:rPr>
         <w:t xml:space="preserve"> </w:t>
@@ -3077,9 +3787,42 @@
       <w:r>
         <w:rPr>
           <w:rFonts w:ascii="Courier New" w:hAnsi="Courier New" w:cs="Courier New"/>
+          <w:i/>
           <w:sz w:val="22"/>
         </w:rPr>
-        <w:t>// Новые записи первыми; необязательные фильтры по методу и классу события.</w:t>
+        <w:t xml:space="preserve">// </w:t>
+      </w:r>
+      <w:r>
+        <w:rPr>
+          <w:rFonts w:ascii="Courier New" w:hAnsi="Courier New" w:cs="Courier New"/>
+          <w:i w:val="0"/>
+          <w:sz w:val="22"/>
+        </w:rPr>
+        <w:t>Новые записи первыми</w:t>
+      </w:r>
+      <w:r>
+        <w:rPr>
+          <w:rFonts w:ascii="Courier New" w:hAnsi="Courier New" w:cs="Courier New"/>
+          <w:i/>
+          <w:sz w:val="22"/>
+        </w:rPr>
+        <w:t xml:space="preserve">; </w:t>
+      </w:r>
+      <w:r>
+        <w:rPr>
+          <w:rFonts w:ascii="Courier New" w:hAnsi="Courier New" w:cs="Courier New"/>
+          <w:i w:val="0"/>
+          <w:sz w:val="22"/>
+        </w:rPr>
+        <w:t>необязательные фильтры по методу и классу события</w:t>
+      </w:r>
+      <w:r>
+        <w:rPr>
+          <w:rFonts w:ascii="Courier New" w:hAnsi="Courier New" w:cs="Courier New"/>
+          <w:i/>
+          <w:sz w:val="22"/>
+        </w:rPr>
+        <w:t>.</w:t>
       </w:r>
     </w:p>
     <w:p>
@@ -3092,6 +3835,7 @@
       <w:r>
         <w:rPr>
           <w:rFonts w:ascii="Courier New" w:hAnsi="Courier New" w:cs="Courier New"/>
+          <w:i/>
           <w:sz w:val="22"/>
         </w:rPr>
         <w:t>const getAll = ({ method, event } = {}) =&gt;</w:t>
@@ -3107,6 +3851,7 @@
       <w:r>
         <w:rPr>
           <w:rFonts w:ascii="Courier New" w:hAnsi="Courier New" w:cs="Courier New"/>
+          <w:i/>
           <w:sz w:val="22"/>
         </w:rPr>
         <w:t xml:space="preserve">  entries</w:t>
@@ -3122,6 +3867,7 @@
       <w:r>
         <w:rPr>
           <w:rFonts w:ascii="Courier New" w:hAnsi="Courier New" w:cs="Courier New"/>
+          <w:i/>
           <w:sz w:val="22"/>
         </w:rPr>
         <w:t xml:space="preserve">    .filter((e) =&gt; (!method || e.method === method) &amp;&amp; (!event || e.event === event))</w:t>
@@ -3137,6 +3883,7 @@
       <w:r>
         <w:rPr>
           <w:rFonts w:ascii="Courier New" w:hAnsi="Courier New" w:cs="Courier New"/>
+          <w:i/>
           <w:sz w:val="22"/>
         </w:rPr>
         <w:t xml:space="preserve">    .reverse();</w:t>
@@ -3152,6 +3899,7 @@
       <w:r>
         <w:rPr>
           <w:rFonts w:ascii="Courier New" w:hAnsi="Courier New" w:cs="Courier New"/>
+          <w:i/>
           <w:sz w:val="22"/>
         </w:rPr>
         <w:t xml:space="preserve"> </w:t>
@@ -3167,6 +3915,7 @@
       <w:r>
         <w:rPr>
           <w:rFonts w:ascii="Courier New" w:hAnsi="Courier New" w:cs="Courier New"/>
+          <w:i/>
           <w:sz w:val="22"/>
         </w:rPr>
         <w:t>const clear = () =&gt; {</w:t>
@@ -3182,6 +3931,7 @@
       <w:r>
         <w:rPr>
           <w:rFonts w:ascii="Courier New" w:hAnsi="Courier New" w:cs="Courier New"/>
+          <w:i/>
           <w:sz w:val="22"/>
         </w:rPr>
         <w:t xml:space="preserve">  entries = [];</w:t>
@@ -3197,6 +3947,7 @@
       <w:r>
         <w:rPr>
           <w:rFonts w:ascii="Courier New" w:hAnsi="Courier New" w:cs="Courier New"/>
+          <w:i/>
           <w:sz w:val="22"/>
         </w:rPr>
         <w:t xml:space="preserve">  nextId = 1;</w:t>
@@ -3212,6 +3963,7 @@
       <w:r>
         <w:rPr>
           <w:rFonts w:ascii="Courier New" w:hAnsi="Courier New" w:cs="Courier New"/>
+          <w:i/>
           <w:sz w:val="22"/>
         </w:rPr>
         <w:t>};</w:t>
@@ -3227,6 +3979,7 @@
       <w:r>
         <w:rPr>
           <w:rFonts w:ascii="Courier New" w:hAnsi="Courier New" w:cs="Courier New"/>
+          <w:i/>
           <w:sz w:val="22"/>
         </w:rPr>
         <w:t xml:space="preserve"> </w:t>
@@ -3242,6 +3995,7 @@
       <w:r>
         <w:rPr>
           <w:rFonts w:ascii="Courier New" w:hAnsi="Courier New" w:cs="Courier New"/>
+          <w:i/>
           <w:sz w:val="22"/>
         </w:rPr>
         <w:t>module.exports = { MAX_ENTRIES, eventByStatus, add, getAll, clear };</w:t>
@@ -3286,9 +4040,58 @@
       <w:r>
         <w:rPr>
           <w:rFonts w:ascii="Courier New" w:hAnsi="Courier New" w:cs="Courier New"/>
+          <w:i/>
           <w:sz w:val="22"/>
         </w:rPr>
-        <w:t>// Имитация авторизации по query-параметру ?auth=1 (без сессий и паролей).</w:t>
+        <w:t xml:space="preserve">// </w:t>
+      </w:r>
+      <w:r>
+        <w:rPr>
+          <w:rFonts w:ascii="Courier New" w:hAnsi="Courier New" w:cs="Courier New"/>
+          <w:i w:val="0"/>
+          <w:sz w:val="22"/>
+        </w:rPr>
+        <w:t>Имитация авторизации по</w:t>
+      </w:r>
+      <w:r>
+        <w:rPr>
+          <w:rFonts w:ascii="Courier New" w:hAnsi="Courier New" w:cs="Courier New"/>
+          <w:i/>
+          <w:sz w:val="22"/>
+        </w:rPr>
+        <w:t xml:space="preserve"> query-</w:t>
+      </w:r>
+      <w:r>
+        <w:rPr>
+          <w:rFonts w:ascii="Courier New" w:hAnsi="Courier New" w:cs="Courier New"/>
+          <w:i w:val="0"/>
+          <w:sz w:val="22"/>
+        </w:rPr>
+        <w:t>параметру</w:t>
+      </w:r>
+      <w:r>
+        <w:rPr>
+          <w:rFonts w:ascii="Courier New" w:hAnsi="Courier New" w:cs="Courier New"/>
+          <w:i/>
+          <w:sz w:val="22"/>
+        </w:rPr>
+        <w:t xml:space="preserve"> ?auth=1 (</w:t>
+      </w:r>
+      <w:r>
+        <w:rPr>
+          <w:rFonts w:ascii="Courier New" w:hAnsi="Courier New" w:cs="Courier New"/>
+          <w:i w:val="0"/>
+          <w:sz w:val="22"/>
+        </w:rPr>
+        <w:t>без сессий и паролей</w:t>
+      </w:r>
+      <w:r>
+        <w:rPr>
+          <w:rFonts w:ascii="Courier New" w:hAnsi="Courier New" w:cs="Courier New"/>
+          <w:i/>
+          <w:sz w:val="22"/>
+        </w:rPr>
+        <w:t>).</w:t>
       </w:r>
     </w:p>
     <w:p>
@@ -3301,9 +4104,26 @@
       <w:r>
         <w:rPr>
           <w:rFonts w:ascii="Courier New" w:hAnsi="Courier New" w:cs="Courier New"/>
+          <w:i/>
           <w:sz w:val="22"/>
         </w:rPr>
-        <w:t>const GUEST = { name: 'Гость', isAuth: false };</w:t>
+        <w:t>const GUEST = { name: '</w:t>
+      </w:r>
+      <w:r>
+        <w:rPr>
+          <w:rFonts w:ascii="Courier New" w:hAnsi="Courier New" w:cs="Courier New"/>
+          <w:i w:val="0"/>
+          <w:sz w:val="22"/>
+        </w:rPr>
+        <w:t>Гость</w:t>
+      </w:r>
+      <w:r>
+        <w:rPr>
+          <w:rFonts w:ascii="Courier New" w:hAnsi="Courier New" w:cs="Courier New"/>
+          <w:i/>
+          <w:sz w:val="22"/>
+        </w:rPr>
+        <w:t>', isAuth: false };</w:t>
       </w:r>
     </w:p>
     <w:p>
@@ -3316,9 +4136,26 @@
       <w:r>
         <w:rPr>
           <w:rFonts w:ascii="Courier New" w:hAnsi="Courier New" w:cs="Courier New"/>
+          <w:i/>
           <w:sz w:val="22"/>
         </w:rPr>
-        <w:t>const ADMIN = { name: 'Администратор', isAuth: true };</w:t>
+        <w:t>const ADMIN = { name: '</w:t>
+      </w:r>
+      <w:r>
+        <w:rPr>
+          <w:rFonts w:ascii="Courier New" w:hAnsi="Courier New" w:cs="Courier New"/>
+          <w:i w:val="0"/>
+          <w:sz w:val="22"/>
+        </w:rPr>
+        <w:t>Администратор</w:t>
+      </w:r>
+      <w:r>
+        <w:rPr>
+          <w:rFonts w:ascii="Courier New" w:hAnsi="Courier New" w:cs="Courier New"/>
+          <w:i/>
+          <w:sz w:val="22"/>
+        </w:rPr>
+        <w:t>', isAuth: true };</w:t>
       </w:r>
     </w:p>
     <w:p>
@@ -3331,6 +4168,7 @@
       <w:r>
         <w:rPr>
           <w:rFonts w:ascii="Courier New" w:hAnsi="Courier New" w:cs="Courier New"/>
+          <w:i/>
           <w:sz w:val="22"/>
         </w:rPr>
         <w:t xml:space="preserve"> </w:t>
@@ -3346,9 +4184,26 @@
       <w:r>
         <w:rPr>
           <w:rFonts w:ascii="Courier New" w:hAnsi="Courier New" w:cs="Courier New"/>
+          <w:i/>
           <w:sz w:val="22"/>
         </w:rPr>
-        <w:t>// Определяет пользователя и передает его в шаблоны (res.locals).</w:t>
+        <w:t xml:space="preserve">// </w:t>
+      </w:r>
+      <w:r>
+        <w:rPr>
+          <w:rFonts w:ascii="Courier New" w:hAnsi="Courier New" w:cs="Courier New"/>
+          <w:i w:val="0"/>
+          <w:sz w:val="22"/>
+        </w:rPr>
+        <w:t>Определяет пользователя и передает его в шаблоны</w:t>
+      </w:r>
+      <w:r>
+        <w:rPr>
+          <w:rFonts w:ascii="Courier New" w:hAnsi="Courier New" w:cs="Courier New"/>
+          <w:i/>
+          <w:sz w:val="22"/>
+        </w:rPr>
+        <w:t xml:space="preserve"> (res.locals).</w:t>
       </w:r>
     </w:p>
     <w:p>
@@ -3361,6 +4216,7 @@
       <w:r>
         <w:rPr>
           <w:rFonts w:ascii="Courier New" w:hAnsi="Courier New" w:cs="Courier New"/>
+          <w:i/>
           <w:sz w:val="22"/>
         </w:rPr>
         <w:t>const attachUser = (req, res, next) =&gt; {</w:t>
@@ -3376,6 +4232,7 @@
       <w:r>
         <w:rPr>
           <w:rFonts w:ascii="Courier New" w:hAnsi="Courier New" w:cs="Courier New"/>
+          <w:i/>
           <w:sz w:val="22"/>
         </w:rPr>
         <w:t xml:space="preserve">  req.user = req.query.auth === '1' ? ADMIN : GUEST;</w:t>
@@ -3391,6 +4248,7 @@
       <w:r>
         <w:rPr>
           <w:rFonts w:ascii="Courier New" w:hAnsi="Courier New" w:cs="Courier New"/>
+          <w:i/>
           <w:sz w:val="22"/>
         </w:rPr>
         <w:t xml:space="preserve">  res.locals.user = req.user;</w:t>
@@ -3406,9 +4264,74 @@
       <w:r>
         <w:rPr>
           <w:rFonts w:ascii="Courier New" w:hAnsi="Courier New" w:cs="Courier New"/>
+          <w:i/>
           <w:sz w:val="22"/>
         </w:rPr>
-        <w:t xml:space="preserve">  // Суффикс для ссылок, чтобы "авторизация" сохранялась при переходах по сайту.</w:t>
+        <w:t xml:space="preserve">  // </w:t>
+      </w:r>
+      <w:r>
+        <w:rPr>
+          <w:rFonts w:ascii="Courier New" w:hAnsi="Courier New" w:cs="Courier New"/>
+          <w:i w:val="0"/>
+          <w:sz w:val="22"/>
+        </w:rPr>
+        <w:t>Суффикс для ссылок</w:t>
+      </w:r>
+      <w:r>
+        <w:rPr>
+          <w:rFonts w:ascii="Courier New" w:hAnsi="Courier New" w:cs="Courier New"/>
+          <w:i/>
+          <w:sz w:val="22"/>
+        </w:rPr>
+        <w:t xml:space="preserve">, </w:t>
+      </w:r>
+      <w:r>
+        <w:rPr>
+          <w:rFonts w:ascii="Courier New" w:hAnsi="Courier New" w:cs="Courier New"/>
+          <w:i w:val="0"/>
+          <w:sz w:val="22"/>
+        </w:rPr>
+        <w:t>чтобы</w:t>
+      </w:r>
+      <w:r>
+        <w:rPr>
+          <w:rFonts w:ascii="Courier New" w:hAnsi="Courier New" w:cs="Courier New"/>
+          <w:i/>
+          <w:sz w:val="22"/>
+        </w:rPr>
+        <w:t xml:space="preserve"> "</w:t>
+      </w:r>
+      <w:r>
+        <w:rPr>
+          <w:rFonts w:ascii="Courier New" w:hAnsi="Courier New" w:cs="Courier New"/>
+          <w:i w:val="0"/>
+          <w:sz w:val="22"/>
+        </w:rPr>
+        <w:t>авторизация</w:t>
+      </w:r>
+      <w:r>
+        <w:rPr>
+          <w:rFonts w:ascii="Courier New" w:hAnsi="Courier New" w:cs="Courier New"/>
+          <w:i/>
+          <w:sz w:val="22"/>
+        </w:rPr>
+        <w:t xml:space="preserve">" </w:t>
+      </w:r>
+      <w:r>
+        <w:rPr>
+          <w:rFonts w:ascii="Courier New" w:hAnsi="Courier New" w:cs="Courier New"/>
+          <w:i w:val="0"/>
+          <w:sz w:val="22"/>
+        </w:rPr>
+        <w:t>сохранялась при переходах по сайту</w:t>
+      </w:r>
+      <w:r>
+        <w:rPr>
+          <w:rFonts w:ascii="Courier New" w:hAnsi="Courier New" w:cs="Courier New"/>
+          <w:i/>
+          <w:sz w:val="22"/>
+        </w:rPr>
+        <w:t>.</w:t>
       </w:r>
     </w:p>
     <w:p>
@@ -3421,6 +4344,7 @@
       <w:r>
         <w:rPr>
           <w:rFonts w:ascii="Courier New" w:hAnsi="Courier New" w:cs="Courier New"/>
+          <w:i/>
           <w:sz w:val="22"/>
         </w:rPr>
         <w:t xml:space="preserve">  res.locals.authQuery = req.user.isAuth ? '?auth=1' : '';</w:t>
@@ -3436,6 +4360,7 @@
       <w:r>
         <w:rPr>
           <w:rFonts w:ascii="Courier New" w:hAnsi="Courier New" w:cs="Courier New"/>
+          <w:i/>
           <w:sz w:val="22"/>
         </w:rPr>
         <w:t xml:space="preserve">  next();</w:t>
@@ -3451,6 +4376,7 @@
       <w:r>
         <w:rPr>
           <w:rFonts w:ascii="Courier New" w:hAnsi="Courier New" w:cs="Courier New"/>
+          <w:i/>
           <w:sz w:val="22"/>
         </w:rPr>
         <w:t>};</w:t>
@@ -3466,6 +4392,7 @@
       <w:r>
         <w:rPr>
           <w:rFonts w:ascii="Courier New" w:hAnsi="Courier New" w:cs="Courier New"/>
+          <w:i/>
           <w:sz w:val="22"/>
         </w:rPr>
         <w:t xml:space="preserve"> </w:t>
@@ -3481,9 +4408,42 @@
       <w:r>
         <w:rPr>
           <w:rFonts w:ascii="Courier New" w:hAnsi="Courier New" w:cs="Courier New"/>
+          <w:i/>
           <w:sz w:val="22"/>
         </w:rPr>
-        <w:t>// Защита маршрута: гость перенаправляется на /login.</w:t>
+        <w:t xml:space="preserve">// </w:t>
+      </w:r>
+      <w:r>
+        <w:rPr>
+          <w:rFonts w:ascii="Courier New" w:hAnsi="Courier New" w:cs="Courier New"/>
+          <w:i w:val="0"/>
+          <w:sz w:val="22"/>
+        </w:rPr>
+        <w:t>Защита маршрута</w:t>
+      </w:r>
+      <w:r>
+        <w:rPr>
+          <w:rFonts w:ascii="Courier New" w:hAnsi="Courier New" w:cs="Courier New"/>
+          <w:i/>
+          <w:sz w:val="22"/>
+        </w:rPr>
+        <w:t xml:space="preserve">: </w:t>
+      </w:r>
+      <w:r>
+        <w:rPr>
+          <w:rFonts w:ascii="Courier New" w:hAnsi="Courier New" w:cs="Courier New"/>
+          <w:i w:val="0"/>
+          <w:sz w:val="22"/>
+        </w:rPr>
+        <w:t>гость перенаправляется на</w:t>
+      </w:r>
+      <w:r>
+        <w:rPr>
+          <w:rFonts w:ascii="Courier New" w:hAnsi="Courier New" w:cs="Courier New"/>
+          <w:i/>
+          <w:sz w:val="22"/>
+        </w:rPr>
+        <w:t xml:space="preserve"> /login.</w:t>
       </w:r>
     </w:p>
     <w:p>
@@ -3496,6 +4456,7 @@
       <w:r>
         <w:rPr>
           <w:rFonts w:ascii="Courier New" w:hAnsi="Courier New" w:cs="Courier New"/>
+          <w:i/>
           <w:sz w:val="22"/>
         </w:rPr>
         <w:t>const requireAuth = (req, res, next) =&gt; {</w:t>
@@ -3511,6 +4472,7 @@
       <w:r>
         <w:rPr>
           <w:rFonts w:ascii="Courier New" w:hAnsi="Courier New" w:cs="Courier New"/>
+          <w:i/>
           <w:sz w:val="22"/>
         </w:rPr>
         <w:t xml:space="preserve">  if (req.user &amp;&amp; req.user.isAuth) return next();</w:t>
@@ -3526,6 +4488,7 @@
       <w:r>
         <w:rPr>
           <w:rFonts w:ascii="Courier New" w:hAnsi="Courier New" w:cs="Courier New"/>
+          <w:i/>
           <w:sz w:val="22"/>
         </w:rPr>
         <w:t xml:space="preserve">  res.redirect('/login');</w:t>
@@ -3541,6 +4504,7 @@
       <w:r>
         <w:rPr>
           <w:rFonts w:ascii="Courier New" w:hAnsi="Courier New" w:cs="Courier New"/>
+          <w:i/>
           <w:sz w:val="22"/>
         </w:rPr>
         <w:t>};</w:t>
@@ -3556,6 +4520,7 @@
       <w:r>
         <w:rPr>
           <w:rFonts w:ascii="Courier New" w:hAnsi="Courier New" w:cs="Courier New"/>
+          <w:i/>
           <w:sz w:val="22"/>
         </w:rPr>
         <w:t xml:space="preserve"> </w:t>
@@ -3571,6 +4536,7 @@
       <w:r>
         <w:rPr>
           <w:rFonts w:ascii="Courier New" w:hAnsi="Courier New" w:cs="Courier New"/>
+          <w:i/>
           <w:sz w:val="22"/>
         </w:rPr>
         <w:t>module.exports = { attachUser, requireAuth };</w:t>
@@ -3701,6 +4667,7 @@
       <w:r>
         <w:rPr>
           <w:rFonts w:ascii="Courier New" w:hAnsi="Courier New" w:cs="Courier New"/>
+          <w:i/>
           <w:sz w:val="22"/>
         </w:rPr>
         <w:t>const express = require('express');</w:t>
@@ -3716,6 +4683,7 @@
       <w:r>
         <w:rPr>
           <w:rFonts w:ascii="Courier New" w:hAnsi="Courier New" w:cs="Courier New"/>
+          <w:i/>
           <w:sz w:val="22"/>
         </w:rPr>
         <w:t>const { requireAuth } = require('../middlewares/auth');</w:t>
@@ -3731,6 +4699,7 @@
       <w:r>
         <w:rPr>
           <w:rFonts w:ascii="Courier New" w:hAnsi="Courier New" w:cs="Courier New"/>
+          <w:i/>
           <w:sz w:val="22"/>
         </w:rPr>
         <w:t>const pages = require('../controllers/pageController');</w:t>
@@ -3746,6 +4715,7 @@
       <w:r>
         <w:rPr>
           <w:rFonts w:ascii="Courier New" w:hAnsi="Courier New" w:cs="Courier New"/>
+          <w:i/>
           <w:sz w:val="22"/>
         </w:rPr>
         <w:t xml:space="preserve"> </w:t>
@@ -3761,6 +4731,7 @@
       <w:r>
         <w:rPr>
           <w:rFonts w:ascii="Courier New" w:hAnsi="Courier New" w:cs="Courier New"/>
+          <w:i/>
           <w:sz w:val="22"/>
         </w:rPr>
         <w:t>const router = express.Router();</w:t>
@@ -3776,6 +4747,7 @@
       <w:r>
         <w:rPr>
           <w:rFonts w:ascii="Courier New" w:hAnsi="Courier New" w:cs="Courier New"/>
+          <w:i/>
           <w:sz w:val="22"/>
         </w:rPr>
         <w:t xml:space="preserve"> </w:t>
@@ -3791,6 +4763,7 @@
       <w:r>
         <w:rPr>
           <w:rFonts w:ascii="Courier New" w:hAnsi="Courier New" w:cs="Courier New"/>
+          <w:i/>
           <w:sz w:val="22"/>
         </w:rPr>
         <w:t>router.get('/', pages.index);</w:t>
@@ -3806,6 +4779,7 @@
       <w:r>
         <w:rPr>
           <w:rFonts w:ascii="Courier New" w:hAnsi="Courier New" w:cs="Courier New"/>
+          <w:i/>
           <w:sz w:val="22"/>
         </w:rPr>
         <w:t>router.get('/item/:id', pages.item);</w:t>
@@ -3821,6 +4795,7 @@
       <w:r>
         <w:rPr>
           <w:rFonts w:ascii="Courier New" w:hAnsi="Courier New" w:cs="Courier New"/>
+          <w:i/>
           <w:sz w:val="22"/>
         </w:rPr>
         <w:t>router.get('/login', pages.login);</w:t>
@@ -3836,6 +4811,7 @@
       <w:r>
         <w:rPr>
           <w:rFonts w:ascii="Courier New" w:hAnsi="Courier New" w:cs="Courier New"/>
+          <w:i/>
           <w:sz w:val="22"/>
         </w:rPr>
         <w:t>router.get('/logs', pages.logs);</w:t>
@@ -3851,9 +4827,26 @@
       <w:r>
         <w:rPr>
           <w:rFonts w:ascii="Courier New" w:hAnsi="Courier New" w:cs="Courier New"/>
+          <w:i/>
           <w:sz w:val="22"/>
         </w:rPr>
-        <w:t>// Middleware requireAuth выполняется только для этих маршрутов.</w:t>
+        <w:t xml:space="preserve">// Middleware requireAuth </w:t>
+      </w:r>
+      <w:r>
+        <w:rPr>
+          <w:rFonts w:ascii="Courier New" w:hAnsi="Courier New" w:cs="Courier New"/>
+          <w:i w:val="0"/>
+          <w:sz w:val="22"/>
+        </w:rPr>
+        <w:t>выполняется только для этих маршрутов</w:t>
+      </w:r>
+      <w:r>
+        <w:rPr>
+          <w:rFonts w:ascii="Courier New" w:hAnsi="Courier New" w:cs="Courier New"/>
+          <w:i/>
+          <w:sz w:val="22"/>
+        </w:rPr>
+        <w:t>.</w:t>
       </w:r>
     </w:p>
     <w:p>
@@ -3866,6 +4859,7 @@
       <w:r>
         <w:rPr>
           <w:rFonts w:ascii="Courier New" w:hAnsi="Courier New" w:cs="Courier New"/>
+          <w:i/>
           <w:sz w:val="22"/>
         </w:rPr>
         <w:t>router.get('/add', requireAuth, pages.addForm);</w:t>
@@ -3881,6 +4875,7 @@
       <w:r>
         <w:rPr>
           <w:rFonts w:ascii="Courier New" w:hAnsi="Courier New" w:cs="Courier New"/>
+          <w:i/>
           <w:sz w:val="22"/>
         </w:rPr>
         <w:t>router.post('/add', requireAuth, pages.addSubmit);</w:t>
@@ -3896,6 +4891,7 @@
       <w:r>
         <w:rPr>
           <w:rFonts w:ascii="Courier New" w:hAnsi="Courier New" w:cs="Courier New"/>
+          <w:i/>
           <w:sz w:val="22"/>
         </w:rPr>
         <w:t xml:space="preserve"> </w:t>
@@ -3911,6 +4907,7 @@
       <w:r>
         <w:rPr>
           <w:rFonts w:ascii="Courier New" w:hAnsi="Courier New" w:cs="Courier New"/>
+          <w:i/>
           <w:sz w:val="22"/>
         </w:rPr>
         <w:t>if (process.env.NODE_ENV !== 'production') {</w:t>
@@ -3926,6 +4923,7 @@
       <w:r>
         <w:rPr>
           <w:rFonts w:ascii="Courier New" w:hAnsi="Courier New" w:cs="Courier New"/>
+          <w:i/>
           <w:sz w:val="22"/>
         </w:rPr>
         <w:t xml:space="preserve">  router.get('/debug/error', pages.crash);</w:t>
@@ -3941,6 +4939,7 @@
       <w:r>
         <w:rPr>
           <w:rFonts w:ascii="Courier New" w:hAnsi="Courier New" w:cs="Courier New"/>
+          <w:i/>
           <w:sz w:val="22"/>
         </w:rPr>
         <w:t>}</w:t>
@@ -3956,6 +4955,7 @@
       <w:r>
         <w:rPr>
           <w:rFonts w:ascii="Courier New" w:hAnsi="Courier New" w:cs="Courier New"/>
+          <w:i/>
           <w:sz w:val="22"/>
         </w:rPr>
         <w:t xml:space="preserve"> </w:t>
@@ -3971,6 +4971,7 @@
       <w:r>
         <w:rPr>
           <w:rFonts w:ascii="Courier New" w:hAnsi="Courier New" w:cs="Courier New"/>
+          <w:i/>
           <w:sz w:val="22"/>
         </w:rPr>
         <w:t>module.exports = router;</w:t>
@@ -4119,9 +5120,74 @@
       <w:r>
         <w:rPr>
           <w:rFonts w:ascii="Courier New" w:hAnsi="Courier New" w:cs="Courier New"/>
+          <w:i/>
           <w:sz w:val="22"/>
         </w:rPr>
-        <w:t>// Обработчики ошибок: 404 (маршрут не найден) и 500 (исключение в приложении).</w:t>
+        <w:t xml:space="preserve">// </w:t>
+      </w:r>
+      <w:r>
+        <w:rPr>
+          <w:rFonts w:ascii="Courier New" w:hAnsi="Courier New" w:cs="Courier New"/>
+          <w:i w:val="0"/>
+          <w:sz w:val="22"/>
+        </w:rPr>
+        <w:t>Обработчики ошибок</w:t>
+      </w:r>
+      <w:r>
+        <w:rPr>
+          <w:rFonts w:ascii="Courier New" w:hAnsi="Courier New" w:cs="Courier New"/>
+          <w:i/>
+          <w:sz w:val="22"/>
+        </w:rPr>
+        <w:t>: 404 (</w:t>
+      </w:r>
+      <w:r>
+        <w:rPr>
+          <w:rFonts w:ascii="Courier New" w:hAnsi="Courier New" w:cs="Courier New"/>
+          <w:i w:val="0"/>
+          <w:sz w:val="22"/>
+        </w:rPr>
+        <w:t>маршрут не найден</w:t>
+      </w:r>
+      <w:r>
+        <w:rPr>
+          <w:rFonts w:ascii="Courier New" w:hAnsi="Courier New" w:cs="Courier New"/>
+          <w:i/>
+          <w:sz w:val="22"/>
+        </w:rPr>
+        <w:t xml:space="preserve">) </w:t>
+      </w:r>
+      <w:r>
+        <w:rPr>
+          <w:rFonts w:ascii="Courier New" w:hAnsi="Courier New" w:cs="Courier New"/>
+          <w:i w:val="0"/>
+          <w:sz w:val="22"/>
+        </w:rPr>
+        <w:t>и</w:t>
+      </w:r>
+      <w:r>
+        <w:rPr>
+          <w:rFonts w:ascii="Courier New" w:hAnsi="Courier New" w:cs="Courier New"/>
+          <w:i/>
+          <w:sz w:val="22"/>
+        </w:rPr>
+        <w:t xml:space="preserve"> 500 (</w:t>
+      </w:r>
+      <w:r>
+        <w:rPr>
+          <w:rFonts w:ascii="Courier New" w:hAnsi="Courier New" w:cs="Courier New"/>
+          <w:i w:val="0"/>
+          <w:sz w:val="22"/>
+        </w:rPr>
+        <w:t>исключение в приложении</w:t>
+      </w:r>
+      <w:r>
+        <w:rPr>
+          <w:rFonts w:ascii="Courier New" w:hAnsi="Courier New" w:cs="Courier New"/>
+          <w:i/>
+          <w:sz w:val="22"/>
+        </w:rPr>
+        <w:t>).</w:t>
       </w:r>
     </w:p>
     <w:p>
@@ -4134,6 +5200,7 @@
       <w:r>
         <w:rPr>
           <w:rFonts w:ascii="Courier New" w:hAnsi="Courier New" w:cs="Courier New"/>
+          <w:i/>
           <w:sz w:val="22"/>
         </w:rPr>
         <w:t>const wantsJson = (req) =&gt; req.originalUrl.startsWith('/api/');</w:t>
@@ -4149,6 +5216,7 @@
       <w:r>
         <w:rPr>
           <w:rFonts w:ascii="Courier New" w:hAnsi="Courier New" w:cs="Courier New"/>
+          <w:i/>
           <w:sz w:val="22"/>
         </w:rPr>
         <w:t xml:space="preserve"> </w:t>
@@ -4164,6 +5232,7 @@
       <w:r>
         <w:rPr>
           <w:rFonts w:ascii="Courier New" w:hAnsi="Courier New" w:cs="Courier New"/>
+          <w:i/>
           <w:sz w:val="22"/>
         </w:rPr>
         <w:t>const notFoundHandler = (req, res) =&gt; {</w:t>
@@ -4179,9 +5248,26 @@
       <w:r>
         <w:rPr>
           <w:rFonts w:ascii="Courier New" w:hAnsi="Courier New" w:cs="Courier New"/>
+          <w:i/>
           <w:sz w:val="22"/>
         </w:rPr>
-        <w:t xml:space="preserve">  if (wantsJson(req)) return res.status(404).json({ error: 'Маршрут не найден' });</w:t>
+        <w:t xml:space="preserve">  if (wantsJson(req)) return res.status(404).json({ error: '</w:t>
+      </w:r>
+      <w:r>
+        <w:rPr>
+          <w:rFonts w:ascii="Courier New" w:hAnsi="Courier New" w:cs="Courier New"/>
+          <w:i w:val="0"/>
+          <w:sz w:val="22"/>
+        </w:rPr>
+        <w:t>Маршрут не найден</w:t>
+      </w:r>
+      <w:r>
+        <w:rPr>
+          <w:rFonts w:ascii="Courier New" w:hAnsi="Courier New" w:cs="Courier New"/>
+          <w:i/>
+          <w:sz w:val="22"/>
+        </w:rPr>
+        <w:t>' });</w:t>
       </w:r>
     </w:p>
     <w:p>
@@ -4194,9 +5280,26 @@
       <w:r>
         <w:rPr>
           <w:rFonts w:ascii="Courier New" w:hAnsi="Courier New" w:cs="Courier New"/>
+          <w:i/>
           <w:sz w:val="22"/>
         </w:rPr>
-        <w:t xml:space="preserve">  res.status(404).render('404', { title: 'Ошибка 404' });</w:t>
+        <w:t xml:space="preserve">  res.status(404).render('404', { title: '</w:t>
+      </w:r>
+      <w:r>
+        <w:rPr>
+          <w:rFonts w:ascii="Courier New" w:hAnsi="Courier New" w:cs="Courier New"/>
+          <w:i w:val="0"/>
+          <w:sz w:val="22"/>
+        </w:rPr>
+        <w:t>Ошибка</w:t>
+      </w:r>
+      <w:r>
+        <w:rPr>
+          <w:rFonts w:ascii="Courier New" w:hAnsi="Courier New" w:cs="Courier New"/>
+          <w:i/>
+          <w:sz w:val="22"/>
+        </w:rPr>
+        <w:t xml:space="preserve"> 404' });</w:t>
       </w:r>
     </w:p>
     <w:p>
@@ -4209,6 +5312,7 @@
       <w:r>
         <w:rPr>
           <w:rFonts w:ascii="Courier New" w:hAnsi="Courier New" w:cs="Courier New"/>
+          <w:i/>
           <w:sz w:val="22"/>
         </w:rPr>
         <w:t>};</w:t>
@@ -4224,6 +5328,7 @@
       <w:r>
         <w:rPr>
           <w:rFonts w:ascii="Courier New" w:hAnsi="Courier New" w:cs="Courier New"/>
+          <w:i/>
           <w:sz w:val="22"/>
         </w:rPr>
         <w:t xml:space="preserve"> </w:t>
@@ -4239,9 +5344,58 @@
       <w:r>
         <w:rPr>
           <w:rFonts w:ascii="Courier New" w:hAnsi="Courier New" w:cs="Courier New"/>
+          <w:i/>
           <w:sz w:val="22"/>
         </w:rPr>
-        <w:t>// Четыре параметра - признак error-handling middleware в Express.</w:t>
+        <w:t xml:space="preserve">// </w:t>
+      </w:r>
+      <w:r>
+        <w:rPr>
+          <w:rFonts w:ascii="Courier New" w:hAnsi="Courier New" w:cs="Courier New"/>
+          <w:i w:val="0"/>
+          <w:sz w:val="22"/>
+        </w:rPr>
+        <w:t>Четыре параметра</w:t>
+      </w:r>
+      <w:r>
+        <w:rPr>
+          <w:rFonts w:ascii="Courier New" w:hAnsi="Courier New" w:cs="Courier New"/>
+          <w:i/>
+          <w:sz w:val="22"/>
+        </w:rPr>
+        <w:t xml:space="preserve"> - </w:t>
+      </w:r>
+      <w:r>
+        <w:rPr>
+          <w:rFonts w:ascii="Courier New" w:hAnsi="Courier New" w:cs="Courier New"/>
+          <w:i w:val="0"/>
+          <w:sz w:val="22"/>
+        </w:rPr>
+        <w:t>признак</w:t>
+      </w:r>
+      <w:r>
+        <w:rPr>
+          <w:rFonts w:ascii="Courier New" w:hAnsi="Courier New" w:cs="Courier New"/>
+          <w:i/>
+          <w:sz w:val="22"/>
+        </w:rPr>
+        <w:t xml:space="preserve"> error-handling middleware </w:t>
+      </w:r>
+      <w:r>
+        <w:rPr>
+          <w:rFonts w:ascii="Courier New" w:hAnsi="Courier New" w:cs="Courier New"/>
+          <w:i w:val="0"/>
+          <w:sz w:val="22"/>
+        </w:rPr>
+        <w:t>в</w:t>
+      </w:r>
+      <w:r>
+        <w:rPr>
+          <w:rFonts w:ascii="Courier New" w:hAnsi="Courier New" w:cs="Courier New"/>
+          <w:i/>
+          <w:sz w:val="22"/>
+        </w:rPr>
+        <w:t xml:space="preserve"> Express.</w:t>
       </w:r>
     </w:p>
     <w:p>
@@ -4254,6 +5408,7 @@
       <w:r>
         <w:rPr>
           <w:rFonts w:ascii="Courier New" w:hAnsi="Courier New" w:cs="Courier New"/>
+          <w:i/>
           <w:sz w:val="22"/>
         </w:rPr>
         <w:t>const serverErrorHandler = (err, req, res, next) =&gt; {</w:t>
@@ -4269,6 +5424,7 @@
       <w:r>
         <w:rPr>
           <w:rFonts w:ascii="Courier New" w:hAnsi="Courier New" w:cs="Courier New"/>
+          <w:i/>
           <w:sz w:val="22"/>
         </w:rPr>
         <w:t xml:space="preserve">  console.error(err.stack || err);</w:t>
@@ -4284,6 +5440,7 @@
       <w:r>
         <w:rPr>
           <w:rFonts w:ascii="Courier New" w:hAnsi="Courier New" w:cs="Courier New"/>
+          <w:i/>
           <w:sz w:val="22"/>
         </w:rPr>
         <w:t xml:space="preserve">  if (res.headersSent) return next(err);</w:t>
@@ -4299,6 +5456,7 @@
       <w:r>
         <w:rPr>
           <w:rFonts w:ascii="Courier New" w:hAnsi="Courier New" w:cs="Courier New"/>
+          <w:i/>
           <w:sz w:val="22"/>
         </w:rPr>
         <w:t xml:space="preserve">  if (wantsJson(req)) {</w:t>
@@ -4314,9 +5472,26 @@
       <w:r>
         <w:rPr>
           <w:rFonts w:ascii="Courier New" w:hAnsi="Courier New" w:cs="Courier New"/>
+          <w:i/>
           <w:sz w:val="22"/>
         </w:rPr>
-        <w:t xml:space="preserve">    return res.status(500).json({ error: 'Внутренняя ошибка сервера', message: err.message });</w:t>
+        <w:t xml:space="preserve">    return res.status(500).json({ error: '</w:t>
+      </w:r>
+      <w:r>
+        <w:rPr>
+          <w:rFonts w:ascii="Courier New" w:hAnsi="Courier New" w:cs="Courier New"/>
+          <w:i w:val="0"/>
+          <w:sz w:val="22"/>
+        </w:rPr>
+        <w:t>Внутренняя ошибка сервера</w:t>
+      </w:r>
+      <w:r>
+        <w:rPr>
+          <w:rFonts w:ascii="Courier New" w:hAnsi="Courier New" w:cs="Courier New"/>
+          <w:i/>
+          <w:sz w:val="22"/>
+        </w:rPr>
+        <w:t>', message: err.message });</w:t>
       </w:r>
     </w:p>
     <w:p>
@@ -4329,6 +5504,7 @@
       <w:r>
         <w:rPr>
           <w:rFonts w:ascii="Courier New" w:hAnsi="Courier New" w:cs="Courier New"/>
+          <w:i/>
           <w:sz w:val="22"/>
         </w:rPr>
         <w:t xml:space="preserve">  }</w:t>
@@ -4344,9 +5520,26 @@
       <w:r>
         <w:rPr>
           <w:rFonts w:ascii="Courier New" w:hAnsi="Courier New" w:cs="Courier New"/>
+          <w:i/>
           <w:sz w:val="22"/>
         </w:rPr>
-        <w:t xml:space="preserve">  res.status(500).render('500', { title: 'Ошибка 500' });</w:t>
+        <w:t xml:space="preserve">  res.status(500).render('500', { title: '</w:t>
+      </w:r>
+      <w:r>
+        <w:rPr>
+          <w:rFonts w:ascii="Courier New" w:hAnsi="Courier New" w:cs="Courier New"/>
+          <w:i w:val="0"/>
+          <w:sz w:val="22"/>
+        </w:rPr>
+        <w:t>Ошибка</w:t>
+      </w:r>
+      <w:r>
+        <w:rPr>
+          <w:rFonts w:ascii="Courier New" w:hAnsi="Courier New" w:cs="Courier New"/>
+          <w:i/>
+          <w:sz w:val="22"/>
+        </w:rPr>
+        <w:t xml:space="preserve"> 500' });</w:t>
       </w:r>
     </w:p>
     <w:p>
@@ -4359,6 +5552,7 @@
       <w:r>
         <w:rPr>
           <w:rFonts w:ascii="Courier New" w:hAnsi="Courier New" w:cs="Courier New"/>
+          <w:i/>
           <w:sz w:val="22"/>
         </w:rPr>
         <w:t>};</w:t>
@@ -4374,6 +5568,7 @@
       <w:r>
         <w:rPr>
           <w:rFonts w:ascii="Courier New" w:hAnsi="Courier New" w:cs="Courier New"/>
+          <w:i/>
           <w:sz w:val="22"/>
         </w:rPr>
         <w:t xml:space="preserve"> </w:t>
@@ -4389,6 +5584,7 @@
       <w:r>
         <w:rPr>
           <w:rFonts w:ascii="Courier New" w:hAnsi="Courier New" w:cs="Courier New"/>
+          <w:i/>
           <w:sz w:val="22"/>
         </w:rPr>
         <w:t>module.exports = { notFoundHandler, serverErrorHandler };</w:t>
@@ -4414,25 +5610,7 @@
         <w:t>npm start</w:t>
       </w:r>
       <w:r>
-        <w:t xml:space="preserve">, страницы открыты в браузере. Главная страница с таблицей диаграмм из массива показана на рисунке 1. Имя пользователя в шапке и параметр </w:t>
-      </w:r>
-      <w:r>
-        <w:rPr>
-          <w:i/>
-        </w:rPr>
-        <w:t>?auth=1</w:t>
-      </w:r>
-      <w:r>
-        <w:t xml:space="preserve"> в ссылках подтверждают работу </w:t>
-      </w:r>
-      <w:r>
-        <w:rPr>
-          <w:i/>
-        </w:rPr>
-        <w:t>middleware</w:t>
-      </w:r>
-      <w:r>
-        <w:t xml:space="preserve"> авторизации.</w:t>
+        <w:t>, страницы открыты в браузере. Главная страница с таблицей диаграмм из массива показана на рисунке 1.</w:t>
       </w:r>
     </w:p>
     <w:p>
@@ -4488,6 +5666,48 @@
     <w:p>
       <w:pPr/>
       <w:r>
+        <w:t xml:space="preserve">На рисунке 1 видны два начальных элемента массива, а имя пользователя в шапке и параметр </w:t>
+      </w:r>
+      <w:r>
+        <w:rPr>
+          <w:i/>
+        </w:rPr>
+        <w:t>?auth=1</w:t>
+      </w:r>
+      <w:r>
+        <w:t xml:space="preserve"> в ссылках подтверждают работу </w:t>
+      </w:r>
+      <w:r>
+        <w:rPr>
+          <w:i/>
+        </w:rPr>
+        <w:t>middleware</w:t>
+      </w:r>
+      <w:r>
+        <w:t xml:space="preserve"> авторизации. Цикл </w:t>
+      </w:r>
+      <w:r>
+        <w:rPr>
+          <w:i/>
+        </w:rPr>
+        <w:t>forEach</w:t>
+      </w:r>
+      <w:r>
+        <w:t xml:space="preserve"> в шаблоне </w:t>
+      </w:r>
+      <w:r>
+        <w:rPr>
+          <w:i/>
+        </w:rPr>
+        <w:t>index.ejs</w:t>
+      </w:r>
+      <w:r>
+        <w:t xml:space="preserve"> вывел каждый элемент отдельной строкой таблицы.</w:t>
+      </w:r>
+    </w:p>
+    <w:p>
+      <w:pPr/>
+      <w:r>
         <w:t xml:space="preserve">Страница на рисунке 2 открывается по адресу </w:t>
       </w:r>
       <w:r>
@@ -4497,16 +5717,7 @@
         <w:t>/item/1</w:t>
       </w:r>
       <w:r>
-        <w:t xml:space="preserve"> и выводит поля выбранного элемента, а </w:t>
-      </w:r>
-      <w:r>
-        <w:rPr>
-          <w:i/>
-        </w:rPr>
-        <w:t>DSL</w:t>
-      </w:r>
-      <w:r>
-        <w:t>-код отображается в экранированном виде.</w:t>
+        <w:t xml:space="preserve"> и выводит поля выбранного элемента.</w:t>
       </w:r>
     </w:p>
     <w:p>
@@ -4562,7 +5773,40 @@
     <w:p>
       <w:pPr/>
       <w:r>
-        <w:t>Форма добавления (рисунок 3) доступна только после авторизации. Рисунок 4 показывает заполненную форму, а рисунок 5 – главную страницу после перенаправления: новая диаграмма появилась в списке.</w:t>
+        <w:t xml:space="preserve">Маршрут </w:t>
+      </w:r>
+      <w:r>
+        <w:rPr>
+          <w:i/>
+        </w:rPr>
+        <w:t>/item/:id</w:t>
+      </w:r>
+      <w:r>
+        <w:t xml:space="preserve"> нашел элемент по идентификатору и передал его в шаблон </w:t>
+      </w:r>
+      <w:r>
+        <w:rPr>
+          <w:i/>
+        </w:rPr>
+        <w:t>item.ejs</w:t>
+      </w:r>
+      <w:r>
+        <w:t xml:space="preserve">. </w:t>
+      </w:r>
+      <w:r>
+        <w:rPr>
+          <w:i/>
+        </w:rPr>
+        <w:t>DSL</w:t>
+      </w:r>
+      <w:r>
+        <w:t>-код отображается в экранированном виде, поэтому разметка внутри кода не может выполниться в браузере.</w:t>
+      </w:r>
+    </w:p>
+    <w:p>
+      <w:pPr/>
+      <w:r>
+        <w:t>Форма добавления доступна только после авторизации и показана на рисунке 3.</w:t>
       </w:r>
     </w:p>
     <w:p>
@@ -4616,6 +5860,36 @@
       </w:r>
     </w:p>
     <w:p>
+      <w:pPr/>
+      <w:r>
+        <w:t xml:space="preserve">Форма содержит поля названия, типа и </w:t>
+      </w:r>
+      <w:r>
+        <w:rPr>
+          <w:i/>
+        </w:rPr>
+        <w:t>DSL</w:t>
+      </w:r>
+      <w:r>
+        <w:t xml:space="preserve">-кода. Адрес отправки </w:t>
+      </w:r>
+      <w:r>
+        <w:rPr>
+          <w:i/>
+        </w:rPr>
+        <w:t>/add?auth=1</w:t>
+      </w:r>
+      <w:r>
+        <w:t xml:space="preserve"> сохраняет признак авторизации, поэтому после отправки пользователь остается в системе.</w:t>
+      </w:r>
+    </w:p>
+    <w:p>
+      <w:pPr/>
+      <w:r>
+        <w:t>Заполненная форма с данными новой диаграммы приведена на рисунке 4.</w:t>
+      </w:r>
+    </w:p>
+    <w:p>
       <w:pPr>
         <w:keepNext/>
         <w:spacing w:before="0" w:after="0" w:lineRule="auto" w:line="240"/>
@@ -4666,6 +5940,45 @@
       </w:r>
     </w:p>
     <w:p>
+      <w:pPr/>
+      <w:r>
+        <w:t xml:space="preserve">Введены название «Диаграмма состояний заказа», тип </w:t>
+      </w:r>
+      <w:r>
+        <w:rPr>
+          <w:i/>
+        </w:rPr>
+        <w:t>state</w:t>
+      </w:r>
+      <w:r>
+        <w:t xml:space="preserve"> и </w:t>
+      </w:r>
+      <w:r>
+        <w:rPr>
+          <w:i/>
+        </w:rPr>
+        <w:t>DSL</w:t>
+      </w:r>
+      <w:r>
+        <w:t xml:space="preserve">-код. После нажатия кнопки данные уходят методом </w:t>
+      </w:r>
+      <w:r>
+        <w:rPr>
+          <w:i/>
+        </w:rPr>
+        <w:t>POST</w:t>
+      </w:r>
+      <w:r>
+        <w:t xml:space="preserve"> на сервер, где проходят проверку.</w:t>
+      </w:r>
+    </w:p>
+    <w:p>
+      <w:pPr/>
+      <w:r>
+        <w:t>Результат отправки показан на рисунке 5: сервер выполнил перенаправление на главную страницу.</w:t>
+      </w:r>
+    </w:p>
+    <w:p>
       <w:pPr>
         <w:keepNext/>
         <w:spacing w:before="0" w:after="0" w:lineRule="auto" w:line="240"/>
@@ -4718,34 +6031,22 @@
     <w:p>
       <w:pPr/>
       <w:r>
-        <w:t xml:space="preserve">При отправке пустой формы сервер отвечает кодом 400 и показывает список ошибок (рисунок 6). Гость, открывший </w:t>
-      </w:r>
-      <w:r>
-        <w:rPr>
-          <w:i/>
-        </w:rPr>
-        <w:t>/add</w:t>
-      </w:r>
-      <w:r>
-        <w:t xml:space="preserve"> без параметра </w:t>
-      </w:r>
-      <w:r>
-        <w:rPr>
-          <w:i/>
-        </w:rPr>
-        <w:t>auth</w:t>
-      </w:r>
-      <w:r>
-        <w:t xml:space="preserve">, попадает на страницу </w:t>
-      </w:r>
-      <w:r>
-        <w:rPr>
-          <w:i/>
-        </w:rPr>
-        <w:t>/login</w:t>
-      </w:r>
-      <w:r>
-        <w:t xml:space="preserve"> (рисунок 7).</w:t>
+        <w:t xml:space="preserve">Новая диаграмма появилась в списке третьей строкой. Это подтверждает, что </w:t>
+      </w:r>
+      <w:r>
+        <w:rPr>
+          <w:i/>
+        </w:rPr>
+        <w:t>POST /add</w:t>
+      </w:r>
+      <w:r>
+        <w:t xml:space="preserve"> добавил элемент в массив, а перенаправление исключает повторную отправку формы при обновлении страницы.</w:t>
+      </w:r>
+    </w:p>
+    <w:p>
+      <w:pPr/>
+      <w:r>
+        <w:t>При отправке пустой формы сервер отвечает кодом 400 и показывает список ошибок (рисунок 6).</w:t>
       </w:r>
     </w:p>
     <w:p>
@@ -4799,6 +6100,54 @@
       </w:r>
     </w:p>
     <w:p>
+      <w:pPr/>
+      <w:r>
+        <w:t xml:space="preserve">Проверка выполняется на стороне сервера: пустые поля названия и </w:t>
+      </w:r>
+      <w:r>
+        <w:rPr>
+          <w:i/>
+        </w:rPr>
+        <w:t>DSL</w:t>
+      </w:r>
+      <w:r>
+        <w:t>-кода отклонены, а введенные значения сохранены в форме. Массив данных при этом не изменился.</w:t>
+      </w:r>
+    </w:p>
+    <w:p>
+      <w:pPr/>
+      <w:r>
+        <w:t xml:space="preserve">Гость, открывший </w:t>
+      </w:r>
+      <w:r>
+        <w:rPr>
+          <w:i/>
+        </w:rPr>
+        <w:t>/add</w:t>
+      </w:r>
+      <w:r>
+        <w:t xml:space="preserve"> без параметра </w:t>
+      </w:r>
+      <w:r>
+        <w:rPr>
+          <w:i/>
+        </w:rPr>
+        <w:t>auth</w:t>
+      </w:r>
+      <w:r>
+        <w:t xml:space="preserve">, попадает на страницу </w:t>
+      </w:r>
+      <w:r>
+        <w:rPr>
+          <w:i/>
+        </w:rPr>
+        <w:t>/login</w:t>
+      </w:r>
+      <w:r>
+        <w:t xml:space="preserve"> (рисунок 7).</w:t>
+      </w:r>
+    </w:p>
+    <w:p>
       <w:pPr>
         <w:keepNext/>
         <w:spacing w:before="0" w:after="0" w:lineRule="auto" w:line="240"/>
@@ -4851,43 +6200,37 @@
     <w:p>
       <w:pPr/>
       <w:r>
-        <w:t xml:space="preserve">Несуществующий адрес приводит к странице 404 (рисунок 8), а намеренно вызванное исключение – к странице 500 (рисунок 9). Журнал запросов, сохраненный логирующим </w:t>
-      </w:r>
-      <w:r>
-        <w:rPr>
-          <w:i/>
-        </w:rPr>
-        <w:t>middleware</w:t>
-      </w:r>
-      <w:r>
-        <w:t>, показан таблицей на странице /</w:t>
-      </w:r>
-      <w:r>
-        <w:rPr>
-          <w:i/>
-        </w:rPr>
-        <w:t>logs</w:t>
-      </w:r>
-      <w:r>
-        <w:t xml:space="preserve"> (рисунок 10): в ней видны время, событие, метод, </w:t>
-      </w:r>
-      <w:r>
-        <w:rPr>
-          <w:i/>
-        </w:rPr>
-        <w:t>URL</w:t>
-      </w:r>
-      <w:r>
-        <w:t xml:space="preserve">, статус, длительность, пользователь и </w:t>
-      </w:r>
-      <w:r>
-        <w:rPr>
-          <w:i/>
-        </w:rPr>
-        <w:t>IP</w:t>
-      </w:r>
-      <w:r>
-        <w:t>.</w:t>
+        <w:rPr>
+          <w:i/>
+        </w:rPr>
+        <w:t>Middleware</w:t>
+      </w:r>
+      <w:r>
+        <w:t xml:space="preserve"> </w:t>
+      </w:r>
+      <w:r>
+        <w:rPr>
+          <w:i/>
+        </w:rPr>
+        <w:t>requireAuth</w:t>
+      </w:r>
+      <w:r>
+        <w:t xml:space="preserve"> остановил запрос и выполнил перенаправление. Страница предлагает войти как администратор через </w:t>
+      </w:r>
+      <w:r>
+        <w:rPr>
+          <w:i/>
+        </w:rPr>
+        <w:t>?auth=1</w:t>
+      </w:r>
+      <w:r>
+        <w:t xml:space="preserve"> или продолжить как гость.</w:t>
+      </w:r>
+    </w:p>
+    <w:p>
+      <w:pPr/>
+      <w:r>
+        <w:t>Несуществующий адрес приводит к странице 404 (рисунок 8).</w:t>
       </w:r>
     </w:p>
     <w:p>
@@ -4941,6 +6284,45 @@
       </w:r>
     </w:p>
     <w:p>
+      <w:pPr/>
+      <w:r>
+        <w:t xml:space="preserve">Обработчик </w:t>
+      </w:r>
+      <w:r>
+        <w:rPr>
+          <w:i/>
+        </w:rPr>
+        <w:t>notFoundHandler</w:t>
+      </w:r>
+      <w:r>
+        <w:t xml:space="preserve"> сработал, потому что ни один маршрут не ответил на запрос, и отобразил отдельный шаблон </w:t>
+      </w:r>
+      <w:r>
+        <w:rPr>
+          <w:i/>
+        </w:rPr>
+        <w:t>404.ejs</w:t>
+      </w:r>
+      <w:r>
+        <w:t xml:space="preserve"> с ссылкой на главную страницу.</w:t>
+      </w:r>
+    </w:p>
+    <w:p>
+      <w:pPr/>
+      <w:r>
+        <w:t xml:space="preserve">Намеренно вызванное исключение на маршруте </w:t>
+      </w:r>
+      <w:r>
+        <w:rPr>
+          <w:i/>
+        </w:rPr>
+        <w:t>/debug/error</w:t>
+      </w:r>
+      <w:r>
+        <w:t xml:space="preserve"> приводит к странице 500 (рисунок 9).</w:t>
+      </w:r>
+    </w:p>
+    <w:p>
       <w:pPr>
         <w:keepNext/>
         <w:spacing w:before="0" w:after="0" w:lineRule="auto" w:line="240"/>
@@ -4991,6 +6373,54 @@
       </w:r>
     </w:p>
     <w:p>
+      <w:pPr/>
+      <w:r>
+        <w:t xml:space="preserve">Обработчик ошибок </w:t>
+      </w:r>
+      <w:r>
+        <w:rPr>
+          <w:i/>
+        </w:rPr>
+        <w:t>serverErrorHandler</w:t>
+      </w:r>
+      <w:r>
+        <w:t xml:space="preserve"> записал стек в консоль и показал пользователю безопасную страницу </w:t>
+      </w:r>
+      <w:r>
+        <w:rPr>
+          <w:i/>
+        </w:rPr>
+        <w:t>500.ejs</w:t>
+      </w:r>
+      <w:r>
+        <w:t xml:space="preserve"> без технических подробностей.</w:t>
+      </w:r>
+    </w:p>
+    <w:p>
+      <w:pPr/>
+      <w:r>
+        <w:t xml:space="preserve">Журнал запросов, сохраненный логирующим </w:t>
+      </w:r>
+      <w:r>
+        <w:rPr>
+          <w:i/>
+        </w:rPr>
+        <w:t>middleware</w:t>
+      </w:r>
+      <w:r>
+        <w:t xml:space="preserve">, показан таблицей на странице </w:t>
+      </w:r>
+      <w:r>
+        <w:rPr>
+          <w:i/>
+        </w:rPr>
+        <w:t>/logs</w:t>
+      </w:r>
+      <w:r>
+        <w:t xml:space="preserve"> (рисунок 10).</w:t>
+      </w:r>
+    </w:p>
+    <w:p>
       <w:pPr>
         <w:keepNext/>
         <w:spacing w:before="0" w:after="0" w:lineRule="auto" w:line="240"/>
@@ -5037,13 +6467,13 @@
         <w:pStyle w:val="Caption"/>
       </w:pPr>
       <w:r>
-        <w:t>Рисунок 10 – Журнал запросов в виде таблицы (страница /</w:t>
-      </w:r>
-      <w:r>
-        <w:rPr>
-          <w:i/>
-        </w:rPr>
-        <w:t>logs</w:t>
+        <w:t xml:space="preserve">Рисунок 10 – Журнал запросов в виде таблицы (страница </w:t>
+      </w:r>
+      <w:r>
+        <w:rPr>
+          <w:i/>
+        </w:rPr>
+        <w:t>/logs</w:t>
       </w:r>
       <w:r>
         <w:t>)</w:t>
@@ -5052,7 +6482,31 @@
     <w:p>
       <w:pPr/>
       <w:r>
-        <w:t xml:space="preserve">Таблицу можно отфильтровать по методу и типу события (рисунок 11): на рисунке оставлены только запросы </w:t>
+        <w:t xml:space="preserve">В таблице видны время, событие, метод, </w:t>
+      </w:r>
+      <w:r>
+        <w:rPr>
+          <w:i/>
+        </w:rPr>
+        <w:t>URL</w:t>
+      </w:r>
+      <w:r>
+        <w:t xml:space="preserve">, статус, длительность, пользователь и </w:t>
+      </w:r>
+      <w:r>
+        <w:rPr>
+          <w:i/>
+        </w:rPr>
+        <w:t>IP</w:t>
+      </w:r>
+      <w:r>
+        <w:t>-адрес. Запросы разных видов отличаются типом события: успешный запрос, перенаправление, ошибка клиента и ошибка сервера. Новые записи расположены сверху.</w:t>
+      </w:r>
+    </w:p>
+    <w:p>
+      <w:pPr/>
+      <w:r>
+        <w:t xml:space="preserve">Таблицу можно отфильтровать по методу и типу события; на рисунке 11 оставлены только запросы </w:t>
       </w:r>
       <w:r>
         <w:rPr>
@@ -5061,7 +6515,7 @@
         <w:t>POST</w:t>
       </w:r>
       <w:r>
-        <w:t>. Те же строки выводятся в консоль сервера (рисунок 12), что удобно при отладке.</w:t>
+        <w:t>.</w:t>
       </w:r>
     </w:p>
     <w:p>
@@ -5121,6 +6575,18 @@
       </w:r>
     </w:p>
     <w:p>
+      <w:pPr/>
+      <w:r>
+        <w:t>Фильтр передается параметрами строки запроса, а сервер проверяет их по списку допустимых значений, поэтому произвольный ввод игнорируется.</w:t>
+      </w:r>
+    </w:p>
+    <w:p>
+      <w:pPr/>
+      <w:r>
+        <w:t>Те же записи выводятся в консоль сервера (рисунок 12), что удобно при отладке.</w:t>
+      </w:r>
+    </w:p>
+    <w:p>
       <w:pPr>
         <w:keepNext/>
         <w:spacing w:before="0" w:after="0" w:lineRule="auto" w:line="240"/>
@@ -5168,6 +6634,39 @@
       </w:pPr>
       <w:r>
         <w:t>Рисунок 12 – Журнал запросов в консоли сервера</w:t>
+      </w:r>
+    </w:p>
+    <w:p>
+      <w:pPr/>
+      <w:r>
+        <w:t xml:space="preserve">Каждая строка содержит время, метод, </w:t>
+      </w:r>
+      <w:r>
+        <w:rPr>
+          <w:i/>
+        </w:rPr>
+        <w:t>URL</w:t>
+      </w:r>
+      <w:r>
+        <w:t>, код ответа и длительность обработки в миллисекундах. Сообщение «</w:t>
+      </w:r>
+      <w:r>
+        <w:rPr>
+          <w:i/>
+        </w:rPr>
+        <w:t>Error</w:t>
+      </w:r>
+      <w:r>
+        <w:t xml:space="preserve">» перед последней строкой появилось при обращении к </w:t>
+      </w:r>
+      <w:r>
+        <w:rPr>
+          <w:i/>
+        </w:rPr>
+        <w:t>/debug/error</w:t>
+      </w:r>
+      <w:r>
+        <w:t xml:space="preserve"> и подтверждает, что ошибка сервера записывается в журнал.</w:t>
       </w:r>
     </w:p>
     <w:p>
@@ -5388,7 +6887,7 @@
                 <w:b w:val="0"/>
                 <w:sz w:val="24"/>
               </w:rPr>
-              <w:t xml:space="preserve"> /</w:t>
+              <w:t xml:space="preserve"> </w:t>
             </w:r>
             <w:r>
               <w:rPr>
@@ -5396,7 +6895,7 @@
                 <w:i/>
                 <w:sz w:val="24"/>
               </w:rPr>
-              <w:t>api/diagrams</w:t>
+              <w:t>/api/diagrams</w:t>
             </w:r>
             <w:r>
               <w:rPr>
@@ -5510,7 +7009,7 @@
                 <w:b w:val="0"/>
                 <w:sz w:val="24"/>
               </w:rPr>
-              <w:t>-страницы, авторизация, форма, журнал /</w:t>
+              <w:t xml:space="preserve">-страницы, авторизация, форма, журнал </w:t>
             </w:r>
             <w:r>
               <w:rPr>
@@ -5518,7 +7017,7 @@
                 <w:i/>
                 <w:sz w:val="24"/>
               </w:rPr>
-              <w:t>logs</w:t>
+              <w:t>/logs</w:t>
             </w:r>
             <w:r>
               <w:rPr>
@@ -6658,7 +8157,7 @@
         <w:rPr>
           <w:i/>
         </w:rPr>
-        <w:t>&lt;% if (items.length) { %&gt; &lt;ul&gt; &lt;% items.forEach(function (i) { %&gt; &lt;li&gt;&lt;%= i.title %&gt;&lt;/li&gt; &lt;% }); %&gt; &lt;/ul&gt; &lt;% } else { %&gt; Список пуст &lt;% } %&gt;</w:t>
+        <w:t>&lt;% if (items.length) { %&gt; &lt;ul&gt; &lt;% items.forEach(function (i) { %&gt; &lt;li&gt;&lt;%= i.title %&gt;&lt;/li&gt; &lt;% }); %&gt; &lt;/ul&gt; &lt;% } else { %&gt; empty &lt;% } %&gt;</w:t>
       </w:r>
       <w:r>
         <w:t>.</w:t>

</xml_diff>

<commit_message>
docs: report - answer control questions 25-27 only, blank-line spacing between elements
Co-Authored-By: Claude Sonnet 5.5 <noreply@anthropic.com>
</commit_message>
<xml_diff>
--- a/docs/Отчет_ПЗ1.docx
+++ b/docs/Отчет_ПЗ1.docx
@@ -602,7 +602,7 @@
     <w:p>
       <w:pPr>
         <w:keepNext/>
-        <w:spacing w:before="0" w:after="0" w:lineRule="exact" w:line="360"/>
+        <w:spacing w:before="360" w:after="0" w:lineRule="exact" w:line="360"/>
         <w:ind w:firstLine="0"/>
         <w:jc w:val="left"/>
       </w:pPr>
@@ -1264,7 +1264,7 @@
     <w:p>
       <w:pPr>
         <w:keepLines/>
-        <w:spacing w:before="0" w:after="0" w:lineRule="exact" w:line="280"/>
+        <w:spacing w:before="0" w:after="360" w:lineRule="exact" w:line="280"/>
         <w:ind w:firstLine="0"/>
         <w:jc w:val="left"/>
       </w:pPr>
@@ -1417,7 +1417,7 @@
     <w:p>
       <w:pPr>
         <w:keepNext/>
-        <w:spacing w:before="0" w:after="0" w:lineRule="exact" w:line="360"/>
+        <w:spacing w:before="360" w:after="0" w:lineRule="exact" w:line="360"/>
         <w:ind w:firstLine="0"/>
         <w:jc w:val="left"/>
       </w:pPr>
@@ -1901,7 +1901,7 @@
     <w:p>
       <w:pPr>
         <w:keepLines/>
-        <w:spacing w:before="0" w:after="0" w:lineRule="exact" w:line="280"/>
+        <w:spacing w:before="0" w:after="360" w:lineRule="exact" w:line="280"/>
         <w:ind w:firstLine="0"/>
         <w:jc w:val="left"/>
       </w:pPr>
@@ -1917,7 +1917,7 @@
     <w:p>
       <w:pPr>
         <w:keepNext/>
-        <w:spacing w:before="0" w:after="0" w:lineRule="exact" w:line="360"/>
+        <w:spacing w:before="360" w:after="0" w:lineRule="exact" w:line="360"/>
         <w:ind w:firstLine="0"/>
         <w:jc w:val="left"/>
       </w:pPr>
@@ -2337,7 +2337,7 @@
     <w:p>
       <w:pPr>
         <w:keepLines/>
-        <w:spacing w:before="0" w:after="0" w:lineRule="exact" w:line="280"/>
+        <w:spacing w:before="0" w:after="360" w:lineRule="exact" w:line="280"/>
         <w:ind w:firstLine="0"/>
         <w:jc w:val="left"/>
       </w:pPr>
@@ -2499,7 +2499,7 @@
     <w:p>
       <w:pPr>
         <w:keepNext/>
-        <w:spacing w:before="0" w:after="0" w:lineRule="exact" w:line="360"/>
+        <w:spacing w:before="360" w:after="0" w:lineRule="exact" w:line="360"/>
         <w:ind w:firstLine="0"/>
         <w:jc w:val="left"/>
       </w:pPr>
@@ -3120,7 +3120,7 @@
     <w:p>
       <w:pPr>
         <w:keepLines/>
-        <w:spacing w:before="0" w:after="0" w:lineRule="exact" w:line="280"/>
+        <w:spacing w:before="0" w:after="360" w:lineRule="exact" w:line="280"/>
         <w:ind w:firstLine="0"/>
         <w:jc w:val="left"/>
       </w:pPr>
@@ -3136,7 +3136,7 @@
     <w:p>
       <w:pPr>
         <w:keepNext/>
-        <w:spacing w:before="0" w:after="0" w:lineRule="exact" w:line="360"/>
+        <w:spacing w:before="360" w:after="0" w:lineRule="exact" w:line="360"/>
         <w:ind w:firstLine="0"/>
         <w:jc w:val="left"/>
       </w:pPr>
@@ -3988,7 +3988,7 @@
     <w:p>
       <w:pPr>
         <w:keepLines/>
-        <w:spacing w:before="0" w:after="0" w:lineRule="exact" w:line="280"/>
+        <w:spacing w:before="0" w:after="360" w:lineRule="exact" w:line="280"/>
         <w:ind w:firstLine="0"/>
         <w:jc w:val="left"/>
       </w:pPr>
@@ -4004,7 +4004,7 @@
     <w:p>
       <w:pPr>
         <w:keepNext/>
-        <w:spacing w:before="0" w:after="0" w:lineRule="exact" w:line="360"/>
+        <w:spacing w:before="360" w:after="0" w:lineRule="exact" w:line="360"/>
         <w:ind w:firstLine="0"/>
         <w:jc w:val="left"/>
       </w:pPr>
@@ -4529,7 +4529,7 @@
     <w:p>
       <w:pPr>
         <w:keepLines/>
-        <w:spacing w:before="0" w:after="0" w:lineRule="exact" w:line="280"/>
+        <w:spacing w:before="0" w:after="360" w:lineRule="exact" w:line="280"/>
         <w:ind w:firstLine="0"/>
         <w:jc w:val="left"/>
       </w:pPr>
@@ -4640,7 +4640,7 @@
     <w:p>
       <w:pPr>
         <w:keepNext/>
-        <w:spacing w:before="0" w:after="0" w:lineRule="exact" w:line="360"/>
+        <w:spacing w:before="360" w:after="0" w:lineRule="exact" w:line="360"/>
         <w:ind w:firstLine="0"/>
         <w:jc w:val="left"/>
       </w:pPr>
@@ -4964,7 +4964,7 @@
     <w:p>
       <w:pPr>
         <w:keepLines/>
-        <w:spacing w:before="0" w:after="0" w:lineRule="exact" w:line="280"/>
+        <w:spacing w:before="0" w:after="360" w:lineRule="exact" w:line="280"/>
         <w:ind w:firstLine="0"/>
         <w:jc w:val="left"/>
       </w:pPr>
@@ -5093,7 +5093,7 @@
     <w:p>
       <w:pPr>
         <w:keepNext/>
-        <w:spacing w:before="0" w:after="0" w:lineRule="exact" w:line="360"/>
+        <w:spacing w:before="360" w:after="0" w:lineRule="exact" w:line="360"/>
         <w:ind w:firstLine="0"/>
         <w:jc w:val="left"/>
       </w:pPr>
@@ -5577,7 +5577,7 @@
     <w:p>
       <w:pPr>
         <w:keepLines/>
-        <w:spacing w:before="0" w:after="0" w:lineRule="exact" w:line="280"/>
+        <w:spacing w:before="0" w:after="360" w:lineRule="exact" w:line="280"/>
         <w:ind w:firstLine="0"/>
         <w:jc w:val="left"/>
       </w:pPr>
@@ -5616,7 +5616,7 @@
     <w:p>
       <w:pPr>
         <w:keepNext/>
-        <w:spacing w:before="0" w:after="0" w:lineRule="auto" w:line="240"/>
+        <w:spacing w:before="360" w:after="0" w:lineRule="auto" w:line="240"/>
         <w:ind w:firstLine="0"/>
         <w:jc w:val="center"/>
       </w:pPr>
@@ -5658,6 +5658,7 @@
     <w:p>
       <w:pPr>
         <w:pStyle w:val="Caption"/>
+        <w:spacing w:after="360"/>
       </w:pPr>
       <w:r>
         <w:t>Рисунок 1 – Главная страница со списком диаграмм</w:t>
@@ -5723,7 +5724,7 @@
     <w:p>
       <w:pPr>
         <w:keepNext/>
-        <w:spacing w:before="0" w:after="0" w:lineRule="auto" w:line="240"/>
+        <w:spacing w:before="360" w:after="0" w:lineRule="auto" w:line="240"/>
         <w:ind w:firstLine="0"/>
         <w:jc w:val="center"/>
       </w:pPr>
@@ -5765,6 +5766,7 @@
     <w:p>
       <w:pPr>
         <w:pStyle w:val="Caption"/>
+        <w:spacing w:after="360"/>
       </w:pPr>
       <w:r>
         <w:t>Рисунок 2 – Детальная страница диаграммы</w:t>
@@ -5812,7 +5814,7 @@
     <w:p>
       <w:pPr>
         <w:keepNext/>
-        <w:spacing w:before="0" w:after="0" w:lineRule="auto" w:line="240"/>
+        <w:spacing w:before="360" w:after="0" w:lineRule="auto" w:line="240"/>
         <w:ind w:firstLine="0"/>
         <w:jc w:val="center"/>
       </w:pPr>
@@ -5854,6 +5856,7 @@
     <w:p>
       <w:pPr>
         <w:pStyle w:val="Caption"/>
+        <w:spacing w:after="360"/>
       </w:pPr>
       <w:r>
         <w:t>Рисунок 3 – Форма добавления диаграммы</w:t>
@@ -5892,7 +5895,7 @@
     <w:p>
       <w:pPr>
         <w:keepNext/>
-        <w:spacing w:before="0" w:after="0" w:lineRule="auto" w:line="240"/>
+        <w:spacing w:before="360" w:after="0" w:lineRule="auto" w:line="240"/>
         <w:ind w:firstLine="0"/>
         <w:jc w:val="center"/>
       </w:pPr>
@@ -5934,6 +5937,7 @@
     <w:p>
       <w:pPr>
         <w:pStyle w:val="Caption"/>
+        <w:spacing w:after="360"/>
       </w:pPr>
       <w:r>
         <w:t>Рисунок 4 – Заполненная форма</w:t>
@@ -5981,7 +5985,7 @@
     <w:p>
       <w:pPr>
         <w:keepNext/>
-        <w:spacing w:before="0" w:after="0" w:lineRule="auto" w:line="240"/>
+        <w:spacing w:before="360" w:after="0" w:lineRule="auto" w:line="240"/>
         <w:ind w:firstLine="0"/>
         <w:jc w:val="center"/>
       </w:pPr>
@@ -6023,6 +6027,7 @@
     <w:p>
       <w:pPr>
         <w:pStyle w:val="Caption"/>
+        <w:spacing w:after="360"/>
       </w:pPr>
       <w:r>
         <w:t>Рисунок 5 – Список после добавления элемента</w:t>
@@ -6052,7 +6057,7 @@
     <w:p>
       <w:pPr>
         <w:keepNext/>
-        <w:spacing w:before="0" w:after="0" w:lineRule="auto" w:line="240"/>
+        <w:spacing w:before="360" w:after="0" w:lineRule="auto" w:line="240"/>
         <w:ind w:firstLine="0"/>
         <w:jc w:val="center"/>
       </w:pPr>
@@ -6094,6 +6099,7 @@
     <w:p>
       <w:pPr>
         <w:pStyle w:val="Caption"/>
+        <w:spacing w:after="360"/>
       </w:pPr>
       <w:r>
         <w:t>Рисунок 6 – Сообщения валидации формы</w:t>
@@ -6150,7 +6156,7 @@
     <w:p>
       <w:pPr>
         <w:keepNext/>
-        <w:spacing w:before="0" w:after="0" w:lineRule="auto" w:line="240"/>
+        <w:spacing w:before="360" w:after="0" w:lineRule="auto" w:line="240"/>
         <w:ind w:firstLine="0"/>
         <w:jc w:val="center"/>
       </w:pPr>
@@ -6192,6 +6198,7 @@
     <w:p>
       <w:pPr>
         <w:pStyle w:val="Caption"/>
+        <w:spacing w:after="360"/>
       </w:pPr>
       <w:r>
         <w:t>Рисунок 7 – Перенаправление гостя на страницу авторизации</w:t>
@@ -6236,7 +6243,7 @@
     <w:p>
       <w:pPr>
         <w:keepNext/>
-        <w:spacing w:before="0" w:after="0" w:lineRule="auto" w:line="240"/>
+        <w:spacing w:before="360" w:after="0" w:lineRule="auto" w:line="240"/>
         <w:ind w:firstLine="0"/>
         <w:jc w:val="center"/>
       </w:pPr>
@@ -6278,6 +6285,7 @@
     <w:p>
       <w:pPr>
         <w:pStyle w:val="Caption"/>
+        <w:spacing w:after="360"/>
       </w:pPr>
       <w:r>
         <w:t>Рисунок 8 – Страница ошибки 404</w:t>
@@ -6325,7 +6333,7 @@
     <w:p>
       <w:pPr>
         <w:keepNext/>
-        <w:spacing w:before="0" w:after="0" w:lineRule="auto" w:line="240"/>
+        <w:spacing w:before="360" w:after="0" w:lineRule="auto" w:line="240"/>
         <w:ind w:firstLine="0"/>
         <w:jc w:val="center"/>
       </w:pPr>
@@ -6367,6 +6375,7 @@
     <w:p>
       <w:pPr>
         <w:pStyle w:val="Caption"/>
+        <w:spacing w:after="360"/>
       </w:pPr>
       <w:r>
         <w:t>Рисунок 9 – Страница ошибки 500</w:t>
@@ -6423,7 +6432,7 @@
     <w:p>
       <w:pPr>
         <w:keepNext/>
-        <w:spacing w:before="0" w:after="0" w:lineRule="auto" w:line="240"/>
+        <w:spacing w:before="360" w:after="0" w:lineRule="auto" w:line="240"/>
         <w:ind w:firstLine="0"/>
         <w:jc w:val="center"/>
       </w:pPr>
@@ -6465,6 +6474,7 @@
     <w:p>
       <w:pPr>
         <w:pStyle w:val="Caption"/>
+        <w:spacing w:after="360"/>
       </w:pPr>
       <w:r>
         <w:t xml:space="preserve">Рисунок 10 – Журнал запросов в виде таблицы (страница </w:t>
@@ -6521,7 +6531,7 @@
     <w:p>
       <w:pPr>
         <w:keepNext/>
-        <w:spacing w:before="0" w:after="0" w:lineRule="auto" w:line="240"/>
+        <w:spacing w:before="360" w:after="0" w:lineRule="auto" w:line="240"/>
         <w:ind w:firstLine="0"/>
         <w:jc w:val="center"/>
       </w:pPr>
@@ -6563,6 +6573,7 @@
     <w:p>
       <w:pPr>
         <w:pStyle w:val="Caption"/>
+        <w:spacing w:after="360"/>
       </w:pPr>
       <w:r>
         <w:t xml:space="preserve">Рисунок 11 – Журнал с фильтром по методу </w:t>
@@ -6589,7 +6600,7 @@
     <w:p>
       <w:pPr>
         <w:keepNext/>
-        <w:spacing w:before="0" w:after="0" w:lineRule="auto" w:line="240"/>
+        <w:spacing w:before="360" w:after="0" w:lineRule="auto" w:line="240"/>
         <w:ind w:firstLine="0"/>
         <w:jc w:val="center"/>
       </w:pPr>
@@ -6631,6 +6642,7 @@
     <w:p>
       <w:pPr>
         <w:pStyle w:val="Caption"/>
+        <w:spacing w:after="360"/>
       </w:pPr>
       <w:r>
         <w:t>Рисунок 12 – Журнал запросов в консоли сервера</w:t>
@@ -6731,7 +6743,7 @@
     <w:p>
       <w:pPr>
         <w:keepNext/>
-        <w:spacing w:before="0" w:after="0" w:lineRule="exact" w:line="360"/>
+        <w:spacing w:before="360" w:after="0" w:lineRule="exact" w:line="360"/>
         <w:ind w:firstLine="0"/>
         <w:jc w:val="left"/>
       </w:pPr>
@@ -7598,7 +7610,9 @@
       </w:tr>
     </w:tbl>
     <w:p>
-      <w:pPr/>
+      <w:pPr>
+        <w:spacing w:before="360"/>
+      </w:pPr>
       <w:r>
         <w:t xml:space="preserve">Покрытие серверного кода, измеренное командой </w:t>
       </w:r>
@@ -7676,81 +7690,75 @@
         <w:rPr>
           <w:b/>
         </w:rPr>
-        <w:t xml:space="preserve">1. Что такое </w:t>
+        <w:t xml:space="preserve">25. Как реализовать защиту от </w:t>
       </w:r>
       <w:r>
         <w:rPr>
           <w:b/>
           <w:i/>
         </w:rPr>
+        <w:t>CSRF</w:t>
+      </w:r>
+      <w:r>
+        <w:rPr>
+          <w:b/>
+        </w:rPr>
+        <w:t xml:space="preserve"> с помощью </w:t>
+      </w:r>
+      <w:r>
+        <w:rPr>
+          <w:b/>
+          <w:i/>
+        </w:rPr>
         <w:t>middleware</w:t>
       </w:r>
       <w:r>
         <w:rPr>
           <w:b/>
         </w:rPr>
-        <w:t xml:space="preserve"> в </w:t>
-      </w:r>
-      <w:r>
-        <w:rPr>
-          <w:b/>
-          <w:i/>
-        </w:rPr>
-        <w:t>Express.js</w:t>
-      </w:r>
-      <w:r>
-        <w:rPr>
-          <w:b/>
-        </w:rPr>
-        <w:t xml:space="preserve"> и какова его сигнатура?</w:t>
+        <w:t xml:space="preserve"> (теоретически)?</w:t>
       </w:r>
     </w:p>
     <w:p>
       <w:pPr/>
       <w:r>
+        <w:t xml:space="preserve">Сервер выдает случайный токен, сохраняет его в сессии и вставляет скрытым полем в форму. </w:t>
+      </w:r>
+      <w:r>
         <w:rPr>
           <w:i/>
         </w:rPr>
         <w:t>Middleware</w:t>
       </w:r>
       <w:r>
-        <w:t xml:space="preserve"> – это функция, которая получает объекты запроса и ответа и управляет дальнейшей обработкой. Сигнатура: </w:t>
-      </w:r>
-      <w:r>
-        <w:rPr>
-          <w:i/>
-        </w:rPr>
-        <w:t>(req, res, next)</w:t>
-      </w:r>
-      <w:r>
-        <w:t xml:space="preserve">. Функция может изменить </w:t>
-      </w:r>
-      <w:r>
-        <w:rPr>
-          <w:i/>
-        </w:rPr>
-        <w:t>req</w:t>
-      </w:r>
-      <w:r>
-        <w:t xml:space="preserve"> и </w:t>
-      </w:r>
-      <w:r>
-        <w:rPr>
-          <w:i/>
-        </w:rPr>
-        <w:t>res</w:t>
-      </w:r>
-      <w:r>
-        <w:t xml:space="preserve">, завершить ответ или передать управление вызовом </w:t>
-      </w:r>
-      <w:r>
-        <w:rPr>
-          <w:i/>
-        </w:rPr>
-        <w:t>next()</w:t>
-      </w:r>
-      <w:r>
-        <w:t>.</w:t>
+        <w:t xml:space="preserve"> сравнивает токен из тела запроса с сохраненным и отклоняет запрос при несовпадении. Дополнительно используют </w:t>
+      </w:r>
+      <w:r>
+        <w:rPr>
+          <w:i/>
+        </w:rPr>
+        <w:t>cookie</w:t>
+      </w:r>
+      <w:r>
+        <w:t xml:space="preserve"> с </w:t>
+      </w:r>
+      <w:r>
+        <w:rPr>
+          <w:i/>
+        </w:rPr>
+        <w:t>SameSite</w:t>
+      </w:r>
+      <w:r>
+        <w:t xml:space="preserve">. Готовое решение – пакет </w:t>
+      </w:r>
+      <w:r>
+        <w:rPr>
+          <w:i/>
+        </w:rPr>
+        <w:t>csurf</w:t>
+      </w:r>
+      <w:r>
+        <w:t xml:space="preserve"> или его аналоги.</w:t>
       </w:r>
     </w:p>
     <w:p>
@@ -7764,63 +7772,66 @@
         <w:rPr>
           <w:b/>
         </w:rPr>
-        <w:t xml:space="preserve">2. Какой порядок выполнения </w:t>
+        <w:t xml:space="preserve">26. Как в </w:t>
       </w:r>
       <w:r>
         <w:rPr>
           <w:b/>
           <w:i/>
         </w:rPr>
-        <w:t>middleware</w:t>
+        <w:t>EJS</w:t>
       </w:r>
       <w:r>
         <w:rPr>
           <w:b/>
         </w:rPr>
-        <w:t xml:space="preserve"> в </w:t>
+        <w:t xml:space="preserve"> использовать функцию-</w:t>
       </w:r>
       <w:r>
         <w:rPr>
           <w:b/>
           <w:i/>
         </w:rPr>
-        <w:t>Express</w:t>
+        <w:t>helper</w:t>
       </w:r>
       <w:r>
         <w:rPr>
           <w:b/>
         </w:rPr>
-        <w:t>? Что влияет на порядок?</w:t>
+        <w:t>?</w:t>
       </w:r>
     </w:p>
     <w:p>
       <w:pPr/>
       <w:r>
-        <w:rPr>
-          <w:i/>
-        </w:rPr>
-        <w:t>Middleware</w:t>
-      </w:r>
-      <w:r>
-        <w:t xml:space="preserve"> выполняются строго в порядке регистрации через </w:t>
-      </w:r>
-      <w:r>
-        <w:rPr>
-          <w:i/>
-        </w:rPr>
-        <w:t>app.use()</w:t>
-      </w:r>
-      <w:r>
-        <w:t xml:space="preserve"> и </w:t>
-      </w:r>
-      <w:r>
-        <w:rPr>
-          <w:i/>
-        </w:rPr>
-        <w:t>app.METHOD()</w:t>
-      </w:r>
-      <w:r>
-        <w:t>. На порядок влияет место вызова в коде, а также совпадение пути и метода: функция выполняется, только если запрос подходит под ее путь.</w:t>
+        <w:t xml:space="preserve">Функцию кладут в </w:t>
+      </w:r>
+      <w:r>
+        <w:rPr>
+          <w:i/>
+        </w:rPr>
+        <w:t>app.locals</w:t>
+      </w:r>
+      <w:r>
+        <w:t xml:space="preserve">: </w:t>
+      </w:r>
+      <w:r>
+        <w:rPr>
+          <w:i/>
+        </w:rPr>
+        <w:t>app.locals.formatDate = (iso) =&gt; new Date(iso).toLocaleString('ru-RU')</w:t>
+      </w:r>
+      <w:r>
+        <w:t xml:space="preserve">. В шаблоне ее вызывают как обычную: </w:t>
+      </w:r>
+      <w:r>
+        <w:rPr>
+          <w:i/>
+        </w:rPr>
+        <w:t>&lt;%= formatDate(item.createdAt) %&gt;</w:t>
+      </w:r>
+      <w:r>
+        <w:t>. В проекте так сделано на главной и детальной страницах.</w:t>
       </w:r>
     </w:p>
     <w:p>
@@ -7834,2036 +7845,26 @@
         <w:rPr>
           <w:b/>
         </w:rPr>
-        <w:t xml:space="preserve">3. Как передать данные из маршрута в шаблон </w:t>
+        <w:t xml:space="preserve">27. Почему </w:t>
       </w:r>
       <w:r>
         <w:rPr>
           <w:b/>
           <w:i/>
         </w:rPr>
-        <w:t>EJS</w:t>
+        <w:t>middleware</w:t>
       </w:r>
       <w:r>
         <w:rPr>
           <w:b/>
         </w:rPr>
-        <w:t>?</w:t>
+        <w:t xml:space="preserve"> для статики обычно подключается до всех маршрутов?</w:t>
       </w:r>
     </w:p>
     <w:p>
       <w:pPr/>
       <w:r>
-        <w:t xml:space="preserve">Данные передаются вторым аргументом </w:t>
-      </w:r>
-      <w:r>
-        <w:rPr>
-          <w:i/>
-        </w:rPr>
-        <w:t>res.render()</w:t>
-      </w:r>
-      <w:r>
-        <w:t xml:space="preserve">: </w:t>
-      </w:r>
-      <w:r>
-        <w:rPr>
-          <w:i/>
-        </w:rPr>
-        <w:t>res.render('index', { items: diagrams })</w:t>
-      </w:r>
-      <w:r>
-        <w:t xml:space="preserve">. В шаблоне они доступны как переменные, например </w:t>
-      </w:r>
-      <w:r>
-        <w:rPr>
-          <w:i/>
-        </w:rPr>
-        <w:t>&lt;%= items.length %&gt;</w:t>
-      </w:r>
-      <w:r>
-        <w:t xml:space="preserve">. Общие данные можно положить в </w:t>
-      </w:r>
-      <w:r>
-        <w:rPr>
-          <w:i/>
-        </w:rPr>
-        <w:t>res.locals</w:t>
-      </w:r>
-      <w:r>
-        <w:t xml:space="preserve"> или </w:t>
-      </w:r>
-      <w:r>
-        <w:rPr>
-          <w:i/>
-        </w:rPr>
-        <w:t>app.locals</w:t>
-      </w:r>
-      <w:r>
-        <w:t>.</w:t>
-      </w:r>
-    </w:p>
-    <w:p>
-      <w:pPr>
-        <w:keepNext/>
-        <w:spacing w:before="0" w:after="0" w:lineRule="exact" w:line="360"/>
-        <w:ind w:firstLine="709"/>
-        <w:jc w:val="both"/>
-      </w:pPr>
-      <w:r>
-        <w:rPr>
-          <w:b/>
-        </w:rPr>
-        <w:t xml:space="preserve">4. Что такое </w:t>
-      </w:r>
-      <w:r>
-        <w:rPr>
-          <w:b/>
-          <w:i/>
-        </w:rPr>
-        <w:t>next()</w:t>
-      </w:r>
-      <w:r>
-        <w:rPr>
-          <w:b/>
-        </w:rPr>
-        <w:t xml:space="preserve"> и что произойдет, если его не вызвать?</w:t>
-      </w:r>
-    </w:p>
-    <w:p>
-      <w:pPr/>
-      <w:r>
-        <w:t xml:space="preserve">Функция </w:t>
-      </w:r>
-      <w:r>
-        <w:rPr>
-          <w:i/>
-        </w:rPr>
-        <w:t>next()</w:t>
-      </w:r>
-      <w:r>
-        <w:t xml:space="preserve"> передает управление следующему </w:t>
-      </w:r>
-      <w:r>
-        <w:rPr>
-          <w:i/>
-        </w:rPr>
-        <w:t>middleware</w:t>
-      </w:r>
-      <w:r>
-        <w:t xml:space="preserve">. Если ее не вызвать и не отправить ответ, запрос зависнет, и клиент будет ждать ответа до таймаута. Вызов </w:t>
-      </w:r>
-      <w:r>
-        <w:rPr>
-          <w:i/>
-        </w:rPr>
-        <w:t>next(err)</w:t>
-      </w:r>
-      <w:r>
-        <w:t xml:space="preserve"> передает управление обработчику ошибок.</w:t>
-      </w:r>
-    </w:p>
-    <w:p>
-      <w:pPr>
-        <w:keepNext/>
-        <w:spacing w:before="0" w:after="0" w:lineRule="exact" w:line="360"/>
-        <w:ind w:firstLine="709"/>
-        <w:jc w:val="both"/>
-      </w:pPr>
-      <w:r>
-        <w:rPr>
-          <w:b/>
-        </w:rPr>
-        <w:t xml:space="preserve">5. Как создать </w:t>
-      </w:r>
-      <w:r>
-        <w:rPr>
-          <w:b/>
-          <w:i/>
-        </w:rPr>
-        <w:t>middleware</w:t>
-      </w:r>
-      <w:r>
-        <w:rPr>
-          <w:b/>
-        </w:rPr>
-        <w:t xml:space="preserve"> для обработки ошибок?</w:t>
-      </w:r>
-    </w:p>
-    <w:p>
-      <w:pPr/>
-      <w:r>
-        <w:t xml:space="preserve">Нужно объявить функцию с четырьмя параметрами </w:t>
-      </w:r>
-      <w:r>
-        <w:rPr>
-          <w:i/>
-        </w:rPr>
-        <w:t>(err, req, res, next)</w:t>
-      </w:r>
-      <w:r>
-        <w:t xml:space="preserve"> и подключить ее после всех маршрутов. </w:t>
-      </w:r>
-      <w:r>
-        <w:rPr>
-          <w:i/>
-        </w:rPr>
-        <w:t>Express</w:t>
-      </w:r>
-      <w:r>
-        <w:t xml:space="preserve"> определяет обработчик ошибок именно по числу параметров. В проекте это </w:t>
-      </w:r>
-      <w:r>
-        <w:rPr>
-          <w:i/>
-        </w:rPr>
-        <w:t>serverErrorHandler</w:t>
-      </w:r>
-      <w:r>
-        <w:t>.</w:t>
-      </w:r>
-    </w:p>
-    <w:p>
-      <w:pPr>
-        <w:keepNext/>
-        <w:spacing w:before="0" w:after="0" w:lineRule="exact" w:line="360"/>
-        <w:ind w:firstLine="709"/>
-        <w:jc w:val="both"/>
-      </w:pPr>
-      <w:r>
-        <w:rPr>
-          <w:b/>
-        </w:rPr>
-        <w:t xml:space="preserve">6. В чем разница между </w:t>
-      </w:r>
-      <w:r>
-        <w:rPr>
-          <w:b/>
-          <w:i/>
-        </w:rPr>
-        <w:t>app.use()</w:t>
-      </w:r>
-      <w:r>
-        <w:rPr>
-          <w:b/>
-        </w:rPr>
-        <w:t xml:space="preserve"> и </w:t>
-      </w:r>
-      <w:r>
-        <w:rPr>
-          <w:b/>
-          <w:i/>
-        </w:rPr>
-        <w:t>app.METHOD()</w:t>
-      </w:r>
-      <w:r>
-        <w:rPr>
-          <w:b/>
-        </w:rPr>
-        <w:t>?</w:t>
-      </w:r>
-    </w:p>
-    <w:p>
-      <w:pPr/>
-      <w:r>
-        <w:t xml:space="preserve">Метод </w:t>
-      </w:r>
-      <w:r>
-        <w:rPr>
-          <w:i/>
-        </w:rPr>
-        <w:t>app.use()</w:t>
-      </w:r>
-      <w:r>
-        <w:t xml:space="preserve"> подключает </w:t>
-      </w:r>
-      <w:r>
-        <w:rPr>
-          <w:i/>
-        </w:rPr>
-        <w:t>middleware</w:t>
-      </w:r>
-      <w:r>
-        <w:t xml:space="preserve"> для всех </w:t>
-      </w:r>
-      <w:r>
-        <w:rPr>
-          <w:i/>
-        </w:rPr>
-        <w:t>HTTP</w:t>
-      </w:r>
-      <w:r>
-        <w:t xml:space="preserve">-методов и для любого пути, начинающегося с указанного префикса. Метод </w:t>
-      </w:r>
-      <w:r>
-        <w:rPr>
-          <w:i/>
-        </w:rPr>
-        <w:t>app.get()</w:t>
-      </w:r>
-      <w:r>
-        <w:t xml:space="preserve"> и аналоги срабатывают только для своего </w:t>
-      </w:r>
-      <w:r>
-        <w:rPr>
-          <w:i/>
-        </w:rPr>
-        <w:t>HTTP</w:t>
-      </w:r>
-      <w:r>
-        <w:t>-метода и точного совпадения пути.</w:t>
-      </w:r>
-    </w:p>
-    <w:p>
-      <w:pPr>
-        <w:keepNext/>
-        <w:spacing w:before="0" w:after="0" w:lineRule="exact" w:line="360"/>
-        <w:ind w:firstLine="709"/>
-        <w:jc w:val="both"/>
-      </w:pPr>
-      <w:r>
-        <w:rPr>
-          <w:b/>
-        </w:rPr>
-        <w:t xml:space="preserve">7. Как в </w:t>
-      </w:r>
-      <w:r>
-        <w:rPr>
-          <w:b/>
-          <w:i/>
-        </w:rPr>
-        <w:t>EJS</w:t>
-      </w:r>
-      <w:r>
-        <w:rPr>
-          <w:b/>
-        </w:rPr>
-        <w:t xml:space="preserve"> использовать циклы и условные операторы?</w:t>
-      </w:r>
-    </w:p>
-    <w:p>
-      <w:pPr/>
-      <w:r>
-        <w:t xml:space="preserve">Управляющий код записывается в тегах </w:t>
-      </w:r>
-      <w:r>
-        <w:rPr>
-          <w:i/>
-        </w:rPr>
-        <w:t>&lt;% %&gt;</w:t>
-      </w:r>
-      <w:r>
-        <w:t xml:space="preserve">. Пример: </w:t>
-      </w:r>
-      <w:r>
-        <w:rPr>
-          <w:i/>
-        </w:rPr>
-        <w:t>&lt;% if (items.length) { %&gt; &lt;ul&gt; &lt;% items.forEach(function (i) { %&gt; &lt;li&gt;&lt;%= i.title %&gt;&lt;/li&gt; &lt;% }); %&gt; &lt;/ul&gt; &lt;% } else { %&gt; empty &lt;% } %&gt;</w:t>
-      </w:r>
-      <w:r>
-        <w:t>.</w:t>
-      </w:r>
-    </w:p>
-    <w:p>
-      <w:pPr>
-        <w:keepNext/>
-        <w:spacing w:before="0" w:after="0" w:lineRule="exact" w:line="360"/>
-        <w:ind w:firstLine="709"/>
-        <w:jc w:val="both"/>
-      </w:pPr>
-      <w:r>
-        <w:rPr>
-          <w:b/>
-        </w:rPr>
-        <w:t xml:space="preserve">8. Что такое </w:t>
-      </w:r>
-      <w:r>
-        <w:rPr>
-          <w:b/>
-          <w:i/>
-        </w:rPr>
-        <w:t>partials</w:t>
-      </w:r>
-      <w:r>
-        <w:rPr>
-          <w:b/>
-        </w:rPr>
-        <w:t xml:space="preserve"> в </w:t>
-      </w:r>
-      <w:r>
-        <w:rPr>
-          <w:b/>
-          <w:i/>
-        </w:rPr>
-        <w:t>EJS</w:t>
-      </w:r>
-      <w:r>
-        <w:rPr>
-          <w:b/>
-        </w:rPr>
-        <w:t xml:space="preserve"> и как их подключить?</w:t>
-      </w:r>
-    </w:p>
-    <w:p>
-      <w:pPr/>
-      <w:r>
-        <w:rPr>
-          <w:i/>
-        </w:rPr>
-        <w:t>Partials</w:t>
-      </w:r>
-      <w:r>
-        <w:t xml:space="preserve"> – это частичные шаблоны, например шапка или подвал, которые повторно используются на разных страницах. Подключение выполняется строкой </w:t>
-      </w:r>
-      <w:r>
-        <w:rPr>
-          <w:i/>
-        </w:rPr>
-        <w:t>&lt;%- include('partials/header') %&gt;</w:t>
-      </w:r>
-      <w:r>
-        <w:t xml:space="preserve">. В проекте это </w:t>
-      </w:r>
-      <w:r>
-        <w:rPr>
-          <w:i/>
-        </w:rPr>
-        <w:t>header.ejs</w:t>
-      </w:r>
-      <w:r>
-        <w:t xml:space="preserve"> и </w:t>
-      </w:r>
-      <w:r>
-        <w:rPr>
-          <w:i/>
-        </w:rPr>
-        <w:t>footer.ejs</w:t>
-      </w:r>
-      <w:r>
-        <w:t>.</w:t>
-      </w:r>
-    </w:p>
-    <w:p>
-      <w:pPr>
-        <w:keepNext/>
-        <w:spacing w:before="0" w:after="0" w:lineRule="exact" w:line="360"/>
-        <w:ind w:firstLine="709"/>
-        <w:jc w:val="both"/>
-      </w:pPr>
-      <w:r>
-        <w:rPr>
-          <w:b/>
-        </w:rPr>
-        <w:t xml:space="preserve">9. Как в </w:t>
-      </w:r>
-      <w:r>
-        <w:rPr>
-          <w:b/>
-          <w:i/>
-        </w:rPr>
-        <w:t>EJS</w:t>
-      </w:r>
-      <w:r>
-        <w:rPr>
-          <w:b/>
-        </w:rPr>
-        <w:t xml:space="preserve"> передать массив объектов и отрендерить его в таблицу?</w:t>
-      </w:r>
-    </w:p>
-    <w:p>
-      <w:pPr/>
-      <w:r>
-        <w:t xml:space="preserve">Массив передается в </w:t>
-      </w:r>
-      <w:r>
-        <w:rPr>
-          <w:i/>
-        </w:rPr>
-        <w:t>res.render('index', { items })</w:t>
-      </w:r>
-      <w:r>
-        <w:t xml:space="preserve">, а в шаблоне строки таблицы формируются циклом </w:t>
-      </w:r>
-      <w:r>
-        <w:rPr>
-          <w:i/>
-        </w:rPr>
-        <w:t>items.forEach</w:t>
-      </w:r>
-      <w:r>
-        <w:t xml:space="preserve"> внутри </w:t>
-      </w:r>
-      <w:r>
-        <w:rPr>
-          <w:i/>
-        </w:rPr>
-        <w:t>&lt;tbody&gt;</w:t>
-      </w:r>
-      <w:r>
-        <w:t xml:space="preserve">, где каждое поле выводится через </w:t>
-      </w:r>
-      <w:r>
-        <w:rPr>
-          <w:i/>
-        </w:rPr>
-        <w:t>&lt;%= item.title %&gt;</w:t>
-      </w:r>
-      <w:r>
-        <w:t xml:space="preserve">. Именно так устроен </w:t>
-      </w:r>
-      <w:r>
-        <w:rPr>
-          <w:i/>
-        </w:rPr>
-        <w:t>index.ejs</w:t>
-      </w:r>
-      <w:r>
-        <w:t>.</w:t>
-      </w:r>
-    </w:p>
-    <w:p>
-      <w:pPr>
-        <w:keepNext/>
-        <w:spacing w:before="0" w:after="0" w:lineRule="exact" w:line="360"/>
-        <w:ind w:firstLine="709"/>
-        <w:jc w:val="both"/>
-      </w:pPr>
-      <w:r>
-        <w:rPr>
-          <w:b/>
-        </w:rPr>
-        <w:t xml:space="preserve">10. Как реализовать </w:t>
-      </w:r>
-      <w:r>
-        <w:rPr>
-          <w:b/>
-          <w:i/>
-        </w:rPr>
-        <w:t>middleware</w:t>
-      </w:r>
-      <w:r>
-        <w:rPr>
-          <w:b/>
-        </w:rPr>
-        <w:t>, которое выполняется только для определенного маршрута?</w:t>
-      </w:r>
-    </w:p>
-    <w:p>
-      <w:pPr/>
-      <w:r>
-        <w:t xml:space="preserve">Функцию указывают перед обработчиком маршрута: </w:t>
-      </w:r>
-      <w:r>
-        <w:rPr>
-          <w:i/>
-        </w:rPr>
-        <w:t>router.get('/add', requireAuth, pages.addForm)</w:t>
-      </w:r>
-      <w:r>
-        <w:t xml:space="preserve">. Также можно подключить ее по префиксу: </w:t>
-      </w:r>
-      <w:r>
-        <w:rPr>
-          <w:i/>
-        </w:rPr>
-        <w:t>app.use('/admin', checkAdmin)</w:t>
-      </w:r>
-      <w:r>
-        <w:t>.</w:t>
-      </w:r>
-    </w:p>
-    <w:p>
-      <w:pPr>
-        <w:keepNext/>
-        <w:spacing w:before="0" w:after="0" w:lineRule="exact" w:line="360"/>
-        <w:ind w:firstLine="709"/>
-        <w:jc w:val="both"/>
-      </w:pPr>
-      <w:r>
-        <w:rPr>
-          <w:b/>
-        </w:rPr>
-        <w:t xml:space="preserve">11. Как отличить </w:t>
-      </w:r>
-      <w:r>
-        <w:rPr>
-          <w:b/>
-          <w:i/>
-        </w:rPr>
-        <w:t>middleware</w:t>
-      </w:r>
-      <w:r>
-        <w:rPr>
-          <w:b/>
-        </w:rPr>
-        <w:t xml:space="preserve"> для статики (</w:t>
-      </w:r>
-      <w:r>
-        <w:rPr>
-          <w:b/>
-          <w:i/>
-        </w:rPr>
-        <w:t>express.static</w:t>
-      </w:r>
-      <w:r>
-        <w:rPr>
-          <w:b/>
-        </w:rPr>
-        <w:t>) от других?</w:t>
-      </w:r>
-    </w:p>
-    <w:p>
-      <w:pPr/>
-      <w:r>
-        <w:rPr>
-          <w:i/>
-        </w:rPr>
-        <w:t>express.static</w:t>
-      </w:r>
-      <w:r>
-        <w:t xml:space="preserve"> – встроенный </w:t>
-      </w:r>
-      <w:r>
-        <w:rPr>
-          <w:i/>
-        </w:rPr>
-        <w:t>middleware</w:t>
-      </w:r>
-      <w:r>
-        <w:t xml:space="preserve">, который по пути запроса ищет файл в указанной папке и отдает его, а при отсутствии файла вызывает </w:t>
-      </w:r>
-      <w:r>
-        <w:rPr>
-          <w:i/>
-        </w:rPr>
-        <w:t>next()</w:t>
-      </w:r>
-      <w:r>
-        <w:t xml:space="preserve">. Остальные </w:t>
-      </w:r>
-      <w:r>
-        <w:rPr>
-          <w:i/>
-        </w:rPr>
-        <w:t>middleware</w:t>
-      </w:r>
-      <w:r>
-        <w:t xml:space="preserve"> работают с логикой запроса и не обращаются к файловой системе.</w:t>
-      </w:r>
-    </w:p>
-    <w:p>
-      <w:pPr>
-        <w:keepNext/>
-        <w:spacing w:before="0" w:after="0" w:lineRule="exact" w:line="360"/>
-        <w:ind w:firstLine="709"/>
-        <w:jc w:val="both"/>
-      </w:pPr>
-      <w:r>
-        <w:rPr>
-          <w:b/>
-        </w:rPr>
-        <w:t xml:space="preserve">12. Как реализовать </w:t>
-      </w:r>
-      <w:r>
-        <w:rPr>
-          <w:b/>
-          <w:i/>
-        </w:rPr>
-        <w:t>middleware</w:t>
-      </w:r>
-      <w:r>
-        <w:rPr>
-          <w:b/>
-        </w:rPr>
-        <w:t xml:space="preserve"> для проверки авторизации по сессии?</w:t>
-      </w:r>
-    </w:p>
-    <w:p>
-      <w:pPr/>
-      <w:r>
-        <w:rPr>
-          <w:i/>
-        </w:rPr>
-        <w:t>Middleware</w:t>
-      </w:r>
-      <w:r>
-        <w:t xml:space="preserve"> читает </w:t>
-      </w:r>
-      <w:r>
-        <w:rPr>
-          <w:i/>
-        </w:rPr>
-        <w:t>req.session.user</w:t>
-      </w:r>
-      <w:r>
-        <w:t xml:space="preserve"> (после подключения </w:t>
-      </w:r>
-      <w:r>
-        <w:rPr>
-          <w:i/>
-        </w:rPr>
-        <w:t>express-session</w:t>
-      </w:r>
-      <w:r>
-        <w:t xml:space="preserve">) и при его отсутствии делает </w:t>
-      </w:r>
-      <w:r>
-        <w:rPr>
-          <w:i/>
-        </w:rPr>
-        <w:t>res.redirect('/login')</w:t>
-      </w:r>
-      <w:r>
-        <w:t xml:space="preserve">, иначе вызывает </w:t>
-      </w:r>
-      <w:r>
-        <w:rPr>
-          <w:i/>
-        </w:rPr>
-        <w:t>next()</w:t>
-      </w:r>
-      <w:r>
-        <w:t xml:space="preserve">. В проекте вместо сессии проверяется параметр </w:t>
-      </w:r>
-      <w:r>
-        <w:rPr>
-          <w:i/>
-        </w:rPr>
-        <w:t>req.query.auth</w:t>
-      </w:r>
-      <w:r>
-        <w:t>.</w:t>
-      </w:r>
-    </w:p>
-    <w:p>
-      <w:pPr>
-        <w:keepNext/>
-        <w:spacing w:before="0" w:after="0" w:lineRule="exact" w:line="360"/>
-        <w:ind w:firstLine="709"/>
-        <w:jc w:val="both"/>
-      </w:pPr>
-      <w:r>
-        <w:rPr>
-          <w:b/>
-        </w:rPr>
-        <w:t xml:space="preserve">13. Какая разница между </w:t>
-      </w:r>
-      <w:r>
-        <w:rPr>
-          <w:b/>
-          <w:i/>
-        </w:rPr>
-        <w:t>res.render()</w:t>
-      </w:r>
-      <w:r>
-        <w:rPr>
-          <w:b/>
-        </w:rPr>
-        <w:t xml:space="preserve"> и </w:t>
-      </w:r>
-      <w:r>
-        <w:rPr>
-          <w:b/>
-          <w:i/>
-        </w:rPr>
-        <w:t>res.send()</w:t>
-      </w:r>
-      <w:r>
-        <w:rPr>
-          <w:b/>
-        </w:rPr>
-        <w:t>?</w:t>
-      </w:r>
-    </w:p>
-    <w:p>
-      <w:pPr/>
-      <w:r>
-        <w:t xml:space="preserve">Метод </w:t>
-      </w:r>
-      <w:r>
-        <w:rPr>
-          <w:i/>
-        </w:rPr>
-        <w:t>res.render()</w:t>
-      </w:r>
-      <w:r>
-        <w:t xml:space="preserve"> подставляет данные в шаблон и отправляет готовый </w:t>
-      </w:r>
-      <w:r>
-        <w:rPr>
-          <w:i/>
-        </w:rPr>
-        <w:t>HTML</w:t>
-      </w:r>
-      <w:r>
-        <w:t xml:space="preserve">, он нужен для страниц. Метод </w:t>
-      </w:r>
-      <w:r>
-        <w:rPr>
-          <w:i/>
-        </w:rPr>
-        <w:t>res.send()</w:t>
-      </w:r>
-      <w:r>
-        <w:t xml:space="preserve"> отправляет переданное значение как есть (строку, объект, буфер), его используют для простых ответов и </w:t>
-      </w:r>
-      <w:r>
-        <w:rPr>
-          <w:i/>
-        </w:rPr>
-        <w:t>API</w:t>
-      </w:r>
-      <w:r>
-        <w:t>.</w:t>
-      </w:r>
-    </w:p>
-    <w:p>
-      <w:pPr>
-        <w:keepNext/>
-        <w:spacing w:before="0" w:after="0" w:lineRule="exact" w:line="360"/>
-        <w:ind w:firstLine="709"/>
-        <w:jc w:val="both"/>
-      </w:pPr>
-      <w:r>
-        <w:rPr>
-          <w:b/>
-        </w:rPr>
-        <w:t xml:space="preserve">14. Как обработать ошибку в асинхронном </w:t>
-      </w:r>
-      <w:r>
-        <w:rPr>
-          <w:b/>
-          <w:i/>
-        </w:rPr>
-        <w:t>middleware</w:t>
-      </w:r>
-      <w:r>
-        <w:rPr>
-          <w:b/>
-        </w:rPr>
-        <w:t xml:space="preserve"> без </w:t>
-      </w:r>
-      <w:r>
-        <w:rPr>
-          <w:b/>
-          <w:i/>
-        </w:rPr>
-        <w:t>try/catch</w:t>
-      </w:r>
-      <w:r>
-        <w:rPr>
-          <w:b/>
-        </w:rPr>
-        <w:t>?</w:t>
-      </w:r>
-    </w:p>
-    <w:p>
-      <w:pPr/>
-      <w:r>
-        <w:t xml:space="preserve">В </w:t>
-      </w:r>
-      <w:r>
-        <w:rPr>
-          <w:i/>
-        </w:rPr>
-        <w:t>Express</w:t>
-      </w:r>
-      <w:r>
-        <w:t xml:space="preserve"> 5 отклоненный промис автоматически передается в обработчик ошибок. В </w:t>
-      </w:r>
-      <w:r>
-        <w:rPr>
-          <w:i/>
-        </w:rPr>
-        <w:t>Express</w:t>
-      </w:r>
-      <w:r>
-        <w:t xml:space="preserve"> 4 используют обертку, которая вызывает </w:t>
-      </w:r>
-      <w:r>
-        <w:rPr>
-          <w:i/>
-        </w:rPr>
-        <w:t>.catch(next)</w:t>
-      </w:r>
-      <w:r>
-        <w:t xml:space="preserve">, например </w:t>
-      </w:r>
-      <w:r>
-        <w:rPr>
-          <w:i/>
-        </w:rPr>
-        <w:t>const wrap = (fn) =&gt; (req, res, next) =&gt; fn(req, res, next).catch(next)</w:t>
-      </w:r>
-      <w:r>
-        <w:t xml:space="preserve">, либо пакет </w:t>
-      </w:r>
-      <w:r>
-        <w:rPr>
-          <w:i/>
-        </w:rPr>
-        <w:t>express-async-errors</w:t>
-      </w:r>
-      <w:r>
-        <w:t>.</w:t>
-      </w:r>
-    </w:p>
-    <w:p>
-      <w:pPr>
-        <w:keepNext/>
-        <w:spacing w:before="0" w:after="0" w:lineRule="exact" w:line="360"/>
-        <w:ind w:firstLine="709"/>
-        <w:jc w:val="both"/>
-      </w:pPr>
-      <w:r>
-        <w:rPr>
-          <w:b/>
-        </w:rPr>
-        <w:t xml:space="preserve">15. Как в </w:t>
-      </w:r>
-      <w:r>
-        <w:rPr>
-          <w:b/>
-          <w:i/>
-        </w:rPr>
-        <w:t>EJS</w:t>
-      </w:r>
-      <w:r>
-        <w:rPr>
-          <w:b/>
-        </w:rPr>
-        <w:t xml:space="preserve"> задать базовый шаблон (</w:t>
-      </w:r>
-      <w:r>
-        <w:rPr>
-          <w:b/>
-          <w:i/>
-        </w:rPr>
-        <w:t>layout</w:t>
-      </w:r>
-      <w:r>
-        <w:rPr>
-          <w:b/>
-        </w:rPr>
-        <w:t>)?</w:t>
-      </w:r>
-    </w:p>
-    <w:p>
-      <w:pPr/>
-      <w:r>
-        <w:t xml:space="preserve">Есть два способа: подключать </w:t>
-      </w:r>
-      <w:r>
-        <w:rPr>
-          <w:i/>
-        </w:rPr>
-        <w:t>partials</w:t>
-      </w:r>
-      <w:r>
-        <w:t xml:space="preserve"> шапки и подвала в каждой странице (как в проекте) или использовать пакет </w:t>
-      </w:r>
-      <w:r>
-        <w:rPr>
-          <w:i/>
-        </w:rPr>
-        <w:t>express-ejs-layouts</w:t>
-      </w:r>
-      <w:r>
-        <w:t xml:space="preserve">, в котором общий файл </w:t>
-      </w:r>
-      <w:r>
-        <w:rPr>
-          <w:i/>
-        </w:rPr>
-        <w:t>layout.ejs</w:t>
-      </w:r>
-      <w:r>
-        <w:t xml:space="preserve"> содержит </w:t>
-      </w:r>
-      <w:r>
-        <w:rPr>
-          <w:i/>
-        </w:rPr>
-        <w:t>&lt;%- body %&gt;</w:t>
-      </w:r>
-      <w:r>
-        <w:t>.</w:t>
-      </w:r>
-    </w:p>
-    <w:p>
-      <w:pPr>
-        <w:keepNext/>
-        <w:spacing w:before="0" w:after="0" w:lineRule="exact" w:line="360"/>
-        <w:ind w:firstLine="709"/>
-        <w:jc w:val="both"/>
-      </w:pPr>
-      <w:r>
-        <w:rPr>
-          <w:b/>
-        </w:rPr>
-        <w:t xml:space="preserve">16. Где лучше определять </w:t>
-      </w:r>
-      <w:r>
-        <w:rPr>
-          <w:b/>
-          <w:i/>
-        </w:rPr>
-        <w:t>middleware</w:t>
-      </w:r>
-      <w:r>
-        <w:rPr>
-          <w:b/>
-        </w:rPr>
-        <w:t xml:space="preserve"> – до или после маршрутов?</w:t>
-      </w:r>
-    </w:p>
-    <w:p>
-      <w:pPr/>
-      <w:r>
-        <w:t xml:space="preserve">Общие </w:t>
-      </w:r>
-      <w:r>
-        <w:rPr>
-          <w:i/>
-        </w:rPr>
-        <w:t>middleware</w:t>
-      </w:r>
-      <w:r>
-        <w:t xml:space="preserve"> (логирование, парсинг тела, авторизация) определяют до маршрутов, иначе они не успеют сработать. Обработчик 404 и обработчик ошибок определяют после всех маршрутов, чтобы они перехватывали запросы, которые никто не обработал.</w:t>
-      </w:r>
-    </w:p>
-    <w:p>
-      <w:pPr>
-        <w:keepNext/>
-        <w:spacing w:before="0" w:after="0" w:lineRule="exact" w:line="360"/>
-        <w:ind w:firstLine="709"/>
-        <w:jc w:val="both"/>
-      </w:pPr>
-      <w:r>
-        <w:rPr>
-          <w:b/>
-        </w:rPr>
-        <w:t xml:space="preserve">17. Как с помощью </w:t>
-      </w:r>
-      <w:r>
-        <w:rPr>
-          <w:b/>
-          <w:i/>
-        </w:rPr>
-        <w:t>middleware</w:t>
-      </w:r>
-      <w:r>
-        <w:rPr>
-          <w:b/>
-        </w:rPr>
-        <w:t xml:space="preserve"> перехватить и изменить </w:t>
-      </w:r>
-      <w:r>
-        <w:rPr>
-          <w:b/>
-          <w:i/>
-        </w:rPr>
-        <w:t>req.body</w:t>
-      </w:r>
-      <w:r>
-        <w:rPr>
-          <w:b/>
-        </w:rPr>
-        <w:t>?</w:t>
-      </w:r>
-    </w:p>
-    <w:p>
-      <w:pPr/>
-      <w:r>
-        <w:t xml:space="preserve">После </w:t>
-      </w:r>
-      <w:r>
-        <w:rPr>
-          <w:i/>
-        </w:rPr>
-        <w:t>express.json()</w:t>
-      </w:r>
-      <w:r>
-        <w:t xml:space="preserve"> или </w:t>
-      </w:r>
-      <w:r>
-        <w:rPr>
-          <w:i/>
-        </w:rPr>
-        <w:t>express.urlencoded()</w:t>
-      </w:r>
-      <w:r>
-        <w:t xml:space="preserve"> подключают собственную функцию, которая изменяет </w:t>
-      </w:r>
-      <w:r>
-        <w:rPr>
-          <w:i/>
-        </w:rPr>
-        <w:t>req.body</w:t>
-      </w:r>
-      <w:r>
-        <w:t xml:space="preserve">, например обрезает пробелы: </w:t>
-      </w:r>
-      <w:r>
-        <w:rPr>
-          <w:i/>
-        </w:rPr>
-        <w:t>req.body.title = req.body.title.trim(); next();</w:t>
-      </w:r>
-      <w:r>
-        <w:t>.</w:t>
-      </w:r>
-    </w:p>
-    <w:p>
-      <w:pPr>
-        <w:keepNext/>
-        <w:spacing w:before="0" w:after="0" w:lineRule="exact" w:line="360"/>
-        <w:ind w:firstLine="709"/>
-        <w:jc w:val="both"/>
-      </w:pPr>
-      <w:r>
-        <w:rPr>
-          <w:b/>
-        </w:rPr>
-        <w:t xml:space="preserve">18. Можно ли использовать несколько </w:t>
-      </w:r>
-      <w:r>
-        <w:rPr>
-          <w:b/>
-          <w:i/>
-        </w:rPr>
-        <w:t>middleware</w:t>
-      </w:r>
-      <w:r>
-        <w:rPr>
-          <w:b/>
-        </w:rPr>
-        <w:t xml:space="preserve"> последовательно для одного маршрута?</w:t>
-      </w:r>
-    </w:p>
-    <w:p>
-      <w:pPr/>
-      <w:r>
-        <w:t xml:space="preserve">Да. Функции перечисляются через запятую или массивом, и каждая вызывает </w:t>
-      </w:r>
-      <w:r>
-        <w:rPr>
-          <w:i/>
-        </w:rPr>
-        <w:t>next()</w:t>
-      </w:r>
-      <w:r>
-        <w:t xml:space="preserve">: </w:t>
-      </w:r>
-      <w:r>
-        <w:rPr>
-          <w:i/>
-        </w:rPr>
-        <w:t>app.post('/add', requireAuth, validate, controller)</w:t>
-      </w:r>
-      <w:r>
-        <w:t>.</w:t>
-      </w:r>
-    </w:p>
-    <w:p>
-      <w:pPr>
-        <w:keepNext/>
-        <w:spacing w:before="0" w:after="0" w:lineRule="exact" w:line="360"/>
-        <w:ind w:firstLine="709"/>
-        <w:jc w:val="both"/>
-      </w:pPr>
-      <w:r>
-        <w:rPr>
-          <w:b/>
-        </w:rPr>
-        <w:t xml:space="preserve">19. Как в </w:t>
-      </w:r>
-      <w:r>
-        <w:rPr>
-          <w:b/>
-          <w:i/>
-        </w:rPr>
-        <w:t>EJS</w:t>
-      </w:r>
-      <w:r>
-        <w:rPr>
-          <w:b/>
-        </w:rPr>
-        <w:t xml:space="preserve"> получить доступ к переменной внутри частичного шаблона?</w:t>
-      </w:r>
-    </w:p>
-    <w:p>
-      <w:pPr/>
-      <w:r>
-        <w:rPr>
-          <w:i/>
-        </w:rPr>
-        <w:t>Partial</w:t>
-      </w:r>
-      <w:r>
-        <w:t xml:space="preserve"> получает все данные родительского шаблона автоматически, включая </w:t>
-      </w:r>
-      <w:r>
-        <w:rPr>
-          <w:i/>
-        </w:rPr>
-        <w:t>res.locals</w:t>
-      </w:r>
-      <w:r>
-        <w:t xml:space="preserve">. Дополнительные значения передаются вторым аргументом: </w:t>
-      </w:r>
-      <w:r>
-        <w:rPr>
-          <w:i/>
-        </w:rPr>
-        <w:t>include('partials/card', { item })</w:t>
-      </w:r>
-      <w:r>
-        <w:t xml:space="preserve">. Так в </w:t>
-      </w:r>
-      <w:r>
-        <w:rPr>
-          <w:i/>
-        </w:rPr>
-        <w:t>header.ejs</w:t>
-      </w:r>
-      <w:r>
-        <w:t xml:space="preserve"> используются </w:t>
-      </w:r>
-      <w:r>
-        <w:rPr>
-          <w:i/>
-        </w:rPr>
-        <w:t>title</w:t>
-      </w:r>
-      <w:r>
-        <w:t xml:space="preserve">, </w:t>
-      </w:r>
-      <w:r>
-        <w:rPr>
-          <w:i/>
-        </w:rPr>
-        <w:t>user</w:t>
-      </w:r>
-      <w:r>
-        <w:t xml:space="preserve"> и </w:t>
-      </w:r>
-      <w:r>
-        <w:rPr>
-          <w:i/>
-        </w:rPr>
-        <w:t>authQuery</w:t>
-      </w:r>
-      <w:r>
-        <w:t>.</w:t>
-      </w:r>
-    </w:p>
-    <w:p>
-      <w:pPr>
-        <w:keepNext/>
-        <w:spacing w:before="0" w:after="0" w:lineRule="exact" w:line="360"/>
-        <w:ind w:firstLine="709"/>
-        <w:jc w:val="both"/>
-      </w:pPr>
-      <w:r>
-        <w:rPr>
-          <w:b/>
-        </w:rPr>
-        <w:t xml:space="preserve">20. Как реализовать </w:t>
-      </w:r>
-      <w:r>
-        <w:rPr>
-          <w:b/>
-          <w:i/>
-        </w:rPr>
-        <w:t>middleware</w:t>
-      </w:r>
-      <w:r>
-        <w:rPr>
-          <w:b/>
-        </w:rPr>
-        <w:t>, добавляющее общий заголовок?</w:t>
-      </w:r>
-    </w:p>
-    <w:p>
-      <w:pPr/>
-      <w:r>
-        <w:rPr>
-          <w:i/>
-        </w:rPr>
-        <w:t>app.use((req, res, next) =&gt; { res.setHeader('X-Powered-By', 'VisualDSL'); next(); });</w:t>
-      </w:r>
-      <w:r>
-        <w:t xml:space="preserve"> – заголовок добавится ко всем ответам, подключенным после этого </w:t>
-      </w:r>
-      <w:r>
-        <w:rPr>
-          <w:i/>
-        </w:rPr>
-        <w:t>middleware</w:t>
-      </w:r>
-      <w:r>
-        <w:t>.</w:t>
-      </w:r>
-    </w:p>
-    <w:p>
-      <w:pPr>
-        <w:keepNext/>
-        <w:spacing w:before="0" w:after="0" w:lineRule="exact" w:line="360"/>
-        <w:ind w:firstLine="709"/>
-        <w:jc w:val="both"/>
-      </w:pPr>
-      <w:r>
-        <w:rPr>
-          <w:b/>
-        </w:rPr>
-        <w:t xml:space="preserve">21. Какие </w:t>
-      </w:r>
-      <w:r>
-        <w:rPr>
-          <w:b/>
-          <w:i/>
-        </w:rPr>
-        <w:t>middleware</w:t>
-      </w:r>
-      <w:r>
-        <w:rPr>
-          <w:b/>
-        </w:rPr>
-        <w:t xml:space="preserve"> предоставляет </w:t>
-      </w:r>
-      <w:r>
-        <w:rPr>
-          <w:b/>
-          <w:i/>
-        </w:rPr>
-        <w:t>Express</w:t>
-      </w:r>
-      <w:r>
-        <w:rPr>
-          <w:b/>
-        </w:rPr>
-        <w:t xml:space="preserve"> для обработки форм?</w:t>
-      </w:r>
-    </w:p>
-    <w:p>
-      <w:pPr/>
-      <w:r>
-        <w:rPr>
-          <w:i/>
-        </w:rPr>
-        <w:t>express.urlencoded({ extended: true })</w:t>
-      </w:r>
-      <w:r>
-        <w:t xml:space="preserve"> разбирает тела формата </w:t>
-      </w:r>
-      <w:r>
-        <w:rPr>
-          <w:i/>
-        </w:rPr>
-        <w:t>application/x-www-form-urlencoded</w:t>
-      </w:r>
-      <w:r>
-        <w:t xml:space="preserve"> и заполняет </w:t>
-      </w:r>
-      <w:r>
-        <w:rPr>
-          <w:i/>
-        </w:rPr>
-        <w:t>req.body</w:t>
-      </w:r>
-      <w:r>
-        <w:t xml:space="preserve">. Для </w:t>
-      </w:r>
-      <w:r>
-        <w:rPr>
-          <w:i/>
-        </w:rPr>
-        <w:t>JSON</w:t>
-      </w:r>
-      <w:r>
-        <w:t xml:space="preserve"> используется </w:t>
-      </w:r>
-      <w:r>
-        <w:rPr>
-          <w:i/>
-        </w:rPr>
-        <w:t>express.json()</w:t>
-      </w:r>
-      <w:r>
-        <w:t>. В проекте подключены оба.</w:t>
-      </w:r>
-    </w:p>
-    <w:p>
-      <w:pPr>
-        <w:keepNext/>
-        <w:spacing w:before="0" w:after="0" w:lineRule="exact" w:line="360"/>
-        <w:ind w:firstLine="709"/>
-        <w:jc w:val="both"/>
-      </w:pPr>
-      <w:r>
-        <w:rPr>
-          <w:b/>
-        </w:rPr>
-        <w:t xml:space="preserve">22. Как отключить стандартный </w:t>
-      </w:r>
-      <w:r>
-        <w:rPr>
-          <w:b/>
-          <w:i/>
-        </w:rPr>
-        <w:t>HTML</w:t>
-      </w:r>
-      <w:r>
-        <w:rPr>
-          <w:b/>
-        </w:rPr>
-        <w:t xml:space="preserve">-вывод ошибок и вернуть </w:t>
-      </w:r>
-      <w:r>
-        <w:rPr>
-          <w:b/>
-          <w:i/>
-        </w:rPr>
-        <w:t>JSON</w:t>
-      </w:r>
-      <w:r>
-        <w:rPr>
-          <w:b/>
-        </w:rPr>
-        <w:t>?</w:t>
-      </w:r>
-    </w:p>
-    <w:p>
-      <w:pPr/>
-      <w:r>
-        <w:t xml:space="preserve">Нужно определить собственный обработчик ошибок и ответить через </w:t>
-      </w:r>
-      <w:r>
-        <w:rPr>
-          <w:i/>
-        </w:rPr>
-        <w:t>res.status(500).json({ error: '...' })</w:t>
-      </w:r>
-      <w:r>
-        <w:t xml:space="preserve">. Тогда встроенный обработчик </w:t>
-      </w:r>
-      <w:r>
-        <w:rPr>
-          <w:i/>
-        </w:rPr>
-        <w:t>Express</w:t>
-      </w:r>
-      <w:r>
-        <w:t xml:space="preserve">, показывающий стек в </w:t>
-      </w:r>
-      <w:r>
-        <w:rPr>
-          <w:i/>
-        </w:rPr>
-        <w:t>HTML</w:t>
-      </w:r>
-      <w:r>
-        <w:t xml:space="preserve">, не вызывается. В проекте так отвечают маршруты </w:t>
-      </w:r>
-      <w:r>
-        <w:rPr>
-          <w:i/>
-        </w:rPr>
-        <w:t>/api/</w:t>
-      </w:r>
-      <w:r>
-        <w:t>.</w:t>
-      </w:r>
-    </w:p>
-    <w:p>
-      <w:pPr>
-        <w:keepNext/>
-        <w:spacing w:before="0" w:after="0" w:lineRule="exact" w:line="360"/>
-        <w:ind w:firstLine="709"/>
-        <w:jc w:val="both"/>
-      </w:pPr>
-      <w:r>
-        <w:rPr>
-          <w:b/>
-        </w:rPr>
-        <w:t xml:space="preserve">23. Как в </w:t>
-      </w:r>
-      <w:r>
-        <w:rPr>
-          <w:b/>
-          <w:i/>
-        </w:rPr>
-        <w:t>EJS</w:t>
-      </w:r>
-      <w:r>
-        <w:rPr>
-          <w:b/>
-        </w:rPr>
-        <w:t xml:space="preserve"> подключить внешний </w:t>
-      </w:r>
-      <w:r>
-        <w:rPr>
-          <w:b/>
-          <w:i/>
-        </w:rPr>
-        <w:t>CSS</w:t>
-      </w:r>
-      <w:r>
-        <w:rPr>
-          <w:b/>
-        </w:rPr>
-        <w:t xml:space="preserve"> и </w:t>
-      </w:r>
-      <w:r>
-        <w:rPr>
-          <w:b/>
-          <w:i/>
-        </w:rPr>
-        <w:t>JS</w:t>
-      </w:r>
-      <w:r>
-        <w:rPr>
-          <w:b/>
-        </w:rPr>
-        <w:t>?</w:t>
-      </w:r>
-    </w:p>
-    <w:p>
-      <w:pPr/>
-      <w:r>
-        <w:t xml:space="preserve">Папка со статикой подключается через </w:t>
-      </w:r>
-      <w:r>
-        <w:rPr>
-          <w:i/>
-        </w:rPr>
-        <w:t>app.use('/static', express.static('public'))</w:t>
-      </w:r>
-      <w:r>
-        <w:t xml:space="preserve">, а в шаблоне указывается абсолютный путь: </w:t>
-      </w:r>
-      <w:r>
-        <w:rPr>
-          <w:i/>
-        </w:rPr>
-        <w:t>&lt;link rel="stylesheet" href="/static/css/style.css"&gt;</w:t>
-      </w:r>
-      <w:r>
-        <w:t>. Относительные пути лучше не использовать, они ломаются на вложенных маршрутах.</w:t>
-      </w:r>
-    </w:p>
-    <w:p>
-      <w:pPr>
-        <w:keepNext/>
-        <w:spacing w:before="0" w:after="0" w:lineRule="exact" w:line="360"/>
-        <w:ind w:firstLine="709"/>
-        <w:jc w:val="both"/>
-      </w:pPr>
-      <w:r>
-        <w:rPr>
-          <w:b/>
-        </w:rPr>
-        <w:t xml:space="preserve">24. Как реализовать </w:t>
-      </w:r>
-      <w:r>
-        <w:rPr>
-          <w:b/>
-          <w:i/>
-        </w:rPr>
-        <w:t>middleware</w:t>
-      </w:r>
-      <w:r>
-        <w:rPr>
-          <w:b/>
-        </w:rPr>
-        <w:t>, измеряющее время выполнения запроса?</w:t>
-      </w:r>
-    </w:p>
-    <w:p>
-      <w:pPr/>
-      <w:r>
-        <w:t xml:space="preserve">Фиксируют время начала, а после события </w:t>
-      </w:r>
-      <w:r>
-        <w:rPr>
-          <w:i/>
-        </w:rPr>
-        <w:t>finish</w:t>
-      </w:r>
-      <w:r>
-        <w:t xml:space="preserve"> ответа вычисляют разницу: </w:t>
-      </w:r>
-      <w:r>
-        <w:rPr>
-          <w:i/>
-        </w:rPr>
-        <w:t>res.on('finish', () =&gt; console.log(Date.now() - start))</w:t>
-      </w:r>
-      <w:r>
-        <w:t xml:space="preserve">. В проекте это </w:t>
-      </w:r>
-      <w:r>
-        <w:rPr>
-          <w:i/>
-        </w:rPr>
-        <w:t>middlewares/logger.js</w:t>
-      </w:r>
-      <w:r>
-        <w:t xml:space="preserve">, где используется </w:t>
-      </w:r>
-      <w:r>
-        <w:rPr>
-          <w:i/>
-        </w:rPr>
-        <w:t>process.hrtime.bigint()</w:t>
-      </w:r>
-      <w:r>
-        <w:t xml:space="preserve"> для точности.</w:t>
-      </w:r>
-    </w:p>
-    <w:p>
-      <w:pPr>
-        <w:keepNext/>
-        <w:spacing w:before="0" w:after="0" w:lineRule="exact" w:line="360"/>
-        <w:ind w:firstLine="709"/>
-        <w:jc w:val="both"/>
-      </w:pPr>
-      <w:r>
-        <w:rPr>
-          <w:b/>
-        </w:rPr>
-        <w:t xml:space="preserve">25. Как реализовать защиту от </w:t>
-      </w:r>
-      <w:r>
-        <w:rPr>
-          <w:b/>
-          <w:i/>
-        </w:rPr>
-        <w:t>CSRF</w:t>
-      </w:r>
-      <w:r>
-        <w:rPr>
-          <w:b/>
-        </w:rPr>
-        <w:t xml:space="preserve"> с помощью </w:t>
-      </w:r>
-      <w:r>
-        <w:rPr>
-          <w:b/>
-          <w:i/>
-        </w:rPr>
-        <w:t>middleware</w:t>
-      </w:r>
-      <w:r>
-        <w:rPr>
-          <w:b/>
-        </w:rPr>
-        <w:t xml:space="preserve"> (теоретически)?</w:t>
-      </w:r>
-    </w:p>
-    <w:p>
-      <w:pPr/>
-      <w:r>
-        <w:t xml:space="preserve">Сервер выдает случайный токен, сохраняет его в сессии и вставляет скрытым полем в форму. </w:t>
-      </w:r>
-      <w:r>
-        <w:rPr>
-          <w:i/>
-        </w:rPr>
-        <w:t>Middleware</w:t>
-      </w:r>
-      <w:r>
-        <w:t xml:space="preserve"> сравнивает токен из тела запроса с сохраненным и отклоняет запрос при несовпадении. Дополнительно используют </w:t>
-      </w:r>
-      <w:r>
-        <w:rPr>
-          <w:i/>
-        </w:rPr>
-        <w:t>cookie</w:t>
-      </w:r>
-      <w:r>
-        <w:t xml:space="preserve"> с </w:t>
-      </w:r>
-      <w:r>
-        <w:rPr>
-          <w:i/>
-        </w:rPr>
-        <w:t>SameSite</w:t>
-      </w:r>
-      <w:r>
-        <w:t xml:space="preserve">. Готовое решение – пакет </w:t>
-      </w:r>
-      <w:r>
-        <w:rPr>
-          <w:i/>
-        </w:rPr>
-        <w:t>csurf</w:t>
-      </w:r>
-      <w:r>
-        <w:t xml:space="preserve"> или его аналоги.</w:t>
-      </w:r>
-    </w:p>
-    <w:p>
-      <w:pPr>
-        <w:keepNext/>
-        <w:spacing w:before="0" w:after="0" w:lineRule="exact" w:line="360"/>
-        <w:ind w:firstLine="709"/>
-        <w:jc w:val="both"/>
-      </w:pPr>
-      <w:r>
-        <w:rPr>
-          <w:b/>
-        </w:rPr>
-        <w:t xml:space="preserve">26. Как в </w:t>
-      </w:r>
-      <w:r>
-        <w:rPr>
-          <w:b/>
-          <w:i/>
-        </w:rPr>
-        <w:t>EJS</w:t>
-      </w:r>
-      <w:r>
-        <w:rPr>
-          <w:b/>
-        </w:rPr>
-        <w:t xml:space="preserve"> использовать функцию-</w:t>
-      </w:r>
-      <w:r>
-        <w:rPr>
-          <w:b/>
-          <w:i/>
-        </w:rPr>
-        <w:t>helper</w:t>
-      </w:r>
-      <w:r>
-        <w:rPr>
-          <w:b/>
-        </w:rPr>
-        <w:t>?</w:t>
-      </w:r>
-    </w:p>
-    <w:p>
-      <w:pPr/>
-      <w:r>
-        <w:t xml:space="preserve">Функцию кладут в </w:t>
-      </w:r>
-      <w:r>
-        <w:rPr>
-          <w:i/>
-        </w:rPr>
-        <w:t>app.locals</w:t>
-      </w:r>
-      <w:r>
-        <w:t xml:space="preserve">: </w:t>
-      </w:r>
-      <w:r>
-        <w:rPr>
-          <w:i/>
-        </w:rPr>
-        <w:t>app.locals.formatDate = (iso) =&gt; new Date(iso).toLocaleString('ru-RU')</w:t>
-      </w:r>
-      <w:r>
-        <w:t xml:space="preserve">. В шаблоне ее вызывают как обычную: </w:t>
-      </w:r>
-      <w:r>
-        <w:rPr>
-          <w:i/>
-        </w:rPr>
-        <w:t>&lt;%= formatDate(item.createdAt) %&gt;</w:t>
-      </w:r>
-      <w:r>
-        <w:t>. В проекте так сделано на главной и детальной страницах.</w:t>
-      </w:r>
-    </w:p>
-    <w:p>
-      <w:pPr>
-        <w:keepNext/>
-        <w:spacing w:before="0" w:after="0" w:lineRule="exact" w:line="360"/>
-        <w:ind w:firstLine="709"/>
-        <w:jc w:val="both"/>
-      </w:pPr>
-      <w:r>
-        <w:rPr>
-          <w:b/>
-        </w:rPr>
-        <w:t xml:space="preserve">27. Почему </w:t>
-      </w:r>
-      <w:r>
-        <w:rPr>
-          <w:b/>
-          <w:i/>
-        </w:rPr>
-        <w:t>middleware</w:t>
-      </w:r>
-      <w:r>
-        <w:rPr>
-          <w:b/>
-        </w:rPr>
-        <w:t xml:space="preserve"> для статики обычно подключается до всех маршрутов?</w:t>
-      </w:r>
-    </w:p>
-    <w:p>
-      <w:pPr/>
-      <w:r>
         <w:t>Запросы к стилям, скриптам и картинкам должны обслуживаться сразу, не проходя через авторизацию, парсеры и логику маршрутов. Это ускоряет ответ и исключает случайный перехват файлов обработчиком 404.</w:t>
-      </w:r>
-    </w:p>
-    <w:p>
-      <w:pPr>
-        <w:keepNext/>
-        <w:spacing w:before="0" w:after="0" w:lineRule="exact" w:line="360"/>
-        <w:ind w:firstLine="709"/>
-        <w:jc w:val="both"/>
-      </w:pPr>
-      <w:r>
-        <w:rPr>
-          <w:b/>
-        </w:rPr>
-        <w:t xml:space="preserve">28. Как заблокировать запросы с определенного </w:t>
-      </w:r>
-      <w:r>
-        <w:rPr>
-          <w:b/>
-          <w:i/>
-        </w:rPr>
-        <w:t>IP</w:t>
-      </w:r>
-      <w:r>
-        <w:rPr>
-          <w:b/>
-        </w:rPr>
-        <w:t>-адреса?</w:t>
-      </w:r>
-    </w:p>
-    <w:p>
-      <w:pPr/>
-      <w:r>
-        <w:rPr>
-          <w:i/>
-        </w:rPr>
-        <w:t>Middleware</w:t>
-      </w:r>
-      <w:r>
-        <w:t xml:space="preserve"> проверяет </w:t>
-      </w:r>
-      <w:r>
-        <w:rPr>
-          <w:i/>
-        </w:rPr>
-        <w:t>req.ip</w:t>
-      </w:r>
-      <w:r>
-        <w:t xml:space="preserve"> по списку запрещенных адресов и отвечает </w:t>
-      </w:r>
-      <w:r>
-        <w:rPr>
-          <w:i/>
-        </w:rPr>
-        <w:t>res.status(403).send('Forbidden')</w:t>
-      </w:r>
-      <w:r>
-        <w:t xml:space="preserve">, иначе вызывает </w:t>
-      </w:r>
-      <w:r>
-        <w:rPr>
-          <w:i/>
-        </w:rPr>
-        <w:t>next()</w:t>
-      </w:r>
-      <w:r>
-        <w:t xml:space="preserve">. За прокси необходимо включить </w:t>
-      </w:r>
-      <w:r>
-        <w:rPr>
-          <w:i/>
-        </w:rPr>
-        <w:t>app.set('trust proxy', true)</w:t>
-      </w:r>
-      <w:r>
-        <w:t xml:space="preserve">, чтобы </w:t>
-      </w:r>
-      <w:r>
-        <w:rPr>
-          <w:i/>
-        </w:rPr>
-        <w:t>req.ip</w:t>
-      </w:r>
-      <w:r>
-        <w:t xml:space="preserve"> содержал адрес клиента.</w:t>
-      </w:r>
-    </w:p>
-    <w:p>
-      <w:pPr>
-        <w:keepNext/>
-        <w:spacing w:before="0" w:after="0" w:lineRule="exact" w:line="360"/>
-        <w:ind w:firstLine="709"/>
-        <w:jc w:val="both"/>
-      </w:pPr>
-      <w:r>
-        <w:rPr>
-          <w:b/>
-        </w:rPr>
-        <w:t xml:space="preserve">29. Как в </w:t>
-      </w:r>
-      <w:r>
-        <w:rPr>
-          <w:b/>
-          <w:i/>
-        </w:rPr>
-        <w:t>EJS</w:t>
-      </w:r>
-      <w:r>
-        <w:rPr>
-          <w:b/>
-        </w:rPr>
-        <w:t xml:space="preserve"> отрендерить переменную без </w:t>
-      </w:r>
-      <w:r>
-        <w:rPr>
-          <w:b/>
-          <w:i/>
-        </w:rPr>
-        <w:t>HTML</w:t>
-      </w:r>
-      <w:r>
-        <w:rPr>
-          <w:b/>
-        </w:rPr>
-        <w:t>-экранирования?</w:t>
-      </w:r>
-    </w:p>
-    <w:p>
-      <w:pPr/>
-      <w:r>
-        <w:t xml:space="preserve">Используется тег </w:t>
-      </w:r>
-      <w:r>
-        <w:rPr>
-          <w:i/>
-        </w:rPr>
-        <w:t>&lt;%- value %&gt;</w:t>
-      </w:r>
-      <w:r>
-        <w:t xml:space="preserve"> вместо </w:t>
-      </w:r>
-      <w:r>
-        <w:rPr>
-          <w:i/>
-        </w:rPr>
-        <w:t>&lt;%= value %&gt;</w:t>
-      </w:r>
-      <w:r>
-        <w:t xml:space="preserve">. Это опасно, так как введенный пользователем </w:t>
-      </w:r>
-      <w:r>
-        <w:rPr>
-          <w:i/>
-        </w:rPr>
-        <w:t>HTML</w:t>
-      </w:r>
-      <w:r>
-        <w:t xml:space="preserve"> будет исполнен, что приводит к </w:t>
-      </w:r>
-      <w:r>
-        <w:rPr>
-          <w:i/>
-        </w:rPr>
-        <w:t>XSS</w:t>
-      </w:r>
-      <w:r>
-        <w:t xml:space="preserve">. Тег </w:t>
-      </w:r>
-      <w:r>
-        <w:rPr>
-          <w:i/>
-        </w:rPr>
-        <w:t>&lt;%-</w:t>
-      </w:r>
-      <w:r>
-        <w:t xml:space="preserve"> допустим только для доверенной разметки, например для </w:t>
-      </w:r>
-      <w:r>
-        <w:rPr>
-          <w:i/>
-        </w:rPr>
-        <w:t>include</w:t>
-      </w:r>
-      <w:r>
-        <w:t>.</w:t>
-      </w:r>
-    </w:p>
-    <w:p>
-      <w:pPr>
-        <w:keepNext/>
-        <w:spacing w:before="0" w:after="0" w:lineRule="exact" w:line="360"/>
-        <w:ind w:firstLine="709"/>
-        <w:jc w:val="both"/>
-      </w:pPr>
-      <w:r>
-        <w:rPr>
-          <w:b/>
-        </w:rPr>
-        <w:t xml:space="preserve">30. Как организовать </w:t>
-      </w:r>
-      <w:r>
-        <w:rPr>
-          <w:b/>
-          <w:i/>
-        </w:rPr>
-        <w:t>error-handling</w:t>
-      </w:r>
-      <w:r>
-        <w:rPr>
-          <w:b/>
-        </w:rPr>
-        <w:t xml:space="preserve"> </w:t>
-      </w:r>
-      <w:r>
-        <w:rPr>
-          <w:b/>
-          <w:i/>
-        </w:rPr>
-        <w:t>middleware</w:t>
-      </w:r>
-      <w:r>
-        <w:rPr>
-          <w:b/>
-        </w:rPr>
-        <w:t>, которая ловит все ошибки приложения?</w:t>
-      </w:r>
-    </w:p>
-    <w:p>
-      <w:pPr/>
-      <w:r>
-        <w:t xml:space="preserve">Обработчик с четырьмя параметрами регистрируют последним, после всех маршрутов и обработчика 404. Ошибки из синхронного кода попадают в него автоматически, из асинхронного – через </w:t>
-      </w:r>
-      <w:r>
-        <w:rPr>
-          <w:i/>
-        </w:rPr>
-        <w:t>next(err)</w:t>
-      </w:r>
-      <w:r>
-        <w:t xml:space="preserve">. Внутри логируют ошибку и отправляют страницу </w:t>
-      </w:r>
-      <w:r>
-        <w:rPr>
-          <w:i/>
-        </w:rPr>
-        <w:t>500.ejs</w:t>
-      </w:r>
-      <w:r>
-        <w:t xml:space="preserve"> или </w:t>
-      </w:r>
-      <w:r>
-        <w:rPr>
-          <w:i/>
-        </w:rPr>
-        <w:t>JSON</w:t>
-      </w:r>
-      <w:r>
-        <w:t>.</w:t>
       </w:r>
     </w:p>
     <w:p>
@@ -10428,7 +8429,7 @@
     <w:pPr>
       <w:keepNext/>
       <w:keepLines/>
-      <w:spacing w:before="0" w:after="0" w:lineRule="exact" w:line="360"/>
+      <w:spacing w:before="360" w:after="360" w:lineRule="exact" w:line="360"/>
       <w:ind w:firstLine="0"/>
       <w:jc w:val="center"/>
       <w:outlineLvl w:val="0"/>
@@ -10454,7 +8455,7 @@
     <w:pPr>
       <w:keepNext/>
       <w:keepLines/>
-      <w:spacing w:before="0" w:after="0" w:lineRule="exact" w:line="360"/>
+      <w:spacing w:before="360" w:after="360" w:lineRule="exact" w:line="360"/>
       <w:ind w:firstLine="709"/>
       <w:jc w:val="left"/>
       <w:outlineLvl w:val="1"/>

</xml_diff>

<commit_message>
docs: report audit fixes (intro text between headings, no empty paragraphs, listing 3 referenced); refresh LaTeX and Overleaf archive
Co-Authored-By: Claude Sonnet 5.5 <noreply@anthropic.com>
</commit_message>
<xml_diff>
--- a/docs/Отчет_ПЗ1.docx
+++ b/docs/Отчет_ПЗ1.docx
@@ -46,10 +46,45 @@
     </w:p>
     <w:p>
       <w:pPr>
+        <w:spacing w:before="360" w:after="0" w:lineRule="exact" w:line="360"/>
+        <w:ind w:firstLine="0"/>
+        <w:jc w:val="center"/>
+      </w:pPr>
+      <w:r>
+        <w:rPr>
+          <w:b w:val="0"/>
+          <w:sz w:val="28"/>
+        </w:rPr>
+        <w:t>Факультет [УТОЧНИТЬ]</w:t>
+      </w:r>
+    </w:p>
+    <w:p>
+      <w:pPr>
         <w:spacing w:before="0" w:after="0" w:lineRule="exact" w:line="360"/>
         <w:ind w:firstLine="0"/>
         <w:jc w:val="center"/>
       </w:pPr>
+      <w:r>
+        <w:rPr>
+          <w:b w:val="0"/>
+          <w:sz w:val="28"/>
+        </w:rPr>
+        <w:t>Кафедра [УТОЧНИТЬ]</w:t>
+      </w:r>
+    </w:p>
+    <w:p>
+      <w:pPr>
+        <w:spacing w:before="1440" w:after="0" w:lineRule="exact" w:line="360"/>
+        <w:ind w:firstLine="0"/>
+        <w:jc w:val="center"/>
+      </w:pPr>
+      <w:r>
+        <w:rPr>
+          <w:b/>
+          <w:sz w:val="32"/>
+        </w:rPr>
+        <w:t>ОТЧЕТ</w:t>
+      </w:r>
     </w:p>
     <w:p>
       <w:pPr>
@@ -62,7 +97,7 @@
           <w:b w:val="0"/>
           <w:sz w:val="28"/>
         </w:rPr>
-        <w:t>Факультет [УТОЧНИТЬ]</w:t>
+        <w:t>по практическому занятию №1</w:t>
       </w:r>
     </w:p>
     <w:p>
@@ -76,7 +111,22 @@
           <w:b w:val="0"/>
           <w:sz w:val="28"/>
         </w:rPr>
-        <w:t>Кафедра [УТОЧНИТЬ]</w:t>
+        <w:t>«</w:t>
+      </w:r>
+      <w:r>
+        <w:rPr>
+          <w:b w:val="0"/>
+          <w:i/>
+          <w:sz w:val="28"/>
+        </w:rPr>
+        <w:t>Middleware</w:t>
+      </w:r>
+      <w:r>
+        <w:rPr>
+          <w:b w:val="0"/>
+          <w:sz w:val="28"/>
+        </w:rPr>
+        <w:t xml:space="preserve"> и шаблонизаторы»</w:t>
       </w:r>
     </w:p>
     <w:p>
@@ -85,133 +135,23 @@
         <w:ind w:firstLine="0"/>
         <w:jc w:val="center"/>
       </w:pPr>
+      <w:r>
+        <w:rPr>
+          <w:b w:val="0"/>
+          <w:sz w:val="28"/>
+        </w:rPr>
+        <w:t>по дисциплине «ИТиВП» [УТОЧНИТЬ полное название]</w:t>
+      </w:r>
     </w:p>
     <w:p>
       <w:pPr>
-        <w:spacing w:before="0" w:after="0" w:lineRule="exact" w:line="360"/>
-        <w:ind w:firstLine="0"/>
-        <w:jc w:val="center"/>
-      </w:pPr>
-    </w:p>
-    <w:p>
-      <w:pPr>
-        <w:spacing w:before="0" w:after="0" w:lineRule="exact" w:line="360"/>
-        <w:ind w:firstLine="0"/>
-        <w:jc w:val="center"/>
-      </w:pPr>
-    </w:p>
-    <w:p>
-      <w:pPr>
-        <w:spacing w:before="0" w:after="0" w:lineRule="exact" w:line="360"/>
-        <w:ind w:firstLine="0"/>
-        <w:jc w:val="center"/>
-      </w:pPr>
-    </w:p>
-    <w:p>
-      <w:pPr>
-        <w:spacing w:before="0" w:after="0" w:lineRule="exact" w:line="360"/>
-        <w:ind w:firstLine="0"/>
-        <w:jc w:val="center"/>
-      </w:pPr>
-      <w:r>
-        <w:rPr>
-          <w:b/>
-          <w:sz w:val="32"/>
-        </w:rPr>
-        <w:t>ОТЧЕТ</w:t>
-      </w:r>
-    </w:p>
-    <w:p>
-      <w:pPr>
-        <w:spacing w:before="0" w:after="0" w:lineRule="exact" w:line="360"/>
-        <w:ind w:firstLine="0"/>
-        <w:jc w:val="center"/>
-      </w:pPr>
-      <w:r>
-        <w:rPr>
-          <w:b w:val="0"/>
-          <w:sz w:val="28"/>
-        </w:rPr>
-        <w:t>по практическому занятию №1</w:t>
-      </w:r>
-    </w:p>
-    <w:p>
-      <w:pPr>
-        <w:spacing w:before="0" w:after="0" w:lineRule="exact" w:line="360"/>
-        <w:ind w:firstLine="0"/>
-        <w:jc w:val="center"/>
-      </w:pPr>
-      <w:r>
-        <w:rPr>
-          <w:b w:val="0"/>
-          <w:sz w:val="28"/>
-        </w:rPr>
-        <w:t>«</w:t>
-      </w:r>
-      <w:r>
-        <w:rPr>
-          <w:b w:val="0"/>
-          <w:i/>
-          <w:sz w:val="28"/>
-        </w:rPr>
-        <w:t>Middleware</w:t>
-      </w:r>
-      <w:r>
-        <w:rPr>
-          <w:b w:val="0"/>
-          <w:sz w:val="28"/>
-        </w:rPr>
-        <w:t xml:space="preserve"> и шаблонизаторы»</w:t>
-      </w:r>
-    </w:p>
-    <w:p>
-      <w:pPr>
-        <w:spacing w:before="0" w:after="0" w:lineRule="exact" w:line="360"/>
-        <w:ind w:firstLine="0"/>
-        <w:jc w:val="center"/>
-      </w:pPr>
-      <w:r>
-        <w:rPr>
-          <w:b w:val="0"/>
-          <w:sz w:val="28"/>
-        </w:rPr>
-        <w:t>по дисциплине «ИТиВП» [УТОЧНИТЬ полное название]</w:t>
-      </w:r>
-    </w:p>
-    <w:p>
-      <w:pPr>
-        <w:spacing w:before="0" w:after="0" w:lineRule="exact" w:line="360"/>
-        <w:ind w:firstLine="0"/>
-        <w:jc w:val="center"/>
-      </w:pPr>
-    </w:p>
-    <w:p>
-      <w:pPr>
-        <w:spacing w:before="0" w:after="0" w:lineRule="exact" w:line="360"/>
-        <w:ind w:firstLine="0"/>
-        <w:jc w:val="center"/>
-      </w:pPr>
-    </w:p>
-    <w:p>
-      <w:pPr>
-        <w:spacing w:before="0" w:after="0" w:lineRule="exact" w:line="360"/>
-        <w:ind w:firstLine="0"/>
-        <w:jc w:val="center"/>
-      </w:pPr>
-    </w:p>
-    <w:p>
-      <w:pPr>
-        <w:spacing w:before="0" w:after="0" w:lineRule="exact" w:line="360"/>
-        <w:ind w:firstLine="0"/>
-        <w:jc w:val="center"/>
-      </w:pPr>
-    </w:p>
-    <w:p>
-      <w:pPr>
-        <w:spacing w:before="0" w:after="0" w:lineRule="exact" w:line="360"/>
-        <w:ind w:firstLine="0"/>
-        <w:jc w:val="center"/>
-      </w:pPr>
+        <w:spacing w:before="1800" w:after="0" w:lineRule="exact" w:line="360"/>
+        <w:ind w:firstLine="0" w:left="4535"/>
+        <w:jc w:val="left"/>
+      </w:pPr>
+      <w:r>
+        <w:t>Выполнил: студент гр. [УТОЧНИТЬ] [УТОЧНИТЬ ФИО]</w:t>
+      </w:r>
     </w:p>
     <w:p>
       <w:pPr>
@@ -220,76 +160,27 @@
         <w:jc w:val="left"/>
       </w:pPr>
       <w:r>
-        <w:t>Выполнил: студент гр. [УТОЧНИТЬ] [УТОЧНИТЬ ФИО]</w:t>
+        <w:t>Проверил: [УТОЧНИТЬ ФИО преподавателя]</w:t>
       </w:r>
     </w:p>
     <w:p>
       <w:pPr>
-        <w:spacing w:before="0" w:after="0" w:lineRule="exact" w:line="360"/>
-        <w:ind w:firstLine="0" w:left="4535"/>
-        <w:jc w:val="left"/>
-      </w:pPr>
-      <w:r>
-        <w:t>Проверил: [УТОЧНИТЬ ФИО преподавателя]</w:t>
+        <w:spacing w:before="1800" w:after="0" w:lineRule="exact" w:line="360"/>
+        <w:ind w:firstLine="0"/>
+        <w:jc w:val="center"/>
+      </w:pPr>
+      <w:r>
+        <w:rPr>
+          <w:b w:val="0"/>
+          <w:sz w:val="28"/>
+        </w:rPr>
+        <w:t>Минск 2026</w:t>
       </w:r>
     </w:p>
     <w:p>
       <w:pPr>
-        <w:spacing w:before="0" w:after="0" w:lineRule="exact" w:line="360"/>
-        <w:ind w:firstLine="0"/>
-        <w:jc w:val="center"/>
-      </w:pPr>
-    </w:p>
-    <w:p>
-      <w:pPr>
-        <w:spacing w:before="0" w:after="0" w:lineRule="exact" w:line="360"/>
-        <w:ind w:firstLine="0"/>
-        <w:jc w:val="center"/>
-      </w:pPr>
-    </w:p>
-    <w:p>
-      <w:pPr>
-        <w:spacing w:before="0" w:after="0" w:lineRule="exact" w:line="360"/>
-        <w:ind w:firstLine="0"/>
-        <w:jc w:val="center"/>
-      </w:pPr>
-    </w:p>
-    <w:p>
-      <w:pPr>
-        <w:spacing w:before="0" w:after="0" w:lineRule="exact" w:line="360"/>
-        <w:ind w:firstLine="0"/>
-        <w:jc w:val="center"/>
-      </w:pPr>
-    </w:p>
-    <w:p>
-      <w:pPr>
-        <w:spacing w:before="0" w:after="0" w:lineRule="exact" w:line="360"/>
-        <w:ind w:firstLine="0"/>
-        <w:jc w:val="center"/>
-      </w:pPr>
-    </w:p>
-    <w:p>
-      <w:pPr>
-        <w:spacing w:before="0" w:after="0" w:lineRule="exact" w:line="360"/>
-        <w:ind w:firstLine="0"/>
-        <w:jc w:val="center"/>
-      </w:pPr>
-      <w:r>
-        <w:rPr>
-          <w:b w:val="0"/>
-          <w:sz w:val="28"/>
-        </w:rPr>
-        <w:t>Минск 2026</w:t>
-      </w:r>
-    </w:p>
-    <w:p>
-      <w:r>
-        <w:br w:type="page"/>
-      </w:r>
-    </w:p>
-    <w:p>
-      <w:pPr>
         <w:pStyle w:val="Heading1"/>
+        <w:pageBreakBefore/>
       </w:pPr>
       <w:r>
         <w:t>1 Цель работы</w:t>
@@ -505,6 +396,21 @@
       </w:pPr>
       <w:r>
         <w:t>3 Ход работы</w:t>
+      </w:r>
+    </w:p>
+    <w:p>
+      <w:pPr/>
+      <w:r>
+        <w:t xml:space="preserve">Работа выполнена поэтапно: сначала настроены проект и шаблонизатор, затем созданы шаблоны страниц, реализованы </w:t>
+      </w:r>
+      <w:r>
+        <w:rPr>
+          <w:i/>
+        </w:rPr>
+        <w:t>middleware</w:t>
+      </w:r>
+      <w:r>
+        <w:t>, маршруты и обработка ошибок, после чего результат проверен в браузере и автоматическими тестами. Каждый этап описан в отдельном подразделе.</w:t>
       </w:r>
     </w:p>
     <w:p>
@@ -1411,7 +1317,7 @@
         <w:t>HTML</w:t>
       </w:r>
       <w:r>
-        <w:t>.</w:t>
+        <w:t>. Шапка сайта, подключаемая во все страницы, приведена в листинге 3.</w:t>
       </w:r>
     </w:p>
     <w:p>

</xml_diff>